<commit_message>
Agregado el guardado de gráficos
Se agregó la funcionalidad que almacena los gráficos en una carpeta en vez de mostrarlos por pantalla
</commit_message>
<xml_diff>
--- a/Entregable.docx
+++ b/Entregable.docx
@@ -438,6 +438,7 @@
         </w:rPr>
         <w:t>“</w:t>
       </w:r>
+      <w:bookmarkStart w:id="2" w:name="_GoBack"/>
       <w:r>
         <w:rPr>
           <w:b/>
@@ -469,34 +470,11 @@
         <w:rPr>
           <w:b/>
         </w:rPr>
-        <w:t>. Graficar ambas en el dominio del tiempo y</w:t>
-      </w:r>
-      <w:r>
-        <w:rPr>
-          <w:b/>
-        </w:rPr>
-        <w:t xml:space="preserve"> explicar mediante la observació</w:t>
-      </w:r>
-      <w:r>
-        <w:rPr>
-          <w:b/>
-        </w:rPr>
-        <w:t>n</w:t>
-      </w:r>
-      <w:r>
-        <w:rPr>
-          <w:b/>
-        </w:rPr>
-        <w:t xml:space="preserve"> de la relació</w:t>
-      </w:r>
-      <w:r>
-        <w:rPr>
-          <w:b/>
-        </w:rPr>
-        <w:t>n se</w:t>
-      </w:r>
-      <w:r>
-        <w:rPr>
+        <w:t>. Graficar ambas en el dominio del tiempo y explicar mediante la observación de la relación señal-ruido (SNR). ¿Se debe aplicar un filtro digital por convolución antes de proceder al análisis de frecuencia? En caso afirmativo, aplicar el filtro y determinar de qué tipo es y cuáles son las frecuencias de corte. ¿Cuál es la frecuencia de muestreo de las se</w:t>
+      </w:r>
+      <w:r>
+        <w:rPr>
+          <w:rFonts w:hint="eastAsia"/>
           <w:b/>
         </w:rPr>
         <w:t>ñ</w:t>
@@ -505,81 +483,9 @@
         <w:rPr>
           <w:b/>
         </w:rPr>
-        <w:t xml:space="preserve">al-ruido (SNR). </w:t>
-      </w:r>
-      <w:r>
-        <w:rPr>
-          <w:b/>
-        </w:rPr>
-        <w:t>¿</w:t>
-      </w:r>
-      <w:r>
-        <w:rPr>
-          <w:b/>
-        </w:rPr>
-        <w:t xml:space="preserve">Se debe aplicar </w:t>
-      </w:r>
-      <w:r>
-        <w:rPr>
-          <w:b/>
-        </w:rPr>
-        <w:t>un filtro digital por convolución antes de proceder al aná</w:t>
-      </w:r>
-      <w:r>
-        <w:rPr>
-          <w:b/>
-        </w:rPr>
-        <w:t xml:space="preserve">lisis de frecuencia? En caso afirmativo, aplicar el filtro y determinar de </w:t>
-      </w:r>
-      <w:r>
-        <w:rPr>
-          <w:b/>
-        </w:rPr>
-        <w:t>qué</w:t>
-      </w:r>
-      <w:r>
-        <w:rPr>
-          <w:b/>
-        </w:rPr>
-        <w:t xml:space="preserve"> tipo es y </w:t>
-      </w:r>
-      <w:r>
-        <w:rPr>
-          <w:b/>
-        </w:rPr>
-        <w:t xml:space="preserve">cuáles son las </w:t>
-      </w:r>
-      <w:r>
-        <w:rPr>
-          <w:b/>
-        </w:rPr>
-        <w:t xml:space="preserve">frecuencias de corte. </w:t>
-      </w:r>
-      <w:r>
-        <w:rPr>
-          <w:b/>
-        </w:rPr>
-        <w:t>¿Cuál</w:t>
-      </w:r>
-      <w:r>
-        <w:rPr>
-          <w:b/>
-        </w:rPr>
-        <w:t xml:space="preserve"> es la frecuencia de muestreo de las se</w:t>
-      </w:r>
-      <w:r>
-        <w:rPr>
-          <w:rFonts w:hint="eastAsia"/>
-          <w:b/>
-        </w:rPr>
-        <w:t>ñ</w:t>
-      </w:r>
-      <w:r>
-        <w:rPr>
-          <w:b/>
-        </w:rPr>
         <w:t>ales?</w:t>
       </w:r>
+      <w:bookmarkEnd w:id="2"/>
       <w:r>
         <w:rPr>
           <w:b/>
@@ -637,7 +543,7 @@
             <v:path o:extrusionok="f" gradientshapeok="t" o:connecttype="rect"/>
             <o:lock v:ext="edit" aspectratio="t"/>
           </v:shapetype>
-          <v:shape id="_x0000_i1025" type="#_x0000_t75" style="width:436.6pt;height:225.2pt">
+          <v:shape id="_x0000_i1025" type="#_x0000_t75" style="width:437pt;height:225.4pt">
             <v:imagedata r:id="rId8" o:title="Señal_1_ruidosa" croptop="4745f" cropbottom="3269f" cropleft="4145f" cropright="4888f"/>
           </v:shape>
         </w:pict>
@@ -651,14 +557,27 @@
       <w:r>
         <w:t xml:space="preserve">Tabla </w:t>
       </w:r>
-      <w:fldSimple w:instr=" SEQ Tabla \* ARABIC ">
-        <w:r>
-          <w:rPr>
-            <w:noProof/>
-          </w:rPr>
-          <w:t>1</w:t>
-        </w:r>
-      </w:fldSimple>
+      <w:r>
+        <w:fldChar w:fldCharType="begin"/>
+      </w:r>
+      <w:r>
+        <w:instrText xml:space="preserve"> SEQ Tabla \* ARABIC </w:instrText>
+      </w:r>
+      <w:r>
+        <w:fldChar w:fldCharType="separate"/>
+      </w:r>
+      <w:r>
+        <w:rPr>
+          <w:noProof/>
+        </w:rPr>
+        <w:t>1</w:t>
+      </w:r>
+      <w:r>
+        <w:rPr>
+          <w:noProof/>
+        </w:rPr>
+        <w:fldChar w:fldCharType="end"/>
+      </w:r>
       <w:r>
         <w:t xml:space="preserve"> sirena 1 sin ningún filtro</w:t>
       </w:r>
@@ -671,7 +590,7 @@
       <w:r>
         <w:lastRenderedPageBreak/>
         <w:pict w14:anchorId="29715E25">
-          <v:shape id="_x0000_i1032" type="#_x0000_t75" style="width:432.6pt;height:228.1pt">
+          <v:shape id="_x0000_i1026" type="#_x0000_t75" style="width:432.65pt;height:227.9pt">
             <v:imagedata r:id="rId9" o:title="Señal_2_ruidosa" croptop="4730f" cropbottom="2783f" cropleft="4556f" cropright="5226f"/>
           </v:shape>
         </w:pict>
@@ -685,14 +604,27 @@
       <w:r>
         <w:t xml:space="preserve">Tabla </w:t>
       </w:r>
-      <w:fldSimple w:instr=" SEQ Tabla \* ARABIC ">
-        <w:r>
-          <w:rPr>
-            <w:noProof/>
-          </w:rPr>
-          <w:t>2</w:t>
-        </w:r>
-      </w:fldSimple>
+      <w:r>
+        <w:fldChar w:fldCharType="begin"/>
+      </w:r>
+      <w:r>
+        <w:instrText xml:space="preserve"> SEQ Tabla \* ARABIC </w:instrText>
+      </w:r>
+      <w:r>
+        <w:fldChar w:fldCharType="separate"/>
+      </w:r>
+      <w:r>
+        <w:rPr>
+          <w:noProof/>
+        </w:rPr>
+        <w:t>2</w:t>
+      </w:r>
+      <w:r>
+        <w:rPr>
+          <w:noProof/>
+        </w:rPr>
+        <w:fldChar w:fldCharType="end"/>
+      </w:r>
       <w:r>
         <w:t xml:space="preserve"> sirena 2 sin ningún filtro</w:t>
       </w:r>
@@ -700,15 +632,42 @@
     <w:p>
       <w:pPr>
         <w:jc w:val="left"/>
-        <w:rPr>
-          <w:u w:val="single"/>
-        </w:rPr>
       </w:pPr>
       <w:r>
         <w:br/>
       </w:r>
-      <w:bookmarkStart w:id="2" w:name="_GoBack"/>
-      <w:bookmarkEnd w:id="2"/>
+      <w:r>
+        <w:t>Además, nos dio la siguiente información sobre ambos archivos de audio “</w:t>
+      </w:r>
+      <w:proofErr w:type="spellStart"/>
+      <w:r>
+        <w:t>fs</w:t>
+      </w:r>
+      <w:proofErr w:type="spellEnd"/>
+      <w:r>
+        <w:t>=44100 Hz, duración=8.00 s, muestras=352801</w:t>
+      </w:r>
+      <w:r>
+        <w:t>”</w:t>
+      </w:r>
+      <w:r>
+        <w:t xml:space="preserve">, de esta información, ya sabemos que la frecuencia de muestreo es de 44100 </w:t>
+      </w:r>
+      <w:r>
+        <w:tab/>
+        <w:t>Hz</w:t>
+      </w:r>
+      <w:r>
+        <w:t>.</w:t>
+      </w:r>
+    </w:p>
+    <w:p>
+      <w:pPr>
+        <w:jc w:val="left"/>
+      </w:pPr>
+      <w:r>
+        <w:t>Podemos ver que las señales analizadas son extremadamente ruidosas</w:t>
+      </w:r>
     </w:p>
     <w:sectPr>
       <w:footerReference w:type="default" r:id="rId10"/>
@@ -814,7 +773,7 @@
         <w:szCs w:val="24"/>
         <w:lang w:val="es-MX"/>
       </w:rPr>
-      <w:t>4</w:t>
+      <w:t>3</w:t>
     </w:r>
     <w:r>
       <w:rPr>
@@ -1791,7 +1750,7 @@
 </file>
 
 <file path=customXml/itemProps1.xml><?xml version="1.0" encoding="utf-8"?>
-<ds:datastoreItem xmlns:ds="http://schemas.openxmlformats.org/officeDocument/2006/customXml" ds:itemID="{6C9DF81C-24C1-4C6B-8AA5-94CF8B6BF636}">
+<ds:datastoreItem xmlns:ds="http://schemas.openxmlformats.org/officeDocument/2006/customXml" ds:itemID="{3433EAFD-B2DB-401C-8BA9-B57731228BD7}">
   <ds:schemaRefs>
     <ds:schemaRef ds:uri="http://schemas.openxmlformats.org/officeDocument/2006/bibliography"/>
   </ds:schemaRefs>

</xml_diff>

<commit_message>
Rename SNR module and normalize text
Rename src/analisis_snr_v2.py to src/analisis_snr.py and update main.py import. Normalize Spanish wording (remove accents and standardize comments/prints) across main.py, src/analisis_snr.py, src/cargar_sirenas.py and src/graficador.py. Adjust graficador behavior: change default titles, use subplots_adjust instead of tight_layout, tweak metric text formatting and save log messages. Suppress a verbose load print in cargar_sirenas. Updated binary outputs: Entregable.docx and graficos-creados/Comparacion_Sirena1_vs_Sirena2.png.
</commit_message>
<xml_diff>
--- a/Entregable.docx
+++ b/Entregable.docx
@@ -436,14 +436,7 @@
         <w:rPr>
           <w:b/>
         </w:rPr>
-        <w:t>“</w:t>
-      </w:r>
-      <w:bookmarkStart w:id="2" w:name="_GoBack"/>
-      <w:r>
-        <w:rPr>
-          <w:b/>
-        </w:rPr>
-        <w:t>Cargar las se</w:t>
+        <w:t>“Cargar las se</w:t>
       </w:r>
       <w:r>
         <w:rPr>
@@ -483,14 +476,7 @@
         <w:rPr>
           <w:b/>
         </w:rPr>
-        <w:t>ales?</w:t>
-      </w:r>
-      <w:bookmarkEnd w:id="2"/>
-      <w:r>
-        <w:rPr>
-          <w:b/>
-        </w:rPr>
-        <w:t>”</w:t>
+        <w:t>ales?”</w:t>
       </w:r>
     </w:p>
     <w:p>
@@ -543,7 +529,7 @@
             <v:path o:extrusionok="f" gradientshapeok="t" o:connecttype="rect"/>
             <o:lock v:ext="edit" aspectratio="t"/>
           </v:shapetype>
-          <v:shape id="_x0000_i1025" type="#_x0000_t75" style="width:437pt;height:225.4pt">
+          <v:shape id="_x0000_i1025" type="#_x0000_t75" style="width:436.7pt;height:225.35pt">
             <v:imagedata r:id="rId8" o:title="Señal_1_ruidosa" croptop="4745f" cropbottom="3269f" cropleft="4145f" cropright="4888f"/>
           </v:shape>
         </w:pict>
@@ -590,7 +576,7 @@
       <w:r>
         <w:lastRenderedPageBreak/>
         <w:pict w14:anchorId="29715E25">
-          <v:shape id="_x0000_i1026" type="#_x0000_t75" style="width:432.65pt;height:227.9pt">
+          <v:shape id="_x0000_i1026" type="#_x0000_t75" style="width:432.45pt;height:228.15pt">
             <v:imagedata r:id="rId9" o:title="Señal_2_ruidosa" croptop="4730f" cropbottom="2783f" cropleft="4556f" cropright="5226f"/>
           </v:shape>
         </w:pict>
@@ -667,6 +653,45 @@
       </w:pPr>
       <w:r>
         <w:t>Podemos ver que las señales analizadas son extremadamente ruidosas</w:t>
+      </w:r>
+      <w:bookmarkStart w:id="2" w:name="_GoBack"/>
+      <w:bookmarkEnd w:id="2"/>
+      <w:r>
+        <w:t>, lo que significa que tiene una relación señal ruido (SNR) demasiado baja, por lo que decidimos que es necesario aplicarle un filtro</w:t>
+      </w:r>
+      <w:r>
+        <w:t xml:space="preserve"> digital por </w:t>
+      </w:r>
+      <w:proofErr w:type="spellStart"/>
+      <w:r>
+        <w:t>convol</w:t>
+      </w:r>
+      <w:r>
+        <w:t>ución</w:t>
+      </w:r>
+      <w:proofErr w:type="spellEnd"/>
+      <w:r>
+        <w:t>.</w:t>
+      </w:r>
+    </w:p>
+    <w:p>
+      <w:pPr>
+        <w:jc w:val="left"/>
+      </w:pPr>
+      <w:r>
+        <w:t>Nosotros en un principio asumimos que el ruido que queremos eliminar que es ambiente varía en distintas frecuencias</w:t>
+      </w:r>
+      <w:r>
+        <w:t xml:space="preserve"> (algunas graves y otras agudas)</w:t>
+      </w:r>
+      <w:r>
+        <w:t>, por eso</w:t>
+      </w:r>
+      <w:r>
+        <w:t>,</w:t>
+      </w:r>
+      <w:r>
+        <w:t xml:space="preserve"> primero intentamos hacerlo con un filtro paso-banda.</w:t>
       </w:r>
     </w:p>
     <w:sectPr>
@@ -1750,7 +1775,7 @@
 </file>
 
 <file path=customXml/itemProps1.xml><?xml version="1.0" encoding="utf-8"?>
-<ds:datastoreItem xmlns:ds="http://schemas.openxmlformats.org/officeDocument/2006/customXml" ds:itemID="{3433EAFD-B2DB-401C-8BA9-B57731228BD7}">
+<ds:datastoreItem xmlns:ds="http://schemas.openxmlformats.org/officeDocument/2006/customXml" ds:itemID="{86082458-6CAF-4B48-982D-50829673FA40}">
   <ds:schemaRefs>
     <ds:schemaRef ds:uri="http://schemas.openxmlformats.org/officeDocument/2006/bibliography"/>
   </ds:schemaRefs>

</xml_diff>

<commit_message>
Add bandpass filter, update plotting and main
Introduce interactive band-pass filtering and enhanced time-frequency plotting. Added src/filtro_paso_banda.py (design + apply functions and helper to filter dicts), removed src/analisis_snr.py, and updated src/graficador.py to produce 3 subplots (time, full FFT and FFT limited to 0–5000 Hz), improve peak detection and axis formatting. main.py now prompts the user to configure/apply independent bandpass filters for each siren, calls the new filter and new graficar_tiempo_frecuencia to save original and filtered plots, and removes the previous SNR-analysis/summary flow. Also added multiple image assets under Imagenes/Señales 1 filtradas and graficos-creados, removed the old comparison image, and updated Entregable.docx. These changes modularize filtering and improve visualization/export of results.
</commit_message>
<xml_diff>
--- a/Entregable.docx
+++ b/Entregable.docx
@@ -482,7 +482,6 @@
     <w:p>
       <w:pPr>
         <w:keepNext/>
-        <w:jc w:val="left"/>
       </w:pPr>
       <w:r>
         <w:t>Primero cargamos las señales en un archivo de Python para luego gr</w:t>
@@ -505,9 +504,11 @@
       <w:r>
         <w:t>:</w:t>
       </w:r>
-      <w:r>
-        <w:br/>
-      </w:r>
+    </w:p>
+    <w:p>
+      <w:pPr>
+        <w:keepNext/>
+      </w:pPr>
       <w:r>
         <w:pict w14:anchorId="4BC3599B">
           <v:shapetype id="_x0000_t75" coordsize="21600,21600" o:spt="75" o:preferrelative="t" path="m@4@5l@4@11@9@11@9@5xe" filled="f" stroked="f">
@@ -529,7 +530,7 @@
             <v:path o:extrusionok="f" gradientshapeok="t" o:connecttype="rect"/>
             <o:lock v:ext="edit" aspectratio="t"/>
           </v:shapetype>
-          <v:shape id="_x0000_i1025" type="#_x0000_t75" style="width:436.7pt;height:225.35pt">
+          <v:shape id="_x0000_i1025" type="#_x0000_t75" style="width:436.9pt;height:225.4pt">
             <v:imagedata r:id="rId8" o:title="Señal_1_ruidosa" croptop="4745f" cropbottom="3269f" cropleft="4145f" cropright="4888f"/>
           </v:shape>
         </w:pict>
@@ -543,27 +544,14 @@
       <w:r>
         <w:t xml:space="preserve">Tabla </w:t>
       </w:r>
-      <w:r>
-        <w:fldChar w:fldCharType="begin"/>
-      </w:r>
-      <w:r>
-        <w:instrText xml:space="preserve"> SEQ Tabla \* ARABIC </w:instrText>
-      </w:r>
-      <w:r>
-        <w:fldChar w:fldCharType="separate"/>
-      </w:r>
-      <w:r>
-        <w:rPr>
-          <w:noProof/>
-        </w:rPr>
-        <w:t>1</w:t>
-      </w:r>
-      <w:r>
-        <w:rPr>
-          <w:noProof/>
-        </w:rPr>
-        <w:fldChar w:fldCharType="end"/>
-      </w:r>
+      <w:fldSimple w:instr=" SEQ Tabla \* ARABIC ">
+        <w:r>
+          <w:rPr>
+            <w:noProof/>
+          </w:rPr>
+          <w:t>1</w:t>
+        </w:r>
+      </w:fldSimple>
       <w:r>
         <w:t xml:space="preserve"> sirena 1 sin ningún filtro</w:t>
       </w:r>
@@ -571,12 +559,11 @@
     <w:p>
       <w:pPr>
         <w:keepNext/>
-        <w:jc w:val="left"/>
       </w:pPr>
       <w:r>
         <w:lastRenderedPageBreak/>
         <w:pict w14:anchorId="29715E25">
-          <v:shape id="_x0000_i1026" type="#_x0000_t75" style="width:432.45pt;height:228.15pt">
+          <v:shape id="_x0000_i1026" type="#_x0000_t75" style="width:432.75pt;height:228pt">
             <v:imagedata r:id="rId9" o:title="Señal_2_ruidosa" croptop="4730f" cropbottom="2783f" cropleft="4556f" cropright="5226f"/>
           </v:shape>
         </w:pict>
@@ -590,35 +577,19 @@
       <w:r>
         <w:t xml:space="preserve">Tabla </w:t>
       </w:r>
-      <w:r>
-        <w:fldChar w:fldCharType="begin"/>
-      </w:r>
-      <w:r>
-        <w:instrText xml:space="preserve"> SEQ Tabla \* ARABIC </w:instrText>
-      </w:r>
-      <w:r>
-        <w:fldChar w:fldCharType="separate"/>
-      </w:r>
-      <w:r>
-        <w:rPr>
-          <w:noProof/>
-        </w:rPr>
-        <w:t>2</w:t>
-      </w:r>
-      <w:r>
-        <w:rPr>
-          <w:noProof/>
-        </w:rPr>
-        <w:fldChar w:fldCharType="end"/>
-      </w:r>
+      <w:fldSimple w:instr=" SEQ Tabla \* ARABIC ">
+        <w:r>
+          <w:rPr>
+            <w:noProof/>
+          </w:rPr>
+          <w:t>2</w:t>
+        </w:r>
+      </w:fldSimple>
       <w:r>
         <w:t xml:space="preserve"> sirena 2 sin ningún filtro</w:t>
       </w:r>
     </w:p>
     <w:p>
-      <w:pPr>
-        <w:jc w:val="left"/>
-      </w:pPr>
       <w:r>
         <w:br/>
       </w:r>
@@ -648,54 +619,145 @@
       </w:r>
     </w:p>
     <w:p>
-      <w:pPr>
-        <w:jc w:val="left"/>
-      </w:pPr>
       <w:r>
         <w:t>Podemos ver que las señales analizadas son extremadamente ruidosas</w:t>
+      </w:r>
+      <w:r>
+        <w:t>, lo que significa que tiene una relación señal ruido (SNR) demasiado baja, por lo que decidimos que es necesario aplicarle un filtro</w:t>
+      </w:r>
+      <w:r>
+        <w:t xml:space="preserve"> digital por </w:t>
+      </w:r>
+      <w:proofErr w:type="spellStart"/>
+      <w:r>
+        <w:t>convol</w:t>
+      </w:r>
+      <w:r>
+        <w:t>ución</w:t>
+      </w:r>
+      <w:proofErr w:type="spellEnd"/>
+      <w:r>
+        <w:t>.</w:t>
+      </w:r>
+    </w:p>
+    <w:p>
+      <w:r>
+        <w:t>Nosotros en un principio asumimos que el ruido que queremos eliminar que es ambiente varía en distintas frecuencias</w:t>
+      </w:r>
+      <w:r>
+        <w:t xml:space="preserve"> (algunas graves y otras agudas)</w:t>
+      </w:r>
+      <w:r>
+        <w:t>, por eso</w:t>
+      </w:r>
+      <w:r>
+        <w:t>,</w:t>
+      </w:r>
+      <w:r>
+        <w:t xml:space="preserve"> primero intentamos hacerlo con un filtro paso-banda.</w:t>
+      </w:r>
+    </w:p>
+    <w:p>
+      <w:r>
+        <w:t>Para saber cuáles son los límites de dicho filtro, decidimos hacer</w:t>
+      </w:r>
+      <w:r>
+        <w:t xml:space="preserve"> un código que genere las transformada rápida de Fourier (la discreta de Fourier) para saber cuáles son los valores de frecuencia que más se repiten, así podemos tener un indicio de cuáles podrían ser nuestros límites del filtro paso-banda.</w:t>
+      </w:r>
+      <w:r>
+        <w:t xml:space="preserve"> También generé una segunda gráfica </w:t>
+      </w:r>
+      <w:proofErr w:type="spellStart"/>
+      <w:r>
+        <w:t>fft</w:t>
+      </w:r>
+      <w:proofErr w:type="spellEnd"/>
+      <w:r>
+        <w:t xml:space="preserve"> más acotada para poder ver mejor los valores que creímos que eran más candidatos a ser utilizados. Este código generó los siguientes resultados:</w:t>
+      </w:r>
+    </w:p>
+    <w:p>
+      <w:pPr>
+        <w:keepNext/>
+      </w:pPr>
+      <w:r>
+        <w:lastRenderedPageBreak/>
+        <w:pict w14:anchorId="5DEE665F">
+          <v:shape id="_x0000_i1033" type="#_x0000_t75" style="width:425.25pt;height:345pt">
+            <v:imagedata r:id="rId10" o:title="Sirena1_Original"/>
+          </v:shape>
+        </w:pict>
+      </w:r>
+    </w:p>
+    <w:p>
+      <w:pPr>
+        <w:pStyle w:val="Descripcin"/>
+        <w:jc w:val="center"/>
+      </w:pPr>
+      <w:r>
+        <w:t xml:space="preserve">Tabla </w:t>
+      </w:r>
+      <w:fldSimple w:instr=" SEQ Tabla \* ARABIC ">
+        <w:r>
+          <w:rPr>
+            <w:noProof/>
+          </w:rPr>
+          <w:t>3</w:t>
+        </w:r>
+      </w:fldSimple>
+      <w:r>
+        <w:t>: gráficos para la sirena 1</w:t>
+      </w:r>
+    </w:p>
+    <w:p>
+      <w:r>
+        <w:t xml:space="preserve">De aquí observamos que hay 2 rangos de frecuencia que sobresalen considerablemente, siendo estos aproximadamente [940, 1050] y [2800, </w:t>
       </w:r>
       <w:bookmarkStart w:id="2" w:name="_GoBack"/>
       <w:bookmarkEnd w:id="2"/>
       <w:r>
-        <w:t>, lo que significa que tiene una relación señal ruido (SNR) demasiado baja, por lo que decidimos que es necesario aplicarle un filtro</w:t>
-      </w:r>
-      <w:r>
-        <w:t xml:space="preserve"> digital por </w:t>
-      </w:r>
-      <w:proofErr w:type="spellStart"/>
-      <w:r>
-        <w:t>convol</w:t>
-      </w:r>
-      <w:r>
-        <w:t>ución</w:t>
-      </w:r>
-      <w:proofErr w:type="spellEnd"/>
-      <w:r>
-        <w:t>.</w:t>
-      </w:r>
-    </w:p>
-    <w:p>
-      <w:pPr>
-        <w:jc w:val="left"/>
-      </w:pPr>
-      <w:r>
-        <w:t>Nosotros en un principio asumimos que el ruido que queremos eliminar que es ambiente varía en distintas frecuencias</w:t>
-      </w:r>
-      <w:r>
-        <w:t xml:space="preserve"> (algunas graves y otras agudas)</w:t>
-      </w:r>
-      <w:r>
-        <w:t>, por eso</w:t>
-      </w:r>
-      <w:r>
-        <w:t>,</w:t>
-      </w:r>
-      <w:r>
-        <w:t xml:space="preserve"> primero intentamos hacerlo con un filtro paso-banda.</w:t>
-      </w:r>
-    </w:p>
+        <w:t>3300]</w:t>
+      </w:r>
+    </w:p>
+    <w:p>
+      <w:pPr>
+        <w:keepNext/>
+      </w:pPr>
+      <w:r>
+        <w:lastRenderedPageBreak/>
+        <w:pict w14:anchorId="05D94BF5">
+          <v:shape id="_x0000_i1032" type="#_x0000_t75" style="width:425.25pt;height:345pt">
+            <v:imagedata r:id="rId11" o:title="Sirena2_Original"/>
+          </v:shape>
+        </w:pict>
+      </w:r>
+    </w:p>
+    <w:p>
+      <w:pPr>
+        <w:pStyle w:val="Descripcin"/>
+        <w:jc w:val="center"/>
+      </w:pPr>
+      <w:r>
+        <w:t xml:space="preserve">Tabla </w:t>
+      </w:r>
+      <w:fldSimple w:instr=" SEQ Tabla \* ARABIC ">
+        <w:r>
+          <w:rPr>
+            <w:noProof/>
+          </w:rPr>
+          <w:t>4</w:t>
+        </w:r>
+      </w:fldSimple>
+      <w:r>
+        <w:t>: g</w:t>
+      </w:r>
+      <w:r>
+        <w:t>ráficos para la sirena 2</w:t>
+      </w:r>
+    </w:p>
+    <w:p/>
     <w:sectPr>
-      <w:footerReference w:type="default" r:id="rId10"/>
+      <w:footerReference w:type="default" r:id="rId12"/>
       <w:pgSz w:w="11906" w:h="16838"/>
       <w:pgMar w:top="1417" w:right="1701" w:bottom="1417" w:left="1701" w:header="708" w:footer="708" w:gutter="0"/>
       <w:cols w:space="708"/>
@@ -798,7 +860,7 @@
         <w:szCs w:val="24"/>
         <w:lang w:val="es-MX"/>
       </w:rPr>
-      <w:t>3</w:t>
+      <w:t>5</w:t>
     </w:r>
     <w:r>
       <w:rPr>
@@ -849,7 +911,7 @@
         <w:szCs w:val="24"/>
         <w:lang w:val="es-MX"/>
       </w:rPr>
-      <w:t>4</w:t>
+      <w:t>6</w:t>
     </w:r>
     <w:r>
       <w:rPr>
@@ -1775,7 +1837,7 @@
 </file>
 
 <file path=customXml/itemProps1.xml><?xml version="1.0" encoding="utf-8"?>
-<ds:datastoreItem xmlns:ds="http://schemas.openxmlformats.org/officeDocument/2006/customXml" ds:itemID="{86082458-6CAF-4B48-982D-50829673FA40}">
+<ds:datastoreItem xmlns:ds="http://schemas.openxmlformats.org/officeDocument/2006/customXml" ds:itemID="{BABAEDC0-4DA1-497B-8ED6-59105B7671E8}">
   <ds:schemaRefs>
     <ds:schemaRef ds:uri="http://schemas.openxmlformats.org/officeDocument/2006/bibliography"/>
   </ds:schemaRefs>

</xml_diff>

<commit_message>
avanzamos el item 2
</commit_message>
<xml_diff>
--- a/Entregable.docx
+++ b/Entregable.docx
@@ -1,6 +1,6 @@
 
 <file path=word/document.xml><?xml version="1.0" encoding="utf-8"?>
-<w:document xmlns:wpc="http://schemas.microsoft.com/office/word/2010/wordprocessingCanvas" xmlns:cx="http://schemas.microsoft.com/office/drawing/2014/chartex" xmlns:mc="http://schemas.openxmlformats.org/markup-compatibility/2006" xmlns:o="urn:schemas-microsoft-com:office:office" xmlns:r="http://schemas.openxmlformats.org/officeDocument/2006/relationships" xmlns:m="http://schemas.openxmlformats.org/officeDocument/2006/math" xmlns:v="urn:schemas-microsoft-com:vml" xmlns:wp14="http://schemas.microsoft.com/office/word/2010/wordprocessingDrawing" xmlns:wp="http://schemas.openxmlformats.org/drawingml/2006/wordprocessingDrawing" xmlns:w10="urn:schemas-microsoft-com:office:word" xmlns:w="http://schemas.openxmlformats.org/wordprocessingml/2006/main" xmlns:w14="http://schemas.microsoft.com/office/word/2010/wordml" xmlns:w15="http://schemas.microsoft.com/office/word/2012/wordml" xmlns:w16se="http://schemas.microsoft.com/office/word/2015/wordml/symex" xmlns:wpg="http://schemas.microsoft.com/office/word/2010/wordprocessingGroup" xmlns:wpi="http://schemas.microsoft.com/office/word/2010/wordprocessingInk" xmlns:wne="http://schemas.microsoft.com/office/word/2006/wordml" xmlns:wps="http://schemas.microsoft.com/office/word/2010/wordprocessingShape" mc:Ignorable="w14 w15 w16se wp14">
+<w:document xmlns:wpc="http://schemas.microsoft.com/office/word/2010/wordprocessingCanvas" xmlns:cx="http://schemas.microsoft.com/office/drawing/2014/chartex" xmlns:cx1="http://schemas.microsoft.com/office/drawing/2015/9/8/chartex" xmlns:cx2="http://schemas.microsoft.com/office/drawing/2015/10/21/chartex" xmlns:cx3="http://schemas.microsoft.com/office/drawing/2016/5/9/chartex" xmlns:cx4="http://schemas.microsoft.com/office/drawing/2016/5/10/chartex" xmlns:cx5="http://schemas.microsoft.com/office/drawing/2016/5/11/chartex" xmlns:cx6="http://schemas.microsoft.com/office/drawing/2016/5/12/chartex" xmlns:cx7="http://schemas.microsoft.com/office/drawing/2016/5/13/chartex" xmlns:cx8="http://schemas.microsoft.com/office/drawing/2016/5/14/chartex" xmlns:mc="http://schemas.openxmlformats.org/markup-compatibility/2006" xmlns:aink="http://schemas.microsoft.com/office/drawing/2016/ink" xmlns:am3d="http://schemas.microsoft.com/office/drawing/2017/model3d" xmlns:o="urn:schemas-microsoft-com:office:office" xmlns:oel="http://schemas.microsoft.com/office/2019/extlst" xmlns:r="http://schemas.openxmlformats.org/officeDocument/2006/relationships" xmlns:m="http://schemas.openxmlformats.org/officeDocument/2006/math" xmlns:v="urn:schemas-microsoft-com:vml" xmlns:wp14="http://schemas.microsoft.com/office/word/2010/wordprocessingDrawing" xmlns:wp="http://schemas.openxmlformats.org/drawingml/2006/wordprocessingDrawing" xmlns:w10="urn:schemas-microsoft-com:office:word" xmlns:w="http://schemas.openxmlformats.org/wordprocessingml/2006/main" xmlns:w14="http://schemas.microsoft.com/office/word/2010/wordml" xmlns:w15="http://schemas.microsoft.com/office/word/2012/wordml" xmlns:w16cex="http://schemas.microsoft.com/office/word/2018/wordml/cex" xmlns:w16cid="http://schemas.microsoft.com/office/word/2016/wordml/cid" xmlns:w16="http://schemas.microsoft.com/office/word/2018/wordml" xmlns:w16du="http://schemas.microsoft.com/office/word/2023/wordml/word16du" xmlns:w16sdtdh="http://schemas.microsoft.com/office/word/2020/wordml/sdtdatahash" xmlns:w16sdtfl="http://schemas.microsoft.com/office/word/2024/wordml/sdtformatlock" xmlns:w16se="http://schemas.microsoft.com/office/word/2015/wordml/symex" xmlns:wpg="http://schemas.microsoft.com/office/word/2010/wordprocessingGroup" xmlns:wpi="http://schemas.microsoft.com/office/word/2010/wordprocessingInk" xmlns:wne="http://schemas.microsoft.com/office/word/2006/wordml" xmlns:wps="http://schemas.microsoft.com/office/word/2010/wordprocessingShape" mc:Ignorable="w14 w15 w16se w16cid w16 w16cex w16sdtdh w16sdtfl w16du wp14">
   <w:body>
     <w:p>
       <w:pPr>
@@ -463,21 +463,7 @@
         <w:rPr>
           <w:b/>
         </w:rPr>
-        <w:t xml:space="preserve">. Graficar ambas en el dominio del tiempo y explicar mediante la observación de la relación señal-ruido (SNR). ¿Se debe aplicar un filtro digital por </w:t>
-      </w:r>
-      <w:proofErr w:type="spellStart"/>
-      <w:r>
-        <w:rPr>
-          <w:b/>
-        </w:rPr>
-        <w:t>convolución</w:t>
-      </w:r>
-      <w:proofErr w:type="spellEnd"/>
-      <w:r>
-        <w:rPr>
-          <w:b/>
-        </w:rPr>
-        <w:t xml:space="preserve"> antes de proceder al análisis de frecuencia? En caso afirmativo, aplicar el filtro y determinar de qué tipo es y cuáles son las frecuencias de corte. ¿Cuál es la frecuencia de muestreo de las se</w:t>
+        <w:t>. Graficar ambas en el dominio del tiempo y explicar mediante la observación de la relación señal-ruido (SNR). ¿Se debe aplicar un filtro digital por convolución antes de proceder al análisis de frecuencia? En caso afirmativo, aplicar el filtro y determinar de qué tipo es y cuáles son las frecuencias de corte. ¿Cuál es la frecuencia de muestreo de las se</w:t>
       </w:r>
       <w:r>
         <w:rPr>
@@ -544,7 +530,7 @@
             <v:path o:extrusionok="f" gradientshapeok="t" o:connecttype="rect"/>
             <o:lock v:ext="edit" aspectratio="t"/>
           </v:shapetype>
-          <v:shape id="_x0000_i1025" type="#_x0000_t75" style="width:436.7pt;height:225.35pt">
+          <v:shape id="_x0000_i1025" type="#_x0000_t75" style="width:437pt;height:225.4pt">
             <v:imagedata r:id="rId8" o:title="Señal_1_ruidosa" croptop="4745f" cropbottom="3269f" cropleft="4145f" cropright="4888f"/>
           </v:shape>
         </w:pict>
@@ -558,27 +544,14 @@
       <w:r>
         <w:t xml:space="preserve">Tabla </w:t>
       </w:r>
-      <w:r>
-        <w:fldChar w:fldCharType="begin"/>
-      </w:r>
-      <w:r>
-        <w:instrText xml:space="preserve"> SEQ Tabla \* ARABIC </w:instrText>
-      </w:r>
-      <w:r>
-        <w:fldChar w:fldCharType="separate"/>
-      </w:r>
-      <w:r>
-        <w:rPr>
-          <w:noProof/>
-        </w:rPr>
-        <w:t>1</w:t>
-      </w:r>
-      <w:r>
-        <w:rPr>
-          <w:noProof/>
-        </w:rPr>
-        <w:fldChar w:fldCharType="end"/>
-      </w:r>
+      <w:fldSimple w:instr=" SEQ Tabla \* ARABIC ">
+        <w:r>
+          <w:rPr>
+            <w:noProof/>
+          </w:rPr>
+          <w:t>1</w:t>
+        </w:r>
+      </w:fldSimple>
       <w:r>
         <w:t xml:space="preserve"> sirena 1 sin ningún filtro</w:t>
       </w:r>
@@ -590,7 +563,7 @@
       <w:r>
         <w:lastRenderedPageBreak/>
         <w:pict w14:anchorId="29715E25">
-          <v:shape id="_x0000_i1026" type="#_x0000_t75" style="width:432.45pt;height:228.15pt">
+          <v:shape id="_x0000_i1026" type="#_x0000_t75" style="width:432.65pt;height:227.9pt">
             <v:imagedata r:id="rId9" o:title="Señal_2_ruidosa" croptop="4730f" cropbottom="2783f" cropleft="4556f" cropright="5226f"/>
           </v:shape>
         </w:pict>
@@ -604,27 +577,14 @@
       <w:r>
         <w:t xml:space="preserve">Tabla </w:t>
       </w:r>
-      <w:r>
-        <w:fldChar w:fldCharType="begin"/>
-      </w:r>
-      <w:r>
-        <w:instrText xml:space="preserve"> SEQ Tabla \* ARABIC </w:instrText>
-      </w:r>
-      <w:r>
-        <w:fldChar w:fldCharType="separate"/>
-      </w:r>
-      <w:r>
-        <w:rPr>
-          <w:noProof/>
-        </w:rPr>
-        <w:t>2</w:t>
-      </w:r>
-      <w:r>
-        <w:rPr>
-          <w:noProof/>
-        </w:rPr>
-        <w:fldChar w:fldCharType="end"/>
-      </w:r>
+      <w:fldSimple w:instr=" SEQ Tabla \* ARABIC ">
+        <w:r>
+          <w:rPr>
+            <w:noProof/>
+          </w:rPr>
+          <w:t>2</w:t>
+        </w:r>
+      </w:fldSimple>
       <w:r>
         <w:t xml:space="preserve"> sirena 2 sin ningún filtro</w:t>
       </w:r>
@@ -662,16 +622,11 @@
         <w:t>, lo que significa que tiene una relación señal ruido (SNR) demasiado baja, por lo que decidimos que es necesario aplicarle un filtro</w:t>
       </w:r>
       <w:r>
-        <w:t xml:space="preserve"> digital por </w:t>
-      </w:r>
-      <w:proofErr w:type="spellStart"/>
-      <w:r>
-        <w:t>convol</w:t>
+        <w:t xml:space="preserve"> digital por convol</w:t>
       </w:r>
       <w:r>
         <w:t>ución</w:t>
       </w:r>
-      <w:proofErr w:type="spellEnd"/>
       <w:r>
         <w:t>.</w:t>
       </w:r>
@@ -735,7 +690,7 @@
       <w:r>
         <w:lastRenderedPageBreak/>
         <w:pict w14:anchorId="5DEE665F">
-          <v:shape id="_x0000_i1027" type="#_x0000_t75" style="width:425pt;height:345.05pt">
+          <v:shape id="_x0000_i1027" type="#_x0000_t75" style="width:425.1pt;height:344.95pt">
             <v:imagedata r:id="rId10" o:title="Sirena1_Original"/>
           </v:shape>
         </w:pict>
@@ -749,27 +704,14 @@
       <w:r>
         <w:t xml:space="preserve">Tabla </w:t>
       </w:r>
-      <w:r>
-        <w:fldChar w:fldCharType="begin"/>
-      </w:r>
-      <w:r>
-        <w:instrText xml:space="preserve"> SEQ Tabla \* ARABIC </w:instrText>
-      </w:r>
-      <w:r>
-        <w:fldChar w:fldCharType="separate"/>
-      </w:r>
-      <w:r>
-        <w:rPr>
-          <w:noProof/>
-        </w:rPr>
-        <w:t>3</w:t>
-      </w:r>
-      <w:r>
-        <w:rPr>
-          <w:noProof/>
-        </w:rPr>
-        <w:fldChar w:fldCharType="end"/>
-      </w:r>
+      <w:fldSimple w:instr=" SEQ Tabla \* ARABIC ">
+        <w:r>
+          <w:rPr>
+            <w:noProof/>
+          </w:rPr>
+          <w:t>3</w:t>
+        </w:r>
+      </w:fldSimple>
       <w:r>
         <w:t>: gráficos para la sirena 1</w:t>
       </w:r>
@@ -786,7 +728,7 @@
       <w:r>
         <w:lastRenderedPageBreak/>
         <w:pict w14:anchorId="05D94BF5">
-          <v:shape id="_x0000_i1028" type="#_x0000_t75" style="width:425pt;height:345.05pt">
+          <v:shape id="_x0000_i1028" type="#_x0000_t75" style="width:425.1pt;height:344.95pt">
             <v:imagedata r:id="rId11" o:title="Sirena2_Original"/>
           </v:shape>
         </w:pict>
@@ -800,97 +742,84 @@
       <w:r>
         <w:t xml:space="preserve">Tabla </w:t>
       </w:r>
-      <w:r>
-        <w:fldChar w:fldCharType="begin"/>
-      </w:r>
-      <w:r>
-        <w:instrText xml:space="preserve"> SEQ Tabla \* ARABIC </w:instrText>
-      </w:r>
-      <w:r>
-        <w:fldChar w:fldCharType="separate"/>
-      </w:r>
+      <w:fldSimple w:instr=" SEQ Tabla \* ARABIC ">
+        <w:r>
+          <w:rPr>
+            <w:noProof/>
+          </w:rPr>
+          <w:t>4</w:t>
+        </w:r>
+      </w:fldSimple>
+      <w:r>
+        <w:t>: g</w:t>
+      </w:r>
+      <w:r>
+        <w:t>ráficos para la sirena 2</w:t>
+      </w:r>
+    </w:p>
+    <w:p>
+      <w:r>
+        <w:t xml:space="preserve">El rango que </w:t>
+      </w:r>
+      <w:r>
+        <w:t>sobresale del</w:t>
+      </w:r>
+      <w:r>
+        <w:t xml:space="preserve"> segundo</w:t>
+      </w:r>
+      <w:r>
+        <w:t xml:space="preserve"> audio es aproximadamente [600,</w:t>
+      </w:r>
+      <w:r>
+        <w:t xml:space="preserve"> 1500].</w:t>
+      </w:r>
+    </w:p>
+    <w:p/>
+    <w:p>
+      <w:r>
+        <w:t>D</w:t>
+      </w:r>
+      <w:r>
+        <w:t>espués de analizar a</w:t>
+      </w:r>
+      <w:r>
+        <w:t>mbos rangos propuestos</w:t>
+      </w:r>
+      <w:r>
+        <w:t xml:space="preserve"> para la sirena 1</w:t>
+      </w:r>
+      <w:r>
+        <w:t xml:space="preserve">, llegamos a la conclusión de que el que </w:t>
+      </w:r>
+      <w:r>
+        <w:t>más</w:t>
+      </w:r>
+      <w:r>
+        <w:t xml:space="preserve"> se asemeja al audio es el de rango [940</w:t>
+      </w:r>
+      <w:r>
+        <w:t xml:space="preserve">, </w:t>
+      </w:r>
+      <w:r>
+        <w:t xml:space="preserve">1050], el segundo rango propuesto podemos ver que </w:t>
+      </w:r>
+      <w:r>
+        <w:t>es principalmente ruido y no representa ninguna señal en particular</w:t>
+      </w:r>
+      <w:r>
+        <w:t>.</w:t>
+      </w:r>
+    </w:p>
+    <w:p>
+      <w:pPr>
+        <w:pStyle w:val="NormalWeb"/>
+      </w:pPr>
       <w:r>
         <w:rPr>
           <w:noProof/>
         </w:rPr>
-        <w:t>4</w:t>
-      </w:r>
-      <w:r>
-        <w:rPr>
-          <w:noProof/>
-        </w:rPr>
-        <w:fldChar w:fldCharType="end"/>
-      </w:r>
-      <w:r>
-        <w:t>: g</w:t>
-      </w:r>
-      <w:r>
-        <w:t>ráficos para la sirena 2</w:t>
-      </w:r>
-    </w:p>
-    <w:p>
-      <w:r>
-        <w:t xml:space="preserve">El rango que </w:t>
-      </w:r>
-      <w:r>
-        <w:t>sobresale del</w:t>
-      </w:r>
-      <w:r>
-        <w:t xml:space="preserve"> segundo</w:t>
-      </w:r>
-      <w:r>
-        <w:t xml:space="preserve"> audio es aproximadamente [600,</w:t>
-      </w:r>
-      <w:r>
-        <w:t xml:space="preserve"> 1500].</w:t>
-      </w:r>
-    </w:p>
-    <w:p/>
-    <w:p>
-      <w:r>
-        <w:t>D</w:t>
-      </w:r>
-      <w:r>
-        <w:t>espués de analizar a</w:t>
-      </w:r>
-      <w:r>
-        <w:t>mbos rangos propuestos</w:t>
-      </w:r>
-      <w:r>
-        <w:t xml:space="preserve"> para la sirena 1</w:t>
-      </w:r>
-      <w:r>
-        <w:t xml:space="preserve">, llegamos a la conclusión de que el que </w:t>
-      </w:r>
-      <w:r>
-        <w:t>más</w:t>
-      </w:r>
-      <w:r>
-        <w:t xml:space="preserve"> se asemeja al audio es el de rango [940</w:t>
-      </w:r>
-      <w:r>
-        <w:t xml:space="preserve">, </w:t>
-      </w:r>
-      <w:r>
-        <w:t xml:space="preserve">1050], el segundo rango propuesto podemos ver que </w:t>
-      </w:r>
-      <w:r>
-        <w:t>es principalmente ruido y no representa ninguna señal en particular</w:t>
-      </w:r>
-      <w:r>
-        <w:t>.</w:t>
-      </w:r>
-    </w:p>
-    <w:p>
-      <w:pPr>
-        <w:pStyle w:val="NormalWeb"/>
-      </w:pPr>
-      <w:r>
-        <w:rPr>
-          <w:noProof/>
-        </w:rPr>
         <w:drawing>
-          <wp:inline distT="0" distB="0" distL="0" distR="0" wp14:anchorId="2B1FD541" wp14:editId="28BEC382">
+          <wp:inline distT="0" distB="0" distL="0" distR="0" wp14:anchorId="2B1FD541" wp14:editId="2FBAD4AF">
             <wp:extent cx="5368819" cy="1470992"/>
             <wp:effectExtent l="0" t="0" r="3810" b="0"/>
             <wp:docPr id="2" name="Imagen 1"/>
@@ -959,10 +888,7 @@
         <w:t>ráficos para la sirena 1con filtro Paso – Banda aplicado en rang</w:t>
       </w:r>
       <w:r>
-        <w:t>o [940</w:t>
-      </w:r>
-      <w:r>
-        <w:t xml:space="preserve">, </w:t>
+        <w:t xml:space="preserve">o [940, </w:t>
       </w:r>
       <w:r>
         <w:t>1050]</w:t>
@@ -1257,10 +1183,7 @@
         <w:t>ráficos para la sirena 2 con filtro Paso</w:t>
       </w:r>
       <w:r>
-        <w:t xml:space="preserve"> – Banda aplicado en rango [600</w:t>
-      </w:r>
-      <w:r>
-        <w:t xml:space="preserve">, </w:t>
+        <w:t xml:space="preserve"> – Banda aplicado en rango [600, </w:t>
       </w:r>
       <w:r>
         <w:t>1400]</w:t>
@@ -1344,10 +1267,7 @@
         <w:t>ráficos para la sirena 2 con filtro Paso</w:t>
       </w:r>
       <w:r>
-        <w:t xml:space="preserve"> – Banda aplicado en rango [700</w:t>
-      </w:r>
-      <w:r>
-        <w:t xml:space="preserve">, </w:t>
+        <w:t xml:space="preserve"> – Banda aplicado en rango [700, </w:t>
       </w:r>
       <w:r>
         <w:t>1200]</w:t>
@@ -1429,26 +1349,438 @@
         <w:t xml:space="preserve">ráficos para la sirena 2 con filtro Paso </w:t>
       </w:r>
       <w:r>
-        <w:t>– Banda aplicado en rango [1200</w:t>
-      </w:r>
-      <w:r>
-        <w:t xml:space="preserve">, </w:t>
-      </w:r>
-      <w:bookmarkStart w:id="2" w:name="_GoBack"/>
-      <w:bookmarkEnd w:id="2"/>
+        <w:t xml:space="preserve">– Banda aplicado en rango [1200, </w:t>
+      </w:r>
       <w:r>
         <w:t>1500]</w:t>
       </w:r>
     </w:p>
     <w:p/>
+    <w:p>
+      <w:pPr>
+        <w:pStyle w:val="Ttulo1"/>
+      </w:pPr>
+      <w:r>
+        <w:t>Inciso 2</w:t>
+      </w:r>
+    </w:p>
+    <w:p>
+      <w:r>
+        <w:t>Para realizar el inciso 1 realizamos un FFT de la Sirena 1, que es el siguiente:</w:t>
+      </w:r>
+    </w:p>
+    <w:p>
+      <w:r>
+        <w:rPr>
+          <w:noProof/>
+        </w:rPr>
+        <w:drawing>
+          <wp:inline distT="0" distB="0" distL="0" distR="0" wp14:anchorId="6B8C550D" wp14:editId="64090EFC">
+            <wp:extent cx="5396987" cy="2918129"/>
+            <wp:effectExtent l="0" t="0" r="0" b="0"/>
+            <wp:docPr id="872699206" name="Imagen 1"/>
+            <wp:cNvGraphicFramePr>
+              <a:graphicFrameLocks xmlns:a="http://schemas.openxmlformats.org/drawingml/2006/main" noChangeAspect="1"/>
+            </wp:cNvGraphicFramePr>
+            <a:graphic xmlns:a="http://schemas.openxmlformats.org/drawingml/2006/main">
+              <a:graphicData uri="http://schemas.openxmlformats.org/drawingml/2006/picture">
+                <pic:pic xmlns:pic="http://schemas.openxmlformats.org/drawingml/2006/picture">
+                  <pic:nvPicPr>
+                    <pic:cNvPr id="0" name="Picture 5"/>
+                    <pic:cNvPicPr>
+                      <a:picLocks noChangeAspect="1" noChangeArrowheads="1"/>
+                    </pic:cNvPicPr>
+                  </pic:nvPicPr>
+                  <pic:blipFill rotWithShape="1">
+                    <a:blip r:embed="rId18" cstate="print">
+                      <a:extLst>
+                        <a:ext uri="{28A0092B-C50C-407E-A947-70E740481C1C}">
+                          <a14:useLocalDpi xmlns:a14="http://schemas.microsoft.com/office/drawing/2010/main" val="0"/>
+                        </a:ext>
+                      </a:extLst>
+                    </a:blip>
+                    <a:srcRect t="33218" b="148"/>
+                    <a:stretch>
+                      <a:fillRect/>
+                    </a:stretch>
+                  </pic:blipFill>
+                  <pic:spPr bwMode="auto">
+                    <a:xfrm>
+                      <a:off x="0" y="0"/>
+                      <a:ext cx="5398770" cy="2919093"/>
+                    </a:xfrm>
+                    <a:prstGeom prst="rect">
+                      <a:avLst/>
+                    </a:prstGeom>
+                    <a:noFill/>
+                    <a:ln>
+                      <a:noFill/>
+                    </a:ln>
+                    <a:extLst>
+                      <a:ext uri="{53640926-AAD7-44D8-BBD7-CCE9431645EC}">
+                        <a14:shadowObscured xmlns:a14="http://schemas.microsoft.com/office/drawing/2010/main"/>
+                      </a:ext>
+                    </a:extLst>
+                  </pic:spPr>
+                </pic:pic>
+              </a:graphicData>
+            </a:graphic>
+          </wp:inline>
+        </w:drawing>
+      </w:r>
+    </w:p>
+    <w:p>
+      <w:r>
+        <w:t xml:space="preserve">Luego hicimos un programa el cual genera un FFT cada un intervalo de tiempo que se ingrese por pantalla y al hacer eso y poner como input 0.5, nos </w:t>
+      </w:r>
+      <w:proofErr w:type="spellStart"/>
+      <w:r>
+        <w:t>generolos</w:t>
+      </w:r>
+      <w:proofErr w:type="spellEnd"/>
+      <w:r>
+        <w:t xml:space="preserve"> siguientes 16 gráficos.</w:t>
+      </w:r>
+    </w:p>
     <w:p/>
+    <w:p>
+      <w:r>
+        <w:rPr>
+          <w:noProof/>
+        </w:rPr>
+        <w:lastRenderedPageBreak/>
+        <w:drawing>
+          <wp:inline distT="0" distB="0" distL="0" distR="0" wp14:anchorId="13A3800B" wp14:editId="0E312371">
+            <wp:extent cx="5391150" cy="4301490"/>
+            <wp:effectExtent l="0" t="0" r="0" b="3810"/>
+            <wp:docPr id="1672723467" name="Imagen 2"/>
+            <wp:cNvGraphicFramePr>
+              <a:graphicFrameLocks xmlns:a="http://schemas.openxmlformats.org/drawingml/2006/main" noChangeAspect="1"/>
+            </wp:cNvGraphicFramePr>
+            <a:graphic xmlns:a="http://schemas.openxmlformats.org/drawingml/2006/main">
+              <a:graphicData uri="http://schemas.openxmlformats.org/drawingml/2006/picture">
+                <pic:pic xmlns:pic="http://schemas.openxmlformats.org/drawingml/2006/picture">
+                  <pic:nvPicPr>
+                    <pic:cNvPr id="0" name="Picture 6"/>
+                    <pic:cNvPicPr>
+                      <a:picLocks noChangeAspect="1" noChangeArrowheads="1"/>
+                    </pic:cNvPicPr>
+                  </pic:nvPicPr>
+                  <pic:blipFill>
+                    <a:blip r:embed="rId19" cstate="print">
+                      <a:extLst>
+                        <a:ext uri="{28A0092B-C50C-407E-A947-70E740481C1C}">
+                          <a14:useLocalDpi xmlns:a14="http://schemas.microsoft.com/office/drawing/2010/main" val="0"/>
+                        </a:ext>
+                      </a:extLst>
+                    </a:blip>
+                    <a:srcRect/>
+                    <a:stretch>
+                      <a:fillRect/>
+                    </a:stretch>
+                  </pic:blipFill>
+                  <pic:spPr bwMode="auto">
+                    <a:xfrm>
+                      <a:off x="0" y="0"/>
+                      <a:ext cx="5391150" cy="4301490"/>
+                    </a:xfrm>
+                    <a:prstGeom prst="rect">
+                      <a:avLst/>
+                    </a:prstGeom>
+                    <a:noFill/>
+                    <a:ln>
+                      <a:noFill/>
+                    </a:ln>
+                  </pic:spPr>
+                </pic:pic>
+              </a:graphicData>
+            </a:graphic>
+          </wp:inline>
+        </w:drawing>
+      </w:r>
+    </w:p>
+    <w:p>
+      <w:r>
+        <w:rPr>
+          <w:noProof/>
+        </w:rPr>
+        <w:drawing>
+          <wp:inline distT="0" distB="0" distL="0" distR="0" wp14:anchorId="640D0B66" wp14:editId="783B18BE">
+            <wp:extent cx="5391150" cy="4301490"/>
+            <wp:effectExtent l="0" t="0" r="0" b="3810"/>
+            <wp:docPr id="1930155823" name="Imagen 3"/>
+            <wp:cNvGraphicFramePr>
+              <a:graphicFrameLocks xmlns:a="http://schemas.openxmlformats.org/drawingml/2006/main" noChangeAspect="1"/>
+            </wp:cNvGraphicFramePr>
+            <a:graphic xmlns:a="http://schemas.openxmlformats.org/drawingml/2006/main">
+              <a:graphicData uri="http://schemas.openxmlformats.org/drawingml/2006/picture">
+                <pic:pic xmlns:pic="http://schemas.openxmlformats.org/drawingml/2006/picture">
+                  <pic:nvPicPr>
+                    <pic:cNvPr id="0" name="Picture 7"/>
+                    <pic:cNvPicPr>
+                      <a:picLocks noChangeAspect="1" noChangeArrowheads="1"/>
+                    </pic:cNvPicPr>
+                  </pic:nvPicPr>
+                  <pic:blipFill>
+                    <a:blip r:embed="rId20" cstate="print">
+                      <a:extLst>
+                        <a:ext uri="{28A0092B-C50C-407E-A947-70E740481C1C}">
+                          <a14:useLocalDpi xmlns:a14="http://schemas.microsoft.com/office/drawing/2010/main" val="0"/>
+                        </a:ext>
+                      </a:extLst>
+                    </a:blip>
+                    <a:srcRect/>
+                    <a:stretch>
+                      <a:fillRect/>
+                    </a:stretch>
+                  </pic:blipFill>
+                  <pic:spPr bwMode="auto">
+                    <a:xfrm>
+                      <a:off x="0" y="0"/>
+                      <a:ext cx="5391150" cy="4301490"/>
+                    </a:xfrm>
+                    <a:prstGeom prst="rect">
+                      <a:avLst/>
+                    </a:prstGeom>
+                    <a:noFill/>
+                    <a:ln>
+                      <a:noFill/>
+                    </a:ln>
+                  </pic:spPr>
+                </pic:pic>
+              </a:graphicData>
+            </a:graphic>
+          </wp:inline>
+        </w:drawing>
+      </w:r>
+    </w:p>
+    <w:p>
+      <w:r>
+        <w:rPr>
+          <w:noProof/>
+        </w:rPr>
+        <w:lastRenderedPageBreak/>
+        <w:drawing>
+          <wp:inline distT="0" distB="0" distL="0" distR="0" wp14:anchorId="0BA177B5" wp14:editId="4E2EE604">
+            <wp:extent cx="5391150" cy="4301490"/>
+            <wp:effectExtent l="0" t="0" r="0" b="3810"/>
+            <wp:docPr id="1093572848" name="Imagen 4"/>
+            <wp:cNvGraphicFramePr>
+              <a:graphicFrameLocks xmlns:a="http://schemas.openxmlformats.org/drawingml/2006/main" noChangeAspect="1"/>
+            </wp:cNvGraphicFramePr>
+            <a:graphic xmlns:a="http://schemas.openxmlformats.org/drawingml/2006/main">
+              <a:graphicData uri="http://schemas.openxmlformats.org/drawingml/2006/picture">
+                <pic:pic xmlns:pic="http://schemas.openxmlformats.org/drawingml/2006/picture">
+                  <pic:nvPicPr>
+                    <pic:cNvPr id="0" name="Picture 8"/>
+                    <pic:cNvPicPr>
+                      <a:picLocks noChangeAspect="1" noChangeArrowheads="1"/>
+                    </pic:cNvPicPr>
+                  </pic:nvPicPr>
+                  <pic:blipFill>
+                    <a:blip r:embed="rId21" cstate="print">
+                      <a:extLst>
+                        <a:ext uri="{28A0092B-C50C-407E-A947-70E740481C1C}">
+                          <a14:useLocalDpi xmlns:a14="http://schemas.microsoft.com/office/drawing/2010/main" val="0"/>
+                        </a:ext>
+                      </a:extLst>
+                    </a:blip>
+                    <a:srcRect/>
+                    <a:stretch>
+                      <a:fillRect/>
+                    </a:stretch>
+                  </pic:blipFill>
+                  <pic:spPr bwMode="auto">
+                    <a:xfrm>
+                      <a:off x="0" y="0"/>
+                      <a:ext cx="5391150" cy="4301490"/>
+                    </a:xfrm>
+                    <a:prstGeom prst="rect">
+                      <a:avLst/>
+                    </a:prstGeom>
+                    <a:noFill/>
+                    <a:ln>
+                      <a:noFill/>
+                    </a:ln>
+                  </pic:spPr>
+                </pic:pic>
+              </a:graphicData>
+            </a:graphic>
+          </wp:inline>
+        </w:drawing>
+      </w:r>
+    </w:p>
+    <w:p>
+      <w:r>
+        <w:rPr>
+          <w:noProof/>
+        </w:rPr>
+        <w:drawing>
+          <wp:inline distT="0" distB="0" distL="0" distR="0" wp14:anchorId="0EAD790E" wp14:editId="15C8AA03">
+            <wp:extent cx="5391150" cy="4301490"/>
+            <wp:effectExtent l="0" t="0" r="0" b="3810"/>
+            <wp:docPr id="1751806144" name="Imagen 5"/>
+            <wp:cNvGraphicFramePr>
+              <a:graphicFrameLocks xmlns:a="http://schemas.openxmlformats.org/drawingml/2006/main" noChangeAspect="1"/>
+            </wp:cNvGraphicFramePr>
+            <a:graphic xmlns:a="http://schemas.openxmlformats.org/drawingml/2006/main">
+              <a:graphicData uri="http://schemas.openxmlformats.org/drawingml/2006/picture">
+                <pic:pic xmlns:pic="http://schemas.openxmlformats.org/drawingml/2006/picture">
+                  <pic:nvPicPr>
+                    <pic:cNvPr id="0" name="Picture 9"/>
+                    <pic:cNvPicPr>
+                      <a:picLocks noChangeAspect="1" noChangeArrowheads="1"/>
+                    </pic:cNvPicPr>
+                  </pic:nvPicPr>
+                  <pic:blipFill>
+                    <a:blip r:embed="rId22" cstate="print">
+                      <a:extLst>
+                        <a:ext uri="{28A0092B-C50C-407E-A947-70E740481C1C}">
+                          <a14:useLocalDpi xmlns:a14="http://schemas.microsoft.com/office/drawing/2010/main" val="0"/>
+                        </a:ext>
+                      </a:extLst>
+                    </a:blip>
+                    <a:srcRect/>
+                    <a:stretch>
+                      <a:fillRect/>
+                    </a:stretch>
+                  </pic:blipFill>
+                  <pic:spPr bwMode="auto">
+                    <a:xfrm>
+                      <a:off x="0" y="0"/>
+                      <a:ext cx="5391150" cy="4301490"/>
+                    </a:xfrm>
+                    <a:prstGeom prst="rect">
+                      <a:avLst/>
+                    </a:prstGeom>
+                    <a:noFill/>
+                    <a:ln>
+                      <a:noFill/>
+                    </a:ln>
+                  </pic:spPr>
+                </pic:pic>
+              </a:graphicData>
+            </a:graphic>
+          </wp:inline>
+        </w:drawing>
+      </w:r>
+    </w:p>
+    <w:p>
+      <w:r>
+        <w:rPr>
+          <w:noProof/>
+        </w:rPr>
+        <w:lastRenderedPageBreak/>
+        <w:drawing>
+          <wp:inline distT="0" distB="0" distL="0" distR="0" wp14:anchorId="26D99A5F" wp14:editId="4C87EE2A">
+            <wp:extent cx="5391150" cy="4301490"/>
+            <wp:effectExtent l="0" t="0" r="0" b="3810"/>
+            <wp:docPr id="1993117950" name="Imagen 6"/>
+            <wp:cNvGraphicFramePr>
+              <a:graphicFrameLocks xmlns:a="http://schemas.openxmlformats.org/drawingml/2006/main" noChangeAspect="1"/>
+            </wp:cNvGraphicFramePr>
+            <a:graphic xmlns:a="http://schemas.openxmlformats.org/drawingml/2006/main">
+              <a:graphicData uri="http://schemas.openxmlformats.org/drawingml/2006/picture">
+                <pic:pic xmlns:pic="http://schemas.openxmlformats.org/drawingml/2006/picture">
+                  <pic:nvPicPr>
+                    <pic:cNvPr id="0" name="Picture 10"/>
+                    <pic:cNvPicPr>
+                      <a:picLocks noChangeAspect="1" noChangeArrowheads="1"/>
+                    </pic:cNvPicPr>
+                  </pic:nvPicPr>
+                  <pic:blipFill>
+                    <a:blip r:embed="rId23" cstate="print">
+                      <a:extLst>
+                        <a:ext uri="{28A0092B-C50C-407E-A947-70E740481C1C}">
+                          <a14:useLocalDpi xmlns:a14="http://schemas.microsoft.com/office/drawing/2010/main" val="0"/>
+                        </a:ext>
+                      </a:extLst>
+                    </a:blip>
+                    <a:srcRect/>
+                    <a:stretch>
+                      <a:fillRect/>
+                    </a:stretch>
+                  </pic:blipFill>
+                  <pic:spPr bwMode="auto">
+                    <a:xfrm>
+                      <a:off x="0" y="0"/>
+                      <a:ext cx="5391150" cy="4301490"/>
+                    </a:xfrm>
+                    <a:prstGeom prst="rect">
+                      <a:avLst/>
+                    </a:prstGeom>
+                    <a:noFill/>
+                    <a:ln>
+                      <a:noFill/>
+                    </a:ln>
+                  </pic:spPr>
+                </pic:pic>
+              </a:graphicData>
+            </a:graphic>
+          </wp:inline>
+        </w:drawing>
+      </w:r>
+      <w:r>
+        <w:rPr>
+          <w:noProof/>
+        </w:rPr>
+        <w:drawing>
+          <wp:inline distT="0" distB="0" distL="0" distR="0" wp14:anchorId="08D7B7A7" wp14:editId="2FBEF9F5">
+            <wp:extent cx="5391150" cy="4301490"/>
+            <wp:effectExtent l="0" t="0" r="0" b="3810"/>
+            <wp:docPr id="1547982284" name="Imagen 7"/>
+            <wp:cNvGraphicFramePr>
+              <a:graphicFrameLocks xmlns:a="http://schemas.openxmlformats.org/drawingml/2006/main" noChangeAspect="1"/>
+            </wp:cNvGraphicFramePr>
+            <a:graphic xmlns:a="http://schemas.openxmlformats.org/drawingml/2006/main">
+              <a:graphicData uri="http://schemas.openxmlformats.org/drawingml/2006/picture">
+                <pic:pic xmlns:pic="http://schemas.openxmlformats.org/drawingml/2006/picture">
+                  <pic:nvPicPr>
+                    <pic:cNvPr id="0" name="Picture 11"/>
+                    <pic:cNvPicPr>
+                      <a:picLocks noChangeAspect="1" noChangeArrowheads="1"/>
+                    </pic:cNvPicPr>
+                  </pic:nvPicPr>
+                  <pic:blipFill>
+                    <a:blip r:embed="rId24" cstate="print">
+                      <a:extLst>
+                        <a:ext uri="{28A0092B-C50C-407E-A947-70E740481C1C}">
+                          <a14:useLocalDpi xmlns:a14="http://schemas.microsoft.com/office/drawing/2010/main" val="0"/>
+                        </a:ext>
+                      </a:extLst>
+                    </a:blip>
+                    <a:srcRect/>
+                    <a:stretch>
+                      <a:fillRect/>
+                    </a:stretch>
+                  </pic:blipFill>
+                  <pic:spPr bwMode="auto">
+                    <a:xfrm>
+                      <a:off x="0" y="0"/>
+                      <a:ext cx="5391150" cy="4301490"/>
+                    </a:xfrm>
+                    <a:prstGeom prst="rect">
+                      <a:avLst/>
+                    </a:prstGeom>
+                    <a:noFill/>
+                    <a:ln>
+                      <a:noFill/>
+                    </a:ln>
+                  </pic:spPr>
+                </pic:pic>
+              </a:graphicData>
+            </a:graphic>
+          </wp:inline>
+        </w:drawing>
+      </w:r>
+    </w:p>
     <w:p/>
     <w:p/>
     <w:p/>
     <w:p/>
     <w:p/>
     <w:sectPr>
-      <w:footerReference w:type="default" r:id="rId18"/>
+      <w:footerReference w:type="default" r:id="rId25"/>
       <w:pgSz w:w="11906" w:h="16838"/>
       <w:pgMar w:top="1417" w:right="1701" w:bottom="1417" w:left="1701" w:header="708" w:footer="708" w:gutter="0"/>
       <w:cols w:space="708"/>
@@ -1460,7 +1792,7 @@
 </file>
 
 <file path=word/endnotes.xml><?xml version="1.0" encoding="utf-8"?>
-<w:endnotes xmlns:wpc="http://schemas.microsoft.com/office/word/2010/wordprocessingCanvas" xmlns:cx="http://schemas.microsoft.com/office/drawing/2014/chartex" xmlns:mc="http://schemas.openxmlformats.org/markup-compatibility/2006" xmlns:o="urn:schemas-microsoft-com:office:office" xmlns:r="http://schemas.openxmlformats.org/officeDocument/2006/relationships" xmlns:m="http://schemas.openxmlformats.org/officeDocument/2006/math" xmlns:v="urn:schemas-microsoft-com:vml" xmlns:wp14="http://schemas.microsoft.com/office/word/2010/wordprocessingDrawing" xmlns:wp="http://schemas.openxmlformats.org/drawingml/2006/wordprocessingDrawing" xmlns:w10="urn:schemas-microsoft-com:office:word" xmlns:w="http://schemas.openxmlformats.org/wordprocessingml/2006/main" xmlns:w14="http://schemas.microsoft.com/office/word/2010/wordml" xmlns:w15="http://schemas.microsoft.com/office/word/2012/wordml" xmlns:w16se="http://schemas.microsoft.com/office/word/2015/wordml/symex" xmlns:wpg="http://schemas.microsoft.com/office/word/2010/wordprocessingGroup" xmlns:wpi="http://schemas.microsoft.com/office/word/2010/wordprocessingInk" xmlns:wne="http://schemas.microsoft.com/office/word/2006/wordml" xmlns:wps="http://schemas.microsoft.com/office/word/2010/wordprocessingShape" mc:Ignorable="w14 w15 w16se wp14">
+<w:endnotes xmlns:wpc="http://schemas.microsoft.com/office/word/2010/wordprocessingCanvas" xmlns:cx="http://schemas.microsoft.com/office/drawing/2014/chartex" xmlns:cx1="http://schemas.microsoft.com/office/drawing/2015/9/8/chartex" xmlns:cx2="http://schemas.microsoft.com/office/drawing/2015/10/21/chartex" xmlns:cx3="http://schemas.microsoft.com/office/drawing/2016/5/9/chartex" xmlns:cx4="http://schemas.microsoft.com/office/drawing/2016/5/10/chartex" xmlns:cx5="http://schemas.microsoft.com/office/drawing/2016/5/11/chartex" xmlns:cx6="http://schemas.microsoft.com/office/drawing/2016/5/12/chartex" xmlns:cx7="http://schemas.microsoft.com/office/drawing/2016/5/13/chartex" xmlns:cx8="http://schemas.microsoft.com/office/drawing/2016/5/14/chartex" xmlns:mc="http://schemas.openxmlformats.org/markup-compatibility/2006" xmlns:aink="http://schemas.microsoft.com/office/drawing/2016/ink" xmlns:am3d="http://schemas.microsoft.com/office/drawing/2017/model3d" xmlns:o="urn:schemas-microsoft-com:office:office" xmlns:oel="http://schemas.microsoft.com/office/2019/extlst" xmlns:r="http://schemas.openxmlformats.org/officeDocument/2006/relationships" xmlns:m="http://schemas.openxmlformats.org/officeDocument/2006/math" xmlns:v="urn:schemas-microsoft-com:vml" xmlns:wp14="http://schemas.microsoft.com/office/word/2010/wordprocessingDrawing" xmlns:wp="http://schemas.openxmlformats.org/drawingml/2006/wordprocessingDrawing" xmlns:w10="urn:schemas-microsoft-com:office:word" xmlns:w="http://schemas.openxmlformats.org/wordprocessingml/2006/main" xmlns:w14="http://schemas.microsoft.com/office/word/2010/wordml" xmlns:w15="http://schemas.microsoft.com/office/word/2012/wordml" xmlns:w16cex="http://schemas.microsoft.com/office/word/2018/wordml/cex" xmlns:w16cid="http://schemas.microsoft.com/office/word/2016/wordml/cid" xmlns:w16="http://schemas.microsoft.com/office/word/2018/wordml" xmlns:w16du="http://schemas.microsoft.com/office/word/2023/wordml/word16du" xmlns:w16sdtdh="http://schemas.microsoft.com/office/word/2020/wordml/sdtdatahash" xmlns:w16sdtfl="http://schemas.microsoft.com/office/word/2024/wordml/sdtformatlock" xmlns:w16se="http://schemas.microsoft.com/office/word/2015/wordml/symex" xmlns:wpg="http://schemas.microsoft.com/office/word/2010/wordprocessingGroup" xmlns:wpi="http://schemas.microsoft.com/office/word/2010/wordprocessingInk" xmlns:wne="http://schemas.microsoft.com/office/word/2006/wordml" xmlns:wps="http://schemas.microsoft.com/office/word/2010/wordprocessingShape" mc:Ignorable="w14 w15 w16se w16cid w16 w16cex w16sdtdh w16sdtfl w16du wp14">
   <w:endnote w:type="separator" w:id="-1">
     <w:p>
       <w:pPr>
@@ -1485,7 +1817,7 @@
 </file>
 
 <file path=word/footer1.xml><?xml version="1.0" encoding="utf-8"?>
-<w:ftr xmlns:wpc="http://schemas.microsoft.com/office/word/2010/wordprocessingCanvas" xmlns:cx="http://schemas.microsoft.com/office/drawing/2014/chartex" xmlns:mc="http://schemas.openxmlformats.org/markup-compatibility/2006" xmlns:o="urn:schemas-microsoft-com:office:office" xmlns:r="http://schemas.openxmlformats.org/officeDocument/2006/relationships" xmlns:m="http://schemas.openxmlformats.org/officeDocument/2006/math" xmlns:v="urn:schemas-microsoft-com:vml" xmlns:wp14="http://schemas.microsoft.com/office/word/2010/wordprocessingDrawing" xmlns:wp="http://schemas.openxmlformats.org/drawingml/2006/wordprocessingDrawing" xmlns:w10="urn:schemas-microsoft-com:office:word" xmlns:w="http://schemas.openxmlformats.org/wordprocessingml/2006/main" xmlns:w14="http://schemas.microsoft.com/office/word/2010/wordml" xmlns:w15="http://schemas.microsoft.com/office/word/2012/wordml" xmlns:w16se="http://schemas.microsoft.com/office/word/2015/wordml/symex" xmlns:wpg="http://schemas.microsoft.com/office/word/2010/wordprocessingGroup" xmlns:wpi="http://schemas.microsoft.com/office/word/2010/wordprocessingInk" xmlns:wne="http://schemas.microsoft.com/office/word/2006/wordml" xmlns:wps="http://schemas.microsoft.com/office/word/2010/wordprocessingShape" mc:Ignorable="w14 w15 w16se wp14">
+<w:ftr xmlns:wpc="http://schemas.microsoft.com/office/word/2010/wordprocessingCanvas" xmlns:cx="http://schemas.microsoft.com/office/drawing/2014/chartex" xmlns:cx1="http://schemas.microsoft.com/office/drawing/2015/9/8/chartex" xmlns:cx2="http://schemas.microsoft.com/office/drawing/2015/10/21/chartex" xmlns:cx3="http://schemas.microsoft.com/office/drawing/2016/5/9/chartex" xmlns:cx4="http://schemas.microsoft.com/office/drawing/2016/5/10/chartex" xmlns:cx5="http://schemas.microsoft.com/office/drawing/2016/5/11/chartex" xmlns:cx6="http://schemas.microsoft.com/office/drawing/2016/5/12/chartex" xmlns:cx7="http://schemas.microsoft.com/office/drawing/2016/5/13/chartex" xmlns:cx8="http://schemas.microsoft.com/office/drawing/2016/5/14/chartex" xmlns:mc="http://schemas.openxmlformats.org/markup-compatibility/2006" xmlns:aink="http://schemas.microsoft.com/office/drawing/2016/ink" xmlns:am3d="http://schemas.microsoft.com/office/drawing/2017/model3d" xmlns:o="urn:schemas-microsoft-com:office:office" xmlns:oel="http://schemas.microsoft.com/office/2019/extlst" xmlns:r="http://schemas.openxmlformats.org/officeDocument/2006/relationships" xmlns:m="http://schemas.openxmlformats.org/officeDocument/2006/math" xmlns:v="urn:schemas-microsoft-com:vml" xmlns:wp14="http://schemas.microsoft.com/office/word/2010/wordprocessingDrawing" xmlns:wp="http://schemas.openxmlformats.org/drawingml/2006/wordprocessingDrawing" xmlns:w10="urn:schemas-microsoft-com:office:word" xmlns:w="http://schemas.openxmlformats.org/wordprocessingml/2006/main" xmlns:w14="http://schemas.microsoft.com/office/word/2010/wordml" xmlns:w15="http://schemas.microsoft.com/office/word/2012/wordml" xmlns:w16cex="http://schemas.microsoft.com/office/word/2018/wordml/cex" xmlns:w16cid="http://schemas.microsoft.com/office/word/2016/wordml/cid" xmlns:w16="http://schemas.microsoft.com/office/word/2018/wordml" xmlns:w16du="http://schemas.microsoft.com/office/word/2023/wordml/word16du" xmlns:w16sdtdh="http://schemas.microsoft.com/office/word/2020/wordml/sdtdatahash" xmlns:w16sdtfl="http://schemas.microsoft.com/office/word/2024/wordml/sdtformatlock" xmlns:w16se="http://schemas.microsoft.com/office/word/2015/wordml/symex" xmlns:wpg="http://schemas.microsoft.com/office/word/2010/wordprocessingGroup" xmlns:wpi="http://schemas.microsoft.com/office/word/2010/wordprocessingInk" xmlns:wne="http://schemas.microsoft.com/office/word/2006/wordml" xmlns:wps="http://schemas.microsoft.com/office/word/2010/wordprocessingShape" mc:Ignorable="w14 w15 w16se w16cid w16 w16cex w16sdtdh w16sdtfl w16du wp14">
   <w:p>
     <w:pPr>
       <w:tabs>
@@ -1622,7 +1954,7 @@
 </file>
 
 <file path=word/footnotes.xml><?xml version="1.0" encoding="utf-8"?>
-<w:footnotes xmlns:wpc="http://schemas.microsoft.com/office/word/2010/wordprocessingCanvas" xmlns:cx="http://schemas.microsoft.com/office/drawing/2014/chartex" xmlns:mc="http://schemas.openxmlformats.org/markup-compatibility/2006" xmlns:o="urn:schemas-microsoft-com:office:office" xmlns:r="http://schemas.openxmlformats.org/officeDocument/2006/relationships" xmlns:m="http://schemas.openxmlformats.org/officeDocument/2006/math" xmlns:v="urn:schemas-microsoft-com:vml" xmlns:wp14="http://schemas.microsoft.com/office/word/2010/wordprocessingDrawing" xmlns:wp="http://schemas.openxmlformats.org/drawingml/2006/wordprocessingDrawing" xmlns:w10="urn:schemas-microsoft-com:office:word" xmlns:w="http://schemas.openxmlformats.org/wordprocessingml/2006/main" xmlns:w14="http://schemas.microsoft.com/office/word/2010/wordml" xmlns:w15="http://schemas.microsoft.com/office/word/2012/wordml" xmlns:w16se="http://schemas.microsoft.com/office/word/2015/wordml/symex" xmlns:wpg="http://schemas.microsoft.com/office/word/2010/wordprocessingGroup" xmlns:wpi="http://schemas.microsoft.com/office/word/2010/wordprocessingInk" xmlns:wne="http://schemas.microsoft.com/office/word/2006/wordml" xmlns:wps="http://schemas.microsoft.com/office/word/2010/wordprocessingShape" mc:Ignorable="w14 w15 w16se wp14">
+<w:footnotes xmlns:wpc="http://schemas.microsoft.com/office/word/2010/wordprocessingCanvas" xmlns:cx="http://schemas.microsoft.com/office/drawing/2014/chartex" xmlns:cx1="http://schemas.microsoft.com/office/drawing/2015/9/8/chartex" xmlns:cx2="http://schemas.microsoft.com/office/drawing/2015/10/21/chartex" xmlns:cx3="http://schemas.microsoft.com/office/drawing/2016/5/9/chartex" xmlns:cx4="http://schemas.microsoft.com/office/drawing/2016/5/10/chartex" xmlns:cx5="http://schemas.microsoft.com/office/drawing/2016/5/11/chartex" xmlns:cx6="http://schemas.microsoft.com/office/drawing/2016/5/12/chartex" xmlns:cx7="http://schemas.microsoft.com/office/drawing/2016/5/13/chartex" xmlns:cx8="http://schemas.microsoft.com/office/drawing/2016/5/14/chartex" xmlns:mc="http://schemas.openxmlformats.org/markup-compatibility/2006" xmlns:aink="http://schemas.microsoft.com/office/drawing/2016/ink" xmlns:am3d="http://schemas.microsoft.com/office/drawing/2017/model3d" xmlns:o="urn:schemas-microsoft-com:office:office" xmlns:oel="http://schemas.microsoft.com/office/2019/extlst" xmlns:r="http://schemas.openxmlformats.org/officeDocument/2006/relationships" xmlns:m="http://schemas.openxmlformats.org/officeDocument/2006/math" xmlns:v="urn:schemas-microsoft-com:vml" xmlns:wp14="http://schemas.microsoft.com/office/word/2010/wordprocessingDrawing" xmlns:wp="http://schemas.openxmlformats.org/drawingml/2006/wordprocessingDrawing" xmlns:w10="urn:schemas-microsoft-com:office:word" xmlns:w="http://schemas.openxmlformats.org/wordprocessingml/2006/main" xmlns:w14="http://schemas.microsoft.com/office/word/2010/wordml" xmlns:w15="http://schemas.microsoft.com/office/word/2012/wordml" xmlns:w16cex="http://schemas.microsoft.com/office/word/2018/wordml/cex" xmlns:w16cid="http://schemas.microsoft.com/office/word/2016/wordml/cid" xmlns:w16="http://schemas.microsoft.com/office/word/2018/wordml" xmlns:w16du="http://schemas.microsoft.com/office/word/2023/wordml/word16du" xmlns:w16sdtdh="http://schemas.microsoft.com/office/word/2020/wordml/sdtdatahash" xmlns:w16sdtfl="http://schemas.microsoft.com/office/word/2024/wordml/sdtformatlock" xmlns:w16se="http://schemas.microsoft.com/office/word/2015/wordml/symex" xmlns:wpg="http://schemas.microsoft.com/office/word/2010/wordprocessingGroup" xmlns:wpi="http://schemas.microsoft.com/office/word/2010/wordprocessingInk" xmlns:wne="http://schemas.microsoft.com/office/word/2006/wordml" xmlns:wps="http://schemas.microsoft.com/office/word/2010/wordprocessingShape" mc:Ignorable="w14 w15 w16se w16cid w16 w16cex w16sdtdh w16sdtfl w16du wp14">
   <w:footnote w:type="separator" w:id="-1">
     <w:p>
       <w:pPr>
@@ -1647,7 +1979,7 @@
 </file>
 
 <file path=word/styles.xml><?xml version="1.0" encoding="utf-8"?>
-<w:styles xmlns:mc="http://schemas.openxmlformats.org/markup-compatibility/2006" xmlns:r="http://schemas.openxmlformats.org/officeDocument/2006/relationships" xmlns:w="http://schemas.openxmlformats.org/wordprocessingml/2006/main" xmlns:w14="http://schemas.microsoft.com/office/word/2010/wordml" xmlns:w15="http://schemas.microsoft.com/office/word/2012/wordml" xmlns:w16se="http://schemas.microsoft.com/office/word/2015/wordml/symex" mc:Ignorable="w14 w15 w16se">
+<w:styles xmlns:mc="http://schemas.openxmlformats.org/markup-compatibility/2006" xmlns:r="http://schemas.openxmlformats.org/officeDocument/2006/relationships" xmlns:w="http://schemas.openxmlformats.org/wordprocessingml/2006/main" xmlns:w14="http://schemas.microsoft.com/office/word/2010/wordml" xmlns:w15="http://schemas.microsoft.com/office/word/2012/wordml" xmlns:w16cex="http://schemas.microsoft.com/office/word/2018/wordml/cex" xmlns:w16cid="http://schemas.microsoft.com/office/word/2016/wordml/cid" xmlns:w16="http://schemas.microsoft.com/office/word/2018/wordml" xmlns:w16du="http://schemas.microsoft.com/office/word/2023/wordml/word16du" xmlns:w16sdtdh="http://schemas.microsoft.com/office/word/2020/wordml/sdtdatahash" xmlns:w16sdtfl="http://schemas.microsoft.com/office/word/2024/wordml/sdtformatlock" xmlns:w16se="http://schemas.microsoft.com/office/word/2015/wordml/symex" mc:Ignorable="w14 w15 w16se w16cid w16 w16cex w16sdtdh w16sdtfl w16du">
   <w:docDefaults>
     <w:rPrDefault>
       <w:rPr>
@@ -1663,7 +1995,7 @@
       </w:pPr>
     </w:pPrDefault>
   </w:docDefaults>
-  <w:latentStyles w:defLockedState="0" w:defUIPriority="99" w:defSemiHidden="0" w:defUnhideWhenUsed="0" w:defQFormat="0" w:count="371">
+  <w:latentStyles w:defLockedState="0" w:defUIPriority="99" w:defSemiHidden="0" w:defUnhideWhenUsed="0" w:defQFormat="0" w:count="376">
     <w:lsdException w:name="Normal" w:uiPriority="0" w:qFormat="1"/>
     <w:lsdException w:name="heading 1" w:uiPriority="9" w:qFormat="1"/>
     <w:lsdException w:name="heading 2" w:semiHidden="1" w:uiPriority="9" w:unhideWhenUsed="1" w:qFormat="1"/>
@@ -2035,6 +2367,11 @@
     <w:lsdException w:name="List Table 5 Dark Accent 6" w:uiPriority="50"/>
     <w:lsdException w:name="List Table 6 Colorful Accent 6" w:uiPriority="51"/>
     <w:lsdException w:name="List Table 7 Colorful Accent 6" w:uiPriority="52"/>
+    <w:lsdException w:name="Mention" w:semiHidden="1" w:unhideWhenUsed="1"/>
+    <w:lsdException w:name="Smart Hyperlink" w:semiHidden="1" w:unhideWhenUsed="1"/>
+    <w:lsdException w:name="Hashtag" w:semiHidden="1" w:unhideWhenUsed="1"/>
+    <w:lsdException w:name="Unresolved Mention" w:semiHidden="1" w:unhideWhenUsed="1"/>
+    <w:lsdException w:name="Smart Link" w:semiHidden="1" w:unhideWhenUsed="1"/>
   </w:latentStyles>
   <w:style w:type="paragraph" w:default="1" w:styleId="Normal">
     <w:name w:val="Normal"/>

</xml_diff>

<commit_message>
Reorganize docs, update scripts and images
Remove legacy documentation files, add new analysis images, and refresh analysis scripts/graphics. Deleted several doc/guide files (multiple .md and .txt entries). Added new images under Imagenes/Inciso 2 and graficos-creados (including Sirena1_FFT_Ventanas_0.5s.png) and refreshed many graficos-creados/0.5 PNGs. Updated main.py and src modules (analisis_doppler.py, analizar_item2.py, generar_FFT_temporales.py) and removed src/comparar_metodos_fft.py. Also updated binary deliverables (TP1_2026.pdf, Entregable.docx).
</commit_message>
<xml_diff>
--- a/Entregable.docx
+++ b/Entregable.docx
@@ -1,6 +1,6 @@
 
 <file path=word/document.xml><?xml version="1.0" encoding="utf-8"?>
-<w:document xmlns:wpc="http://schemas.microsoft.com/office/word/2010/wordprocessingCanvas" xmlns:cx="http://schemas.microsoft.com/office/drawing/2014/chartex" xmlns:cx1="http://schemas.microsoft.com/office/drawing/2015/9/8/chartex" xmlns:cx2="http://schemas.microsoft.com/office/drawing/2015/10/21/chartex" xmlns:cx3="http://schemas.microsoft.com/office/drawing/2016/5/9/chartex" xmlns:cx4="http://schemas.microsoft.com/office/drawing/2016/5/10/chartex" xmlns:cx5="http://schemas.microsoft.com/office/drawing/2016/5/11/chartex" xmlns:cx6="http://schemas.microsoft.com/office/drawing/2016/5/12/chartex" xmlns:cx7="http://schemas.microsoft.com/office/drawing/2016/5/13/chartex" xmlns:cx8="http://schemas.microsoft.com/office/drawing/2016/5/14/chartex" xmlns:mc="http://schemas.openxmlformats.org/markup-compatibility/2006" xmlns:aink="http://schemas.microsoft.com/office/drawing/2016/ink" xmlns:am3d="http://schemas.microsoft.com/office/drawing/2017/model3d" xmlns:o="urn:schemas-microsoft-com:office:office" xmlns:oel="http://schemas.microsoft.com/office/2019/extlst" xmlns:r="http://schemas.openxmlformats.org/officeDocument/2006/relationships" xmlns:m="http://schemas.openxmlformats.org/officeDocument/2006/math" xmlns:v="urn:schemas-microsoft-com:vml" xmlns:wp14="http://schemas.microsoft.com/office/word/2010/wordprocessingDrawing" xmlns:wp="http://schemas.openxmlformats.org/drawingml/2006/wordprocessingDrawing" xmlns:w10="urn:schemas-microsoft-com:office:word" xmlns:w="http://schemas.openxmlformats.org/wordprocessingml/2006/main" xmlns:w14="http://schemas.microsoft.com/office/word/2010/wordml" xmlns:w15="http://schemas.microsoft.com/office/word/2012/wordml" xmlns:w16cex="http://schemas.microsoft.com/office/word/2018/wordml/cex" xmlns:w16cid="http://schemas.microsoft.com/office/word/2016/wordml/cid" xmlns:w16="http://schemas.microsoft.com/office/word/2018/wordml" xmlns:w16du="http://schemas.microsoft.com/office/word/2023/wordml/word16du" xmlns:w16sdtdh="http://schemas.microsoft.com/office/word/2020/wordml/sdtdatahash" xmlns:w16sdtfl="http://schemas.microsoft.com/office/word/2024/wordml/sdtformatlock" xmlns:w16se="http://schemas.microsoft.com/office/word/2015/wordml/symex" xmlns:wpg="http://schemas.microsoft.com/office/word/2010/wordprocessingGroup" xmlns:wpi="http://schemas.microsoft.com/office/word/2010/wordprocessingInk" xmlns:wne="http://schemas.microsoft.com/office/word/2006/wordml" xmlns:wps="http://schemas.microsoft.com/office/word/2010/wordprocessingShape" mc:Ignorable="w14 w15 w16se w16cid w16 w16cex w16sdtdh w16sdtfl w16du wp14">
+<w:document xmlns:wpc="http://schemas.microsoft.com/office/word/2010/wordprocessingCanvas" xmlns:cx="http://schemas.microsoft.com/office/drawing/2014/chartex" xmlns:mc="http://schemas.openxmlformats.org/markup-compatibility/2006" xmlns:o="urn:schemas-microsoft-com:office:office" xmlns:r="http://schemas.openxmlformats.org/officeDocument/2006/relationships" xmlns:m="http://schemas.openxmlformats.org/officeDocument/2006/math" xmlns:v="urn:schemas-microsoft-com:vml" xmlns:wp14="http://schemas.microsoft.com/office/word/2010/wordprocessingDrawing" xmlns:wp="http://schemas.openxmlformats.org/drawingml/2006/wordprocessingDrawing" xmlns:w10="urn:schemas-microsoft-com:office:word" xmlns:w="http://schemas.openxmlformats.org/wordprocessingml/2006/main" xmlns:w14="http://schemas.microsoft.com/office/word/2010/wordml" xmlns:w15="http://schemas.microsoft.com/office/word/2012/wordml" xmlns:w16se="http://schemas.microsoft.com/office/word/2015/wordml/symex" xmlns:wpg="http://schemas.microsoft.com/office/word/2010/wordprocessingGroup" xmlns:wpi="http://schemas.microsoft.com/office/word/2010/wordprocessingInk" xmlns:wne="http://schemas.microsoft.com/office/word/2006/wordml" xmlns:wps="http://schemas.microsoft.com/office/word/2010/wordprocessingShape" mc:Ignorable="w14 w15 w16se wp14">
   <w:body>
     <w:p>
       <w:pPr>
@@ -247,7 +247,7 @@
           <w:r>
             <w:fldChar w:fldCharType="separate"/>
           </w:r>
-          <w:hyperlink w:anchor="_Toc226887519" w:history="1">
+          <w:hyperlink w:anchor="_Toc226960429" w:history="1">
             <w:r>
               <w:rPr>
                 <w:rStyle w:val="Hipervnculo"/>
@@ -274,7 +274,7 @@
                 <w:noProof/>
                 <w:webHidden/>
               </w:rPr>
-              <w:instrText xml:space="preserve"> PAGEREF _Toc226887519 \h </w:instrText>
+              <w:instrText xml:space="preserve"> PAGEREF _Toc226960429 \h </w:instrText>
             </w:r>
             <w:r>
               <w:rPr>
@@ -318,7 +318,7 @@
               <w:lang w:eastAsia="es-AR"/>
             </w:rPr>
           </w:pPr>
-          <w:hyperlink w:anchor="_Toc226887520" w:history="1">
+          <w:hyperlink w:anchor="_Toc226960430" w:history="1">
             <w:r>
               <w:rPr>
                 <w:rStyle w:val="Hipervnculo"/>
@@ -345,7 +345,7 @@
                 <w:noProof/>
                 <w:webHidden/>
               </w:rPr>
-              <w:instrText xml:space="preserve"> PAGEREF _Toc226887520 \h </w:instrText>
+              <w:instrText xml:space="preserve"> PAGEREF _Toc226960430 \h </w:instrText>
             </w:r>
             <w:r>
               <w:rPr>
@@ -366,6 +366,241 @@
                 <w:webHidden/>
               </w:rPr>
               <w:t>3</w:t>
+            </w:r>
+            <w:r>
+              <w:rPr>
+                <w:noProof/>
+                <w:webHidden/>
+              </w:rPr>
+              <w:fldChar w:fldCharType="end"/>
+            </w:r>
+          </w:hyperlink>
+        </w:p>
+        <w:p>
+          <w:pPr>
+            <w:pStyle w:val="TDC2"/>
+            <w:tabs>
+              <w:tab w:val="right" w:leader="dot" w:pos="8494"/>
+            </w:tabs>
+            <w:rPr>
+              <w:noProof/>
+            </w:rPr>
+          </w:pPr>
+          <w:hyperlink w:anchor="_Toc226960431" w:history="1">
+            <w:r>
+              <w:rPr>
+                <w:rStyle w:val="Hipervnculo"/>
+                <w:noProof/>
+              </w:rPr>
+              <w:t>Anális</w:t>
+            </w:r>
+            <w:r>
+              <w:rPr>
+                <w:rStyle w:val="Hipervnculo"/>
+                <w:noProof/>
+              </w:rPr>
+              <w:t>i</w:t>
+            </w:r>
+            <w:r>
+              <w:rPr>
+                <w:rStyle w:val="Hipervnculo"/>
+                <w:noProof/>
+              </w:rPr>
+              <w:t>s</w:t>
+            </w:r>
+            <w:r>
+              <w:rPr>
+                <w:rStyle w:val="Hipervnculo"/>
+                <w:noProof/>
+              </w:rPr>
+              <w:t xml:space="preserve"> </w:t>
+            </w:r>
+            <w:r>
+              <w:rPr>
+                <w:rStyle w:val="Hipervnculo"/>
+                <w:noProof/>
+              </w:rPr>
+              <w:t>señal 1:</w:t>
+            </w:r>
+            <w:r>
+              <w:rPr>
+                <w:noProof/>
+                <w:webHidden/>
+              </w:rPr>
+              <w:tab/>
+            </w:r>
+            <w:r>
+              <w:rPr>
+                <w:noProof/>
+                <w:webHidden/>
+              </w:rPr>
+              <w:fldChar w:fldCharType="begin"/>
+            </w:r>
+            <w:r>
+              <w:rPr>
+                <w:noProof/>
+                <w:webHidden/>
+              </w:rPr>
+              <w:instrText xml:space="preserve"> PAGEREF _Toc226960431 \h </w:instrText>
+            </w:r>
+            <w:r>
+              <w:rPr>
+                <w:noProof/>
+                <w:webHidden/>
+              </w:rPr>
+            </w:r>
+            <w:r>
+              <w:rPr>
+                <w:noProof/>
+                <w:webHidden/>
+              </w:rPr>
+              <w:fldChar w:fldCharType="separate"/>
+            </w:r>
+            <w:r>
+              <w:rPr>
+                <w:noProof/>
+                <w:webHidden/>
+              </w:rPr>
+              <w:t>6</w:t>
+            </w:r>
+            <w:r>
+              <w:rPr>
+                <w:noProof/>
+                <w:webHidden/>
+              </w:rPr>
+              <w:fldChar w:fldCharType="end"/>
+            </w:r>
+          </w:hyperlink>
+        </w:p>
+        <w:p>
+          <w:pPr>
+            <w:pStyle w:val="TDC2"/>
+            <w:tabs>
+              <w:tab w:val="right" w:leader="dot" w:pos="8494"/>
+            </w:tabs>
+            <w:rPr>
+              <w:noProof/>
+            </w:rPr>
+          </w:pPr>
+          <w:hyperlink w:anchor="_Toc226960432" w:history="1">
+            <w:r>
+              <w:rPr>
+                <w:rStyle w:val="Hipervnculo"/>
+                <w:noProof/>
+              </w:rPr>
+              <w:t>Análisis señal 2:</w:t>
+            </w:r>
+            <w:r>
+              <w:rPr>
+                <w:noProof/>
+                <w:webHidden/>
+              </w:rPr>
+              <w:tab/>
+            </w:r>
+            <w:r>
+              <w:rPr>
+                <w:noProof/>
+                <w:webHidden/>
+              </w:rPr>
+              <w:fldChar w:fldCharType="begin"/>
+            </w:r>
+            <w:r>
+              <w:rPr>
+                <w:noProof/>
+                <w:webHidden/>
+              </w:rPr>
+              <w:instrText xml:space="preserve"> PAGEREF _Toc226960432 \h </w:instrText>
+            </w:r>
+            <w:r>
+              <w:rPr>
+                <w:noProof/>
+                <w:webHidden/>
+              </w:rPr>
+            </w:r>
+            <w:r>
+              <w:rPr>
+                <w:noProof/>
+                <w:webHidden/>
+              </w:rPr>
+              <w:fldChar w:fldCharType="separate"/>
+            </w:r>
+            <w:r>
+              <w:rPr>
+                <w:noProof/>
+                <w:webHidden/>
+              </w:rPr>
+              <w:t>7</w:t>
+            </w:r>
+            <w:r>
+              <w:rPr>
+                <w:noProof/>
+                <w:webHidden/>
+              </w:rPr>
+              <w:fldChar w:fldCharType="end"/>
+            </w:r>
+          </w:hyperlink>
+        </w:p>
+        <w:p>
+          <w:pPr>
+            <w:pStyle w:val="TDC1"/>
+            <w:tabs>
+              <w:tab w:val="right" w:leader="dot" w:pos="8494"/>
+            </w:tabs>
+            <w:rPr>
+              <w:rFonts w:asciiTheme="minorHAnsi" w:eastAsiaTheme="minorEastAsia" w:hAnsiTheme="minorHAnsi"/>
+              <w:noProof/>
+              <w:sz w:val="22"/>
+              <w:lang w:eastAsia="es-AR"/>
+            </w:rPr>
+          </w:pPr>
+          <w:hyperlink w:anchor="_Toc226960433" w:history="1">
+            <w:r>
+              <w:rPr>
+                <w:rStyle w:val="Hipervnculo"/>
+                <w:noProof/>
+              </w:rPr>
+              <w:t>Inciso 2</w:t>
+            </w:r>
+            <w:r>
+              <w:rPr>
+                <w:noProof/>
+                <w:webHidden/>
+              </w:rPr>
+              <w:tab/>
+            </w:r>
+            <w:r>
+              <w:rPr>
+                <w:noProof/>
+                <w:webHidden/>
+              </w:rPr>
+              <w:fldChar w:fldCharType="begin"/>
+            </w:r>
+            <w:r>
+              <w:rPr>
+                <w:noProof/>
+                <w:webHidden/>
+              </w:rPr>
+              <w:instrText xml:space="preserve"> PAGEREF _Toc226960433 \h </w:instrText>
+            </w:r>
+            <w:r>
+              <w:rPr>
+                <w:noProof/>
+                <w:webHidden/>
+              </w:rPr>
+            </w:r>
+            <w:r>
+              <w:rPr>
+                <w:noProof/>
+                <w:webHidden/>
+              </w:rPr>
+              <w:fldChar w:fldCharType="separate"/>
+            </w:r>
+            <w:r>
+              <w:rPr>
+                <w:noProof/>
+                <w:webHidden/>
+              </w:rPr>
+              <w:t>8</w:t>
             </w:r>
             <w:r>
               <w:rPr>
@@ -398,7 +633,7 @@
       <w:pPr>
         <w:pStyle w:val="Ttulo1"/>
       </w:pPr>
-      <w:bookmarkStart w:id="0" w:name="_Toc226887519"/>
+      <w:bookmarkStart w:id="0" w:name="_Toc226960429"/>
       <w:r>
         <w:lastRenderedPageBreak/>
         <w:t>Introducción</w:t>
@@ -420,7 +655,7 @@
       <w:pPr>
         <w:pStyle w:val="Ttulo1"/>
       </w:pPr>
-      <w:bookmarkStart w:id="1" w:name="_Toc226887520"/>
+      <w:bookmarkStart w:id="1" w:name="_Toc226960430"/>
       <w:r>
         <w:t>Inciso 1</w:t>
       </w:r>
@@ -530,7 +765,7 @@
             <v:path o:extrusionok="f" gradientshapeok="t" o:connecttype="rect"/>
             <o:lock v:ext="edit" aspectratio="t"/>
           </v:shapetype>
-          <v:shape id="_x0000_i1025" type="#_x0000_t75" style="width:437pt;height:225.4pt">
+          <v:shape id="_x0000_i1025" type="#_x0000_t75" style="width:436.7pt;height:225.35pt">
             <v:imagedata r:id="rId8" o:title="Señal_1_ruidosa" croptop="4745f" cropbottom="3269f" cropleft="4145f" cropright="4888f"/>
           </v:shape>
         </w:pict>
@@ -544,14 +779,27 @@
       <w:r>
         <w:t xml:space="preserve">Tabla </w:t>
       </w:r>
-      <w:fldSimple w:instr=" SEQ Tabla \* ARABIC ">
-        <w:r>
-          <w:rPr>
-            <w:noProof/>
-          </w:rPr>
-          <w:t>1</w:t>
-        </w:r>
-      </w:fldSimple>
+      <w:r>
+        <w:fldChar w:fldCharType="begin"/>
+      </w:r>
+      <w:r>
+        <w:instrText xml:space="preserve"> SEQ Tabla \* ARABIC </w:instrText>
+      </w:r>
+      <w:r>
+        <w:fldChar w:fldCharType="separate"/>
+      </w:r>
+      <w:r>
+        <w:rPr>
+          <w:noProof/>
+        </w:rPr>
+        <w:t>1</w:t>
+      </w:r>
+      <w:r>
+        <w:rPr>
+          <w:noProof/>
+        </w:rPr>
+        <w:fldChar w:fldCharType="end"/>
+      </w:r>
       <w:r>
         <w:t xml:space="preserve"> sirena 1 sin ningún filtro</w:t>
       </w:r>
@@ -563,7 +811,7 @@
       <w:r>
         <w:lastRenderedPageBreak/>
         <w:pict w14:anchorId="29715E25">
-          <v:shape id="_x0000_i1026" type="#_x0000_t75" style="width:432.65pt;height:227.9pt">
+          <v:shape id="_x0000_i1026" type="#_x0000_t75" style="width:432.45pt;height:228.15pt">
             <v:imagedata r:id="rId9" o:title="Señal_2_ruidosa" croptop="4730f" cropbottom="2783f" cropleft="4556f" cropright="5226f"/>
           </v:shape>
         </w:pict>
@@ -577,14 +825,27 @@
       <w:r>
         <w:t xml:space="preserve">Tabla </w:t>
       </w:r>
-      <w:fldSimple w:instr=" SEQ Tabla \* ARABIC ">
-        <w:r>
-          <w:rPr>
-            <w:noProof/>
-          </w:rPr>
-          <w:t>2</w:t>
-        </w:r>
-      </w:fldSimple>
+      <w:r>
+        <w:fldChar w:fldCharType="begin"/>
+      </w:r>
+      <w:r>
+        <w:instrText xml:space="preserve"> SEQ Tabla \* ARABIC </w:instrText>
+      </w:r>
+      <w:r>
+        <w:fldChar w:fldCharType="separate"/>
+      </w:r>
+      <w:r>
+        <w:rPr>
+          <w:noProof/>
+        </w:rPr>
+        <w:t>2</w:t>
+      </w:r>
+      <w:r>
+        <w:rPr>
+          <w:noProof/>
+        </w:rPr>
+        <w:fldChar w:fldCharType="end"/>
+      </w:r>
       <w:r>
         <w:t xml:space="preserve"> sirena 2 sin ningún filtro</w:t>
       </w:r>
@@ -633,7 +894,19 @@
     </w:p>
     <w:p>
       <w:r>
-        <w:t>Nosotros en un principio asumimos que el ruido que queremos eliminar que es ambiente varía en distintas frecuencias</w:t>
+        <w:t>Nosotros en un principio asumimos que el ruido que queremos eliminar que es</w:t>
+      </w:r>
+      <w:r>
+        <w:t xml:space="preserve"> de un</w:t>
+      </w:r>
+      <w:r>
+        <w:t xml:space="preserve"> ambiente</w:t>
+      </w:r>
+      <w:r>
+        <w:t xml:space="preserve"> el cual</w:t>
+      </w:r>
+      <w:r>
+        <w:t xml:space="preserve"> varía en distintas frecuencias</w:t>
       </w:r>
       <w:r>
         <w:t xml:space="preserve"> (algunas graves y otras agudas)</w:t>
@@ -690,8 +963,8 @@
       <w:r>
         <w:lastRenderedPageBreak/>
         <w:pict w14:anchorId="5DEE665F">
-          <v:shape id="_x0000_i1027" type="#_x0000_t75" style="width:425.1pt;height:344.95pt">
-            <v:imagedata r:id="rId10" o:title="Sirena1_Original"/>
+          <v:shape id="_x0000_i1027" type="#_x0000_t75" style="width:425pt;height:229.55pt">
+            <v:imagedata r:id="rId10" o:title="Sirena1_Original" croptop="22023f"/>
           </v:shape>
         </w:pict>
       </w:r>
@@ -704,16 +977,35 @@
       <w:r>
         <w:t xml:space="preserve">Tabla </w:t>
       </w:r>
-      <w:fldSimple w:instr=" SEQ Tabla \* ARABIC ">
-        <w:r>
-          <w:rPr>
-            <w:noProof/>
-          </w:rPr>
-          <w:t>3</w:t>
-        </w:r>
-      </w:fldSimple>
-      <w:r>
-        <w:t>: gráficos para la sirena 1</w:t>
+      <w:r>
+        <w:fldChar w:fldCharType="begin"/>
+      </w:r>
+      <w:r>
+        <w:instrText xml:space="preserve"> SEQ Tabla \* ARABIC </w:instrText>
+      </w:r>
+      <w:r>
+        <w:fldChar w:fldCharType="separate"/>
+      </w:r>
+      <w:r>
+        <w:rPr>
+          <w:noProof/>
+        </w:rPr>
+        <w:t>3</w:t>
+      </w:r>
+      <w:r>
+        <w:rPr>
+          <w:noProof/>
+        </w:rPr>
+        <w:fldChar w:fldCharType="end"/>
+      </w:r>
+      <w:r>
+        <w:t>: gráficos</w:t>
+      </w:r>
+      <w:r>
+        <w:t xml:space="preserve"> FFT</w:t>
+      </w:r>
+      <w:r>
+        <w:t xml:space="preserve"> para la sirena 1</w:t>
       </w:r>
     </w:p>
     <w:p>
@@ -726,10 +1018,9 @@
         <w:keepNext/>
       </w:pPr>
       <w:r>
-        <w:lastRenderedPageBreak/>
         <w:pict w14:anchorId="05D94BF5">
-          <v:shape id="_x0000_i1028" type="#_x0000_t75" style="width:425.1pt;height:344.95pt">
-            <v:imagedata r:id="rId11" o:title="Sirena2_Original"/>
+          <v:shape id="_x0000_i1028" type="#_x0000_t75" style="width:425pt;height:230.5pt">
+            <v:imagedata r:id="rId11" o:title="Sirena2_Original" croptop="21757f"/>
           </v:shape>
         </w:pict>
       </w:r>
@@ -742,19 +1033,38 @@
       <w:r>
         <w:t xml:space="preserve">Tabla </w:t>
       </w:r>
-      <w:fldSimple w:instr=" SEQ Tabla \* ARABIC ">
-        <w:r>
-          <w:rPr>
-            <w:noProof/>
-          </w:rPr>
-          <w:t>4</w:t>
-        </w:r>
-      </w:fldSimple>
+      <w:r>
+        <w:fldChar w:fldCharType="begin"/>
+      </w:r>
+      <w:r>
+        <w:instrText xml:space="preserve"> SEQ Tabla \* ARABIC </w:instrText>
+      </w:r>
+      <w:r>
+        <w:fldChar w:fldCharType="separate"/>
+      </w:r>
+      <w:r>
+        <w:rPr>
+          <w:noProof/>
+        </w:rPr>
+        <w:t>4</w:t>
+      </w:r>
+      <w:r>
+        <w:rPr>
+          <w:noProof/>
+        </w:rPr>
+        <w:fldChar w:fldCharType="end"/>
+      </w:r>
       <w:r>
         <w:t>: g</w:t>
       </w:r>
       <w:r>
-        <w:t>ráficos para la sirena 2</w:t>
+        <w:t>ráficos</w:t>
+      </w:r>
+      <w:r>
+        <w:t xml:space="preserve"> FFT</w:t>
+      </w:r>
+      <w:r>
+        <w:t xml:space="preserve"> para la sirena 2</w:t>
       </w:r>
     </w:p>
     <w:p>
@@ -774,41 +1084,16 @@
         <w:t xml:space="preserve"> 1500].</w:t>
       </w:r>
     </w:p>
-    <w:p/>
-    <w:p>
-      <w:r>
-        <w:t>D</w:t>
-      </w:r>
-      <w:r>
-        <w:t>espués de analizar a</w:t>
-      </w:r>
-      <w:r>
-        <w:t>mbos rangos propuestos</w:t>
-      </w:r>
-      <w:r>
-        <w:t xml:space="preserve"> para la sirena 1</w:t>
-      </w:r>
-      <w:r>
-        <w:t xml:space="preserve">, llegamos a la conclusión de que el que </w:t>
-      </w:r>
-      <w:r>
-        <w:t>más</w:t>
-      </w:r>
-      <w:r>
-        <w:t xml:space="preserve"> se asemeja al audio es el de rango [940</w:t>
-      </w:r>
-      <w:r>
-        <w:t xml:space="preserve">, </w:t>
-      </w:r>
-      <w:r>
-        <w:t xml:space="preserve">1050], el segundo rango propuesto podemos ver que </w:t>
-      </w:r>
-      <w:r>
-        <w:t>es principalmente ruido y no representa ninguna señal en particular</w:t>
-      </w:r>
-      <w:r>
-        <w:t>.</w:t>
-      </w:r>
+    <w:p>
+      <w:pPr>
+        <w:pStyle w:val="Ttulo2"/>
+      </w:pPr>
+      <w:bookmarkStart w:id="2" w:name="_Toc226960431"/>
+      <w:r>
+        <w:lastRenderedPageBreak/>
+        <w:t>Análisis señal 1:</w:t>
+      </w:r>
+      <w:bookmarkEnd w:id="2"/>
     </w:p>
     <w:p>
       <w:pPr>
@@ -895,14 +1180,12 @@
       </w:r>
     </w:p>
     <w:p/>
-    <w:p/>
     <w:p>
       <w:r>
         <w:rPr>
           <w:noProof/>
           <w:lang w:eastAsia="es-AR"/>
         </w:rPr>
-        <w:lastRenderedPageBreak/>
         <w:drawing>
           <wp:inline distT="0" distB="0" distL="0" distR="0" wp14:anchorId="36C70F23" wp14:editId="162BC8B0">
             <wp:extent cx="5400040" cy="1486894"/>
@@ -979,45 +1262,44 @@
         <w:t>3300]</w:t>
       </w:r>
     </w:p>
-    <w:p/>
-    <w:p>
-      <w:r>
-        <w:t>En el caso de la sirena 2</w:t>
-      </w:r>
-      <w:r>
-        <w:t>,</w:t>
-      </w:r>
-      <w:r>
-        <w:t xml:space="preserve"> </w:t>
-      </w:r>
-      <w:r>
-        <w:t xml:space="preserve">el rango a analizar es mucho mayor, pero también notamos que había otros máximos locales que podrían indicar que era posible que el rango que buscamos esté adentro de ese rango mayor. Analizando cada </w:t>
+    <w:p>
+      <w:r>
+        <w:t>D</w:t>
+      </w:r>
+      <w:r>
+        <w:t>espués de analizar a</w:t>
+      </w:r>
+      <w:r>
+        <w:t>mbos rangos propuestos para la sirena 1, llegamos a la conclusión de que el que más se asemeja al audio es el de rango [940, 1050], el segundo rango propuesto podemos ver que es principalmente ruido y no representa ninguna señal en particular.</w:t>
+      </w:r>
+    </w:p>
+    <w:p>
+      <w:pPr>
+        <w:pStyle w:val="Ttulo2"/>
+      </w:pPr>
+      <w:bookmarkStart w:id="3" w:name="_Toc226960432"/>
+      <w:r>
+        <w:t>Análisis señal 2:</w:t>
+      </w:r>
+      <w:bookmarkEnd w:id="3"/>
+    </w:p>
+    <w:p>
+      <w:r>
+        <w:t>En el caso de la sirena 2, el rango a analizar es mucho mayor, pero también notamos que había otros máximos locales que podrían indicar que era posible que el rango que buscamos esté adentro de ese rango mayor</w:t>
+      </w:r>
+      <w:r>
+        <w:t xml:space="preserve">, entonces el análisis fue hecho para el rango en su totalidad, pero también en </w:t>
       </w:r>
       <w:proofErr w:type="spellStart"/>
       <w:r>
-        <w:t>subrango</w:t>
+        <w:t>subrangos</w:t>
       </w:r>
       <w:proofErr w:type="spellEnd"/>
       <w:r>
-        <w:t xml:space="preserve">, concluimos que el que más se asemeja al audio es el que se encuentra en </w:t>
-      </w:r>
-      <w:r>
-        <w:rPr>
-          <w:lang w:val="es-ES"/>
-        </w:rPr>
-        <w:t>[1200</w:t>
-      </w:r>
-      <w:r>
-        <w:t xml:space="preserve">, </w:t>
-      </w:r>
-      <w:r>
-        <w:rPr>
-          <w:lang w:val="es-ES"/>
-        </w:rPr>
-        <w:t>1500</w:t>
-      </w:r>
-      <w:r>
-        <w:t>]</w:t>
+        <w:t xml:space="preserve"> que llamaban la atención por </w:t>
+      </w:r>
+      <w:r>
+        <w:t>sus máximos locales</w:t>
       </w:r>
       <w:r>
         <w:t>.</w:t>
@@ -1113,6 +1395,7 @@
           <w:noProof/>
           <w:lang w:eastAsia="es-AR"/>
         </w:rPr>
+        <w:lastRenderedPageBreak/>
         <w:drawing>
           <wp:inline distT="0" distB="0" distL="0" distR="0" wp14:anchorId="2201E902" wp14:editId="7D51C728">
             <wp:extent cx="5400040" cy="1470992"/>
@@ -1189,14 +1472,12 @@
         <w:t>1400]</w:t>
       </w:r>
     </w:p>
-    <w:p/>
     <w:p>
       <w:r>
         <w:rPr>
           <w:noProof/>
           <w:lang w:eastAsia="es-AR"/>
         </w:rPr>
-        <w:lastRenderedPageBreak/>
         <w:drawing>
           <wp:inline distT="0" distB="0" distL="0" distR="0" wp14:anchorId="035238BF" wp14:editId="4A1406B2">
             <wp:extent cx="5400040" cy="1470992"/>
@@ -1355,14 +1636,150 @@
         <w:t>1500]</w:t>
       </w:r>
     </w:p>
-    <w:p/>
+    <w:p>
+      <w:r>
+        <w:t xml:space="preserve">Analizando cada subrango, concluimos que el que más se asemeja al audio es el que se encuentra en </w:t>
+      </w:r>
+      <w:r>
+        <w:rPr>
+          <w:lang w:val="es-ES"/>
+        </w:rPr>
+        <w:t>[1200</w:t>
+      </w:r>
+      <w:r>
+        <w:t xml:space="preserve">, </w:t>
+      </w:r>
+      <w:r>
+        <w:rPr>
+          <w:lang w:val="es-ES"/>
+        </w:rPr>
+        <w:t>1500</w:t>
+      </w:r>
+      <w:r>
+        <w:t>]</w:t>
+      </w:r>
+      <w:r>
+        <w:t>.</w:t>
+      </w:r>
+    </w:p>
     <w:p>
       <w:pPr>
         <w:pStyle w:val="Ttulo1"/>
       </w:pPr>
+      <w:bookmarkStart w:id="4" w:name="_Toc226960433"/>
       <w:r>
         <w:t>Inciso 2</w:t>
       </w:r>
+      <w:bookmarkEnd w:id="4"/>
+    </w:p>
+    <w:p>
+      <w:pPr>
+        <w:rPr>
+          <w:b/>
+        </w:rPr>
+      </w:pPr>
+      <w:r>
+        <w:rPr>
+          <w:b/>
+        </w:rPr>
+        <w:t>“</w:t>
+      </w:r>
+      <w:r>
+        <w:rPr>
+          <w:b/>
+        </w:rPr>
+        <w:t>Realizar una FFT de la sirena 1. Luego compare esa se</w:t>
+      </w:r>
+      <w:r>
+        <w:rPr>
+          <w:b/>
+        </w:rPr>
+        <w:t>ñ</w:t>
+      </w:r>
+      <w:r>
+        <w:rPr>
+          <w:b/>
+        </w:rPr>
+        <w:t>al con una</w:t>
+      </w:r>
+      <w:r>
+        <w:rPr>
+          <w:b/>
+        </w:rPr>
+        <w:t xml:space="preserve"> FFT en ventanas temporales más </w:t>
+      </w:r>
+      <w:r>
+        <w:rPr>
+          <w:b/>
+        </w:rPr>
+        <w:t>pequ</w:t>
+      </w:r>
+      <w:r>
+        <w:rPr>
+          <w:b/>
+        </w:rPr>
+        <w:t>eñ</w:t>
+      </w:r>
+      <w:r>
+        <w:rPr>
+          <w:b/>
+        </w:rPr>
+        <w:t xml:space="preserve">as </w:t>
+      </w:r>
+      <w:r>
+        <w:rPr>
+          <w:b/>
+        </w:rPr>
+        <w:t xml:space="preserve">(de 0.5 segundos). </w:t>
+      </w:r>
+      <w:r>
+        <w:rPr>
+          <w:b/>
+        </w:rPr>
+        <w:t>¿Qué</w:t>
+      </w:r>
+      <w:r>
+        <w:rPr>
+          <w:b/>
+        </w:rPr>
+        <w:t xml:space="preserve"> efecto fí</w:t>
+      </w:r>
+      <w:r>
+        <w:rPr>
+          <w:b/>
+        </w:rPr>
+        <w:t>sico est</w:t>
+      </w:r>
+      <w:r>
+        <w:rPr>
+          <w:b/>
+        </w:rPr>
+        <w:t xml:space="preserve">á </w:t>
+      </w:r>
+      <w:r>
+        <w:rPr>
+          <w:b/>
+        </w:rPr>
+        <w:t>ocurriendo? Calcula</w:t>
+      </w:r>
+      <w:r>
+        <w:rPr>
+          <w:b/>
+        </w:rPr>
+        <w:t xml:space="preserve">r la velocidad de la ambulancia </w:t>
+      </w:r>
+      <w:r>
+        <w:rPr>
+          <w:b/>
+        </w:rPr>
+        <w:t>correspondiente a la sirena 1.</w:t>
+      </w:r>
+      <w:r>
+        <w:rPr>
+          <w:b/>
+        </w:rPr>
+        <w:t>”</w:t>
+      </w:r>
     </w:p>
     <w:p>
       <w:r>
@@ -1373,9 +1790,11 @@
       <w:r>
         <w:rPr>
           <w:noProof/>
-        </w:rPr>
+          <w:lang w:eastAsia="es-AR"/>
+        </w:rPr>
+        <w:lastRenderedPageBreak/>
         <w:drawing>
-          <wp:inline distT="0" distB="0" distL="0" distR="0" wp14:anchorId="6B8C550D" wp14:editId="64090EFC">
+          <wp:inline distT="0" distB="0" distL="0" distR="0" wp14:anchorId="6B8C550D" wp14:editId="581F31EB">
             <wp:extent cx="5396987" cy="2918129"/>
             <wp:effectExtent l="0" t="0" r="0" b="0"/>
             <wp:docPr id="872699206" name="Imagen 1"/>
@@ -1407,7 +1826,7 @@
                   <pic:spPr bwMode="auto">
                     <a:xfrm>
                       <a:off x="0" y="0"/>
-                      <a:ext cx="5398770" cy="2919093"/>
+                      <a:ext cx="5396987" cy="2918129"/>
                     </a:xfrm>
                     <a:prstGeom prst="rect">
                       <a:avLst/>
@@ -1430,30 +1849,1037 @@
       </w:r>
     </w:p>
     <w:p>
+      <w:pPr>
+        <w:pStyle w:val="Descripcin"/>
+        <w:jc w:val="center"/>
+      </w:pPr>
+      <w:r>
+        <w:t>Tabla 1</w:t>
+      </w:r>
+      <w:r>
+        <w:t>1</w:t>
+      </w:r>
+      <w:r>
+        <w:t>: g</w:t>
+      </w:r>
+      <w:r>
+        <w:t>ráfico</w:t>
+      </w:r>
+      <w:r>
+        <w:t>s</w:t>
+      </w:r>
+      <w:r>
+        <w:t xml:space="preserve"> </w:t>
+      </w:r>
+      <w:r>
+        <w:t>FFT para la</w:t>
+      </w:r>
+      <w:r>
+        <w:t xml:space="preserve"> sirena </w:t>
+      </w:r>
+      <w:r>
+        <w:t>1.</w:t>
+      </w:r>
+    </w:p>
+    <w:p>
       <w:r>
         <w:t xml:space="preserve">Luego hicimos un programa el cual genera un FFT cada un intervalo de tiempo que se ingrese por pantalla y al hacer eso y poner como input 0.5, nos </w:t>
       </w:r>
+      <w:r>
+        <w:t>generó</w:t>
+      </w:r>
+      <w:r>
+        <w:t xml:space="preserve"> </w:t>
+      </w:r>
+      <w:r>
+        <w:t>los siguientes 16 gráficos.</w:t>
+      </w:r>
+    </w:p>
+    <w:p>
+      <w:r>
+        <w:rPr>
+          <w:noProof/>
+          <w:lang w:eastAsia="es-AR"/>
+        </w:rPr>
+        <w:pict w14:anchorId="23E30EE8">
+          <v:shape id="_x0000_i1039" type="#_x0000_t75" style="width:428.25pt;height:357.65pt">
+            <v:imagedata r:id="rId19" o:title="COMBO_1_[0.0-1.5]"/>
+          </v:shape>
+        </w:pict>
+      </w:r>
+    </w:p>
+    <w:p>
+      <w:pPr>
+        <w:pStyle w:val="Descripcin"/>
+        <w:jc w:val="center"/>
+      </w:pPr>
+      <w:r>
+        <w:t>Tabla 1</w:t>
+      </w:r>
+      <w:r>
+        <w:t>2</w:t>
+      </w:r>
+      <w:r>
+        <w:t>:</w:t>
+      </w:r>
+      <w:r>
+        <w:t xml:space="preserve"> primeros tres</w:t>
+      </w:r>
+      <w:r>
+        <w:t xml:space="preserve"> g</w:t>
+      </w:r>
+      <w:r>
+        <w:t xml:space="preserve">ráficos </w:t>
+      </w:r>
+      <w:r>
+        <w:t>de intervalos</w:t>
+      </w:r>
+      <w:r>
+        <w:t xml:space="preserve"> sirena </w:t>
+      </w:r>
+      <w:r>
+        <w:t>1</w:t>
+      </w:r>
+    </w:p>
+    <w:p>
+      <w:r>
+        <w:rPr>
+          <w:noProof/>
+          <w:lang w:eastAsia="es-AR"/>
+        </w:rPr>
+        <w:lastRenderedPageBreak/>
+        <w:pict w14:anchorId="641FEB04">
+          <v:shape id="_x0000_i1042" type="#_x0000_t75" style="width:428.25pt;height:331pt">
+            <v:imagedata r:id="rId20" o:title="COMBO_2_[1.5-3.0]"/>
+          </v:shape>
+        </w:pict>
+      </w:r>
+    </w:p>
+    <w:p>
+      <w:r>
+        <w:rPr>
+          <w:noProof/>
+          <w:lang w:eastAsia="es-AR"/>
+        </w:rPr>
+        <w:pict w14:anchorId="4B8EAB87">
+          <v:shape id="_x0000_i1044" type="#_x0000_t75" style="width:428.25pt;height:335.7pt">
+            <v:imagedata r:id="rId21" o:title="COMBO_3_[3.0-4.5]"/>
+          </v:shape>
+        </w:pict>
+      </w:r>
+    </w:p>
+    <w:p>
+      <w:pPr>
+        <w:pStyle w:val="Descripcin"/>
+        <w:jc w:val="center"/>
+      </w:pPr>
+      <w:r>
+        <w:t>Tabla 1</w:t>
+      </w:r>
+      <w:r>
+        <w:t>3</w:t>
+      </w:r>
+      <w:r>
+        <w:t>:</w:t>
+      </w:r>
+      <w:r>
+        <w:t xml:space="preserve"> </w:t>
+      </w:r>
+      <w:r>
+        <w:t>Los 6 intervalos siguientes</w:t>
+      </w:r>
+      <w:r>
+        <w:t xml:space="preserve"> de</w:t>
+      </w:r>
+      <w:r>
+        <w:t xml:space="preserve"> la</w:t>
+      </w:r>
+      <w:r>
+        <w:t xml:space="preserve"> sirena 1</w:t>
+      </w:r>
+    </w:p>
+    <w:p>
+      <w:pPr>
+        <w:rPr>
+          <w:noProof/>
+          <w:lang w:eastAsia="es-AR"/>
+        </w:rPr>
+      </w:pPr>
+      <w:r>
+        <w:rPr>
+          <w:noProof/>
+          <w:lang w:eastAsia="es-AR"/>
+        </w:rPr>
+        <w:lastRenderedPageBreak/>
+        <w:pict w14:anchorId="032CAD07">
+          <v:shape id="_x0000_i1049" type="#_x0000_t75" style="width:428.25pt;height:331pt">
+            <v:imagedata r:id="rId22" o:title="COMBO_4_[4.5-6.0]"/>
+          </v:shape>
+        </w:pict>
+      </w:r>
+    </w:p>
+    <w:p>
+      <w:r>
+        <w:rPr>
+          <w:noProof/>
+          <w:lang w:eastAsia="es-AR"/>
+        </w:rPr>
+        <w:pict w14:anchorId="4B5A85F2">
+          <v:shape id="_x0000_i1051" type="#_x0000_t75" style="width:428.25pt;height:333.35pt">
+            <v:imagedata r:id="rId23" o:title="COMBO_5_[6.0-7.5]"/>
+          </v:shape>
+        </w:pict>
+      </w:r>
+    </w:p>
+    <w:p>
+      <w:pPr>
+        <w:pStyle w:val="Descripcin"/>
+        <w:jc w:val="center"/>
+      </w:pPr>
+      <w:r>
+        <w:t>Tabla 1</w:t>
+      </w:r>
+      <w:r>
+        <w:t>4</w:t>
+      </w:r>
+      <w:r>
+        <w:t>:</w:t>
+      </w:r>
+      <w:r>
+        <w:t xml:space="preserve"> Los</w:t>
+      </w:r>
+      <w:r>
+        <w:t xml:space="preserve"> siguientes</w:t>
+      </w:r>
+      <w:r>
+        <w:t xml:space="preserve"> 6 intervalos </w:t>
+      </w:r>
+      <w:r>
+        <w:t>de</w:t>
+      </w:r>
+      <w:r>
+        <w:t xml:space="preserve"> la sirena 1</w:t>
+      </w:r>
+    </w:p>
+    <w:p>
+      <w:r>
+        <w:rPr>
+          <w:noProof/>
+          <w:lang w:eastAsia="es-AR"/>
+        </w:rPr>
+        <w:lastRenderedPageBreak/>
+        <w:pict w14:anchorId="2F5547F3">
+          <v:shape id="_x0000_i1056" type="#_x0000_t75" style="width:428.25pt;height:120.15pt">
+            <v:imagedata r:id="rId24" o:title="COMBO_6_[7.5-8.0]" cropbottom="43396f"/>
+          </v:shape>
+        </w:pict>
+      </w:r>
+    </w:p>
+    <w:p>
+      <w:pPr>
+        <w:pStyle w:val="Descripcin"/>
+        <w:jc w:val="center"/>
+      </w:pPr>
+      <w:r>
+        <w:t>Tabla 1</w:t>
+      </w:r>
+      <w:r>
+        <w:t>5</w:t>
+      </w:r>
+      <w:r>
+        <w:t>:</w:t>
+      </w:r>
+      <w:r>
+        <w:t xml:space="preserve"> </w:t>
+      </w:r>
+      <w:r>
+        <w:t>último intervalo</w:t>
+      </w:r>
+      <w:r>
+        <w:t xml:space="preserve"> la sirena 1</w:t>
+      </w:r>
+    </w:p>
+    <w:p>
+      <w:r>
+        <w:t xml:space="preserve">Analizando la evolución de la FFT </w:t>
+      </w:r>
+      <w:r>
+        <w:t>podemos ver que la región analizada [940, 1050] comienza durante los primeros intervalos con frecuencias más altas, y que mientras pasan los intervalos va disminuyendo la misma.</w:t>
+      </w:r>
+      <w:r>
+        <w:t xml:space="preserve"> Comparando estas gráficas con la FFT completa, podemos apreciar qué frecuencias tienen más peso durante los distintos intervalos, mientras que la FFT original</w:t>
+      </w:r>
+    </w:p>
+    <w:p>
+      <w:r>
+        <w:t>Esto indica que cuando la ambulancia está lejos, pero acercándose a nuestro micrófono que toma el audio, escuchamos un sonido más agudo, pero luego cuando pasa al micrófono y empieza a alejarse, comienza a escucharse un sonido más grave.</w:t>
+      </w:r>
+    </w:p>
+    <w:p>
+      <w:r>
+        <w:t>El efecto que descri</w:t>
+      </w:r>
+      <w:r>
+        <w:t xml:space="preserve">be el suceso contado arriba es el efecto </w:t>
+      </w:r>
       <w:proofErr w:type="spellStart"/>
       <w:r>
-        <w:t>generolos</w:t>
+        <w:t>Doppler</w:t>
       </w:r>
       <w:proofErr w:type="spellEnd"/>
       <w:r>
-        <w:t xml:space="preserve"> siguientes 16 gráficos.</w:t>
-      </w:r>
-    </w:p>
-    <w:p/>
-    <w:p>
-      <w:r>
-        <w:rPr>
+        <w:t>, el cual indica que cuando una fuente de sonido se acerca, la longitud de onda percibida disminuye porque la fuente va generando el sonido mientras se acerca</w:t>
+      </w:r>
+      <w:r>
+        <w:t xml:space="preserve"> al receptor</w:t>
+      </w:r>
+      <w:r>
+        <w:t>, lo cual hace parecer que su frecuencia sea mayor. Una vez que este emisor llega a la altura del micrófono, durante un instante, la frecuencia recibida es la misma que la emitida, pero luego el efecto que sucede</w:t>
+      </w:r>
+      <w:r>
+        <w:t xml:space="preserve"> es opuesto al primero, donde al alejarse, su longitud de onda aumenta, lo que hace parecer que su frecuencia disminuye. Este efecto sigue una fórmula matemática que indica la relación entre velocidad</w:t>
+      </w:r>
+      <w:r>
+        <w:t xml:space="preserve">es </w:t>
+      </w:r>
+      <w:r>
+        <w:t>y</w:t>
+      </w:r>
+      <w:r>
+        <w:t xml:space="preserve"> frecuencia</w:t>
+      </w:r>
+      <w:r>
+        <w:t>s reales y percibidas, el c</w:t>
+      </w:r>
+      <w:r>
+        <w:t>ual es</w:t>
+      </w:r>
+      <w:r>
+        <w:t>:</w:t>
+      </w:r>
+    </w:p>
+    <w:p>
+      <w:pPr>
+        <w:jc w:val="center"/>
+        <w:rPr>
+          <w:rFonts w:eastAsiaTheme="minorEastAsia"/>
+          <w:sz w:val="24"/>
+          <w:szCs w:val="24"/>
+        </w:rPr>
+      </w:pPr>
+      <m:oMathPara>
+        <m:oMath>
+          <m:r>
+            <w:rPr>
+              <w:rFonts w:ascii="Cambria Math" w:hAnsi="Cambria Math"/>
+              <w:sz w:val="24"/>
+              <w:szCs w:val="24"/>
+            </w:rPr>
+            <m:t>f</m:t>
+          </m:r>
+          <m:r>
+            <w:rPr>
+              <w:rFonts w:ascii="Cambria Math" w:hAnsi="Cambria Math"/>
+              <w:sz w:val="24"/>
+              <w:szCs w:val="24"/>
+            </w:rPr>
+            <m:t>=</m:t>
+          </m:r>
+          <m:d>
+            <m:dPr>
+              <m:ctrlPr>
+                <w:rPr>
+                  <w:rFonts w:ascii="Cambria Math" w:hAnsi="Cambria Math"/>
+                  <w:i/>
+                  <w:sz w:val="24"/>
+                  <w:szCs w:val="24"/>
+                </w:rPr>
+              </m:ctrlPr>
+            </m:dPr>
+            <m:e>
+              <m:f>
+                <m:fPr>
+                  <m:ctrlPr>
+                    <w:rPr>
+                      <w:rFonts w:ascii="Cambria Math" w:hAnsi="Cambria Math"/>
+                      <w:i/>
+                      <w:sz w:val="24"/>
+                      <w:szCs w:val="24"/>
+                    </w:rPr>
+                  </m:ctrlPr>
+                </m:fPr>
+                <m:num>
+                  <m:r>
+                    <w:rPr>
+                      <w:rFonts w:ascii="Cambria Math" w:hAnsi="Cambria Math"/>
+                      <w:sz w:val="24"/>
+                      <w:szCs w:val="24"/>
+                    </w:rPr>
+                    <m:t>v</m:t>
+                  </m:r>
+                  <m:r>
+                    <w:rPr>
+                      <w:rFonts w:ascii="Cambria Math" w:hAnsi="Cambria Math"/>
+                      <w:sz w:val="24"/>
+                      <w:szCs w:val="24"/>
+                    </w:rPr>
+                    <m:t>±</m:t>
+                  </m:r>
+                  <m:sSub>
+                    <m:sSubPr>
+                      <m:ctrlPr>
+                        <w:rPr>
+                          <w:rFonts w:ascii="Cambria Math" w:hAnsi="Cambria Math"/>
+                          <w:i/>
+                          <w:sz w:val="24"/>
+                          <w:szCs w:val="24"/>
+                        </w:rPr>
+                      </m:ctrlPr>
+                    </m:sSubPr>
+                    <m:e>
+                      <m:r>
+                        <w:rPr>
+                          <w:rFonts w:ascii="Cambria Math" w:hAnsi="Cambria Math"/>
+                          <w:sz w:val="24"/>
+                          <w:szCs w:val="24"/>
+                        </w:rPr>
+                        <m:t>v</m:t>
+                      </m:r>
+                    </m:e>
+                    <m:sub>
+                      <m:r>
+                        <w:rPr>
+                          <w:rFonts w:ascii="Cambria Math" w:hAnsi="Cambria Math"/>
+                          <w:sz w:val="24"/>
+                          <w:szCs w:val="24"/>
+                        </w:rPr>
+                        <m:t>r</m:t>
+                      </m:r>
+                    </m:sub>
+                  </m:sSub>
+                </m:num>
+                <m:den>
+                  <m:r>
+                    <w:rPr>
+                      <w:rFonts w:ascii="Cambria Math" w:hAnsi="Cambria Math"/>
+                      <w:sz w:val="24"/>
+                      <w:szCs w:val="24"/>
+                    </w:rPr>
+                    <m:t>v</m:t>
+                  </m:r>
+                  <m:r>
+                    <w:rPr>
+                      <w:rFonts w:ascii="Cambria Math" w:hAnsi="Cambria Math"/>
+                      <w:sz w:val="24"/>
+                      <w:szCs w:val="24"/>
+                    </w:rPr>
+                    <m:t>±</m:t>
+                  </m:r>
+                  <m:sSub>
+                    <m:sSubPr>
+                      <m:ctrlPr>
+                        <w:rPr>
+                          <w:rFonts w:ascii="Cambria Math" w:hAnsi="Cambria Math"/>
+                          <w:i/>
+                          <w:sz w:val="24"/>
+                          <w:szCs w:val="24"/>
+                        </w:rPr>
+                      </m:ctrlPr>
+                    </m:sSubPr>
+                    <m:e>
+                      <m:r>
+                        <w:rPr>
+                          <w:rFonts w:ascii="Cambria Math" w:hAnsi="Cambria Math"/>
+                          <w:sz w:val="24"/>
+                          <w:szCs w:val="24"/>
+                        </w:rPr>
+                        <m:t>v</m:t>
+                      </m:r>
+                    </m:e>
+                    <m:sub>
+                      <m:r>
+                        <w:rPr>
+                          <w:rFonts w:ascii="Cambria Math" w:hAnsi="Cambria Math"/>
+                          <w:sz w:val="24"/>
+                          <w:szCs w:val="24"/>
+                        </w:rPr>
+                        <m:t>s</m:t>
+                      </m:r>
+                    </m:sub>
+                  </m:sSub>
+                </m:den>
+              </m:f>
+            </m:e>
+          </m:d>
+          <m:r>
+            <w:rPr>
+              <w:rFonts w:ascii="Cambria Math" w:hAnsi="Cambria Math"/>
+              <w:sz w:val="24"/>
+              <w:szCs w:val="24"/>
+            </w:rPr>
+            <m:t>.</m:t>
+          </m:r>
+          <m:sSub>
+            <m:sSubPr>
+              <m:ctrlPr>
+                <w:rPr>
+                  <w:rFonts w:ascii="Cambria Math" w:hAnsi="Cambria Math"/>
+                  <w:i/>
+                  <w:sz w:val="24"/>
+                  <w:szCs w:val="24"/>
+                </w:rPr>
+              </m:ctrlPr>
+            </m:sSubPr>
+            <m:e>
+              <m:r>
+                <w:rPr>
+                  <w:rFonts w:ascii="Cambria Math" w:hAnsi="Cambria Math"/>
+                  <w:sz w:val="24"/>
+                  <w:szCs w:val="24"/>
+                </w:rPr>
+                <m:t>f</m:t>
+              </m:r>
+            </m:e>
+            <m:sub>
+              <m:r>
+                <w:rPr>
+                  <w:rFonts w:ascii="Cambria Math" w:hAnsi="Cambria Math"/>
+                  <w:sz w:val="24"/>
+                  <w:szCs w:val="24"/>
+                </w:rPr>
+                <m:t>0</m:t>
+              </m:r>
+            </m:sub>
+          </m:sSub>
+        </m:oMath>
+      </m:oMathPara>
+    </w:p>
+    <w:p>
+      <w:r>
+        <w:t>Dónde</w:t>
+      </w:r>
+      <w:r>
+        <w:t>:</w:t>
+      </w:r>
+      <w:r>
+        <w:t xml:space="preserve"> (</w:t>
+      </w:r>
+      <w:r>
+        <w:rPr>
+          <w:highlight w:val="yellow"/>
+        </w:rPr>
+        <w:t>PONER FUENTE DE FORMULA</w:t>
+      </w:r>
+      <w:r>
+        <w:t xml:space="preserve"> (usé </w:t>
+      </w:r>
+      <w:proofErr w:type="spellStart"/>
+      <w:r>
+        <w:t>wikipedia</w:t>
+      </w:r>
+      <w:proofErr w:type="spellEnd"/>
+      <w:r>
+        <w:t>))</w:t>
+      </w:r>
+    </w:p>
+    <w:p>
+      <w:pPr>
+        <w:rPr>
+          <w:rFonts w:eastAsiaTheme="minorEastAsia"/>
+          <w:sz w:val="24"/>
+          <w:szCs w:val="24"/>
+        </w:rPr>
+      </w:pPr>
+      <m:oMath>
+        <m:r>
+          <w:rPr>
+            <w:rFonts w:ascii="Cambria Math" w:hAnsi="Cambria Math"/>
+            <w:sz w:val="24"/>
+            <w:szCs w:val="24"/>
+          </w:rPr>
+          <m:t>f</m:t>
+        </m:r>
+      </m:oMath>
+      <w:r>
+        <w:rPr>
+          <w:rFonts w:eastAsiaTheme="minorEastAsia"/>
+          <w:szCs w:val="28"/>
+        </w:rPr>
+        <w:t xml:space="preserve">: </w:t>
+      </w:r>
+      <w:r>
+        <w:rPr>
+          <w:rFonts w:eastAsiaTheme="minorEastAsia"/>
+          <w:szCs w:val="28"/>
+        </w:rPr>
+        <w:t>Frecuencia observada</w:t>
+      </w:r>
+      <w:r>
+        <w:rPr>
+          <w:rFonts w:eastAsiaTheme="minorEastAsia"/>
+          <w:szCs w:val="28"/>
+        </w:rPr>
+        <w:t xml:space="preserve"> (</w:t>
+      </w:r>
+      <m:oMath>
+        <m:r>
+          <w:rPr>
+            <w:rFonts w:ascii="Cambria Math" w:eastAsiaTheme="minorEastAsia" w:hAnsi="Cambria Math"/>
+            <w:sz w:val="24"/>
+            <w:szCs w:val="24"/>
+          </w:rPr>
+          <m:t>Hz</m:t>
+        </m:r>
+      </m:oMath>
+      <w:r>
+        <w:rPr>
+          <w:rFonts w:eastAsiaTheme="minorEastAsia"/>
+          <w:szCs w:val="28"/>
+        </w:rPr>
+        <w:t>)</w:t>
+      </w:r>
+    </w:p>
+    <w:p>
+      <w:pPr>
+        <w:rPr>
+          <w:rFonts w:eastAsiaTheme="minorEastAsia"/>
+          <w:szCs w:val="28"/>
+        </w:rPr>
+      </w:pPr>
+      <m:oMath>
+        <m:sSub>
+          <m:sSubPr>
+            <m:ctrlPr>
+              <w:rPr>
+                <w:rFonts w:ascii="Cambria Math" w:eastAsiaTheme="minorEastAsia" w:hAnsi="Cambria Math"/>
+                <w:i/>
+                <w:sz w:val="24"/>
+                <w:szCs w:val="24"/>
+              </w:rPr>
+            </m:ctrlPr>
+          </m:sSubPr>
+          <m:e>
+            <m:r>
+              <w:rPr>
+                <w:rFonts w:ascii="Cambria Math" w:eastAsiaTheme="minorEastAsia" w:hAnsi="Cambria Math"/>
+                <w:sz w:val="24"/>
+                <w:szCs w:val="24"/>
+              </w:rPr>
+              <m:t>f</m:t>
+            </m:r>
+          </m:e>
+          <m:sub>
+            <m:r>
+              <w:rPr>
+                <w:rFonts w:ascii="Cambria Math" w:eastAsiaTheme="minorEastAsia" w:hAnsi="Cambria Math"/>
+                <w:sz w:val="24"/>
+                <w:szCs w:val="24"/>
+              </w:rPr>
+              <m:t>0</m:t>
+            </m:r>
+          </m:sub>
+        </m:sSub>
+      </m:oMath>
+      <w:r>
+        <w:rPr>
+          <w:rFonts w:eastAsiaTheme="minorEastAsia"/>
+          <w:szCs w:val="28"/>
+        </w:rPr>
+        <w:t xml:space="preserve">: </w:t>
+      </w:r>
+      <w:r>
+        <w:rPr>
+          <w:rFonts w:eastAsiaTheme="minorEastAsia"/>
+          <w:szCs w:val="28"/>
+        </w:rPr>
+        <w:t xml:space="preserve">Frecuencia </w:t>
+      </w:r>
+      <w:r>
+        <w:rPr>
+          <w:rFonts w:eastAsiaTheme="minorEastAsia"/>
+          <w:szCs w:val="28"/>
+        </w:rPr>
+        <w:t xml:space="preserve">emitida </w:t>
+      </w:r>
+      <w:r>
+        <w:rPr>
+          <w:rFonts w:eastAsiaTheme="minorEastAsia"/>
+          <w:szCs w:val="28"/>
+        </w:rPr>
+        <w:t>(</w:t>
+      </w:r>
+      <m:oMath>
+        <m:r>
+          <w:rPr>
+            <w:rFonts w:ascii="Cambria Math" w:eastAsiaTheme="minorEastAsia" w:hAnsi="Cambria Math"/>
+            <w:sz w:val="24"/>
+            <w:szCs w:val="24"/>
+          </w:rPr>
+          <m:t>Hz</m:t>
+        </m:r>
+      </m:oMath>
+      <w:r>
+        <w:rPr>
+          <w:rFonts w:eastAsiaTheme="minorEastAsia"/>
+          <w:szCs w:val="28"/>
+        </w:rPr>
+        <w:t>)</w:t>
+      </w:r>
+    </w:p>
+    <w:p>
+      <w:pPr>
+        <w:rPr>
+          <w:rFonts w:eastAsiaTheme="minorEastAsia"/>
+        </w:rPr>
+      </w:pPr>
+      <m:oMath>
+        <m:r>
+          <w:rPr>
+            <w:rFonts w:ascii="Cambria Math" w:hAnsi="Cambria Math"/>
+            <w:sz w:val="24"/>
+            <w:szCs w:val="24"/>
+          </w:rPr>
+          <m:t>v</m:t>
+        </m:r>
+      </m:oMath>
+      <w:r>
+        <w:rPr>
+          <w:rFonts w:eastAsiaTheme="minorEastAsia"/>
+        </w:rPr>
+        <w:t xml:space="preserve">: </w:t>
+      </w:r>
+      <w:r>
+        <w:rPr>
+          <w:rFonts w:eastAsiaTheme="minorEastAsia"/>
+        </w:rPr>
+        <w:t>Velocidad de ondas en el medio</w:t>
+      </w:r>
+      <w:r>
+        <w:rPr>
+          <w:rFonts w:eastAsiaTheme="minorEastAsia"/>
+        </w:rPr>
+        <w:t xml:space="preserve"> (</w:t>
+      </w:r>
+      <m:oMath>
+        <m:r>
+          <w:rPr>
+            <w:rFonts w:ascii="Cambria Math" w:eastAsiaTheme="minorEastAsia" w:hAnsi="Cambria Math"/>
+            <w:sz w:val="24"/>
+            <w:szCs w:val="24"/>
+          </w:rPr>
+          <m:t>m/s</m:t>
+        </m:r>
+      </m:oMath>
+      <w:r>
+        <w:rPr>
+          <w:rFonts w:eastAsiaTheme="minorEastAsia"/>
+        </w:rPr>
+        <w:t>)</w:t>
+      </w:r>
+      <w:r>
+        <w:rPr>
+          <w:rFonts w:eastAsiaTheme="minorEastAsia"/>
+        </w:rPr>
+        <w:t xml:space="preserve"> (usamos la velocidad del sonido en aire seco a 20° que es unos 343 [</w:t>
+      </w:r>
+      <m:oMath>
+        <m:r>
+          <w:rPr>
+            <w:rFonts w:ascii="Cambria Math" w:eastAsiaTheme="minorEastAsia" w:hAnsi="Cambria Math"/>
+            <w:sz w:val="24"/>
+            <w:szCs w:val="24"/>
+          </w:rPr>
+          <m:t>m/s</m:t>
+        </m:r>
+      </m:oMath>
+      <w:r>
+        <w:rPr>
+          <w:rFonts w:eastAsiaTheme="minorEastAsia"/>
+        </w:rPr>
+        <w:t>])</w:t>
+      </w:r>
+    </w:p>
+    <w:p>
+      <w:pPr>
+        <w:rPr>
+          <w:rFonts w:eastAsiaTheme="minorEastAsia"/>
+        </w:rPr>
+      </w:pPr>
+      <m:oMath>
+        <m:sSub>
+          <m:sSubPr>
+            <m:ctrlPr>
+              <w:rPr>
+                <w:rFonts w:ascii="Cambria Math" w:hAnsi="Cambria Math"/>
+                <w:i/>
+                <w:sz w:val="24"/>
+                <w:szCs w:val="24"/>
+              </w:rPr>
+            </m:ctrlPr>
+          </m:sSubPr>
+          <m:e>
+            <m:r>
+              <w:rPr>
+                <w:rFonts w:ascii="Cambria Math" w:hAnsi="Cambria Math"/>
+                <w:sz w:val="24"/>
+                <w:szCs w:val="24"/>
+              </w:rPr>
+              <m:t>v</m:t>
+            </m:r>
+          </m:e>
+          <m:sub>
+            <m:r>
+              <w:rPr>
+                <w:rFonts w:ascii="Cambria Math" w:hAnsi="Cambria Math"/>
+                <w:sz w:val="24"/>
+                <w:szCs w:val="24"/>
+              </w:rPr>
+              <m:t>r</m:t>
+            </m:r>
+          </m:sub>
+        </m:sSub>
+      </m:oMath>
+      <w:r>
+        <w:rPr>
+          <w:rFonts w:eastAsiaTheme="minorEastAsia"/>
+        </w:rPr>
+        <w:t>: Velocidad del receptor (</w:t>
+      </w:r>
+      <m:oMath>
+        <m:r>
+          <w:rPr>
+            <w:rFonts w:ascii="Cambria Math" w:eastAsiaTheme="minorEastAsia" w:hAnsi="Cambria Math"/>
+            <w:sz w:val="24"/>
+            <w:szCs w:val="24"/>
+          </w:rPr>
+          <m:t>m/s</m:t>
+        </m:r>
+      </m:oMath>
+      <w:r>
+        <w:rPr>
+          <w:rFonts w:eastAsiaTheme="minorEastAsia"/>
+        </w:rPr>
+        <w:t>)(</w:t>
+      </w:r>
+      <w:r>
+        <w:rPr>
+          <w:rFonts w:eastAsiaTheme="minorEastAsia"/>
+        </w:rPr>
+        <w:t>en nuestro caso 0</w:t>
+      </w:r>
+      <w:r>
+        <w:rPr>
+          <w:rFonts w:eastAsiaTheme="minorEastAsia"/>
+        </w:rPr>
+        <w:t>)</w:t>
+      </w:r>
+    </w:p>
+    <w:p>
+      <w:pPr>
+        <w:rPr>
+          <w:rFonts w:eastAsiaTheme="minorEastAsia"/>
+        </w:rPr>
+      </w:pPr>
+      <m:oMath>
+        <m:sSub>
+          <m:sSubPr>
+            <m:ctrlPr>
+              <w:rPr>
+                <w:rFonts w:ascii="Cambria Math" w:hAnsi="Cambria Math"/>
+                <w:i/>
+                <w:sz w:val="24"/>
+                <w:szCs w:val="24"/>
+              </w:rPr>
+            </m:ctrlPr>
+          </m:sSubPr>
+          <m:e>
+            <m:r>
+              <w:rPr>
+                <w:rFonts w:ascii="Cambria Math" w:hAnsi="Cambria Math"/>
+                <w:sz w:val="24"/>
+                <w:szCs w:val="24"/>
+              </w:rPr>
+              <m:t>v</m:t>
+            </m:r>
+          </m:e>
+          <m:sub>
+            <m:r>
+              <w:rPr>
+                <w:rFonts w:ascii="Cambria Math" w:hAnsi="Cambria Math"/>
+                <w:sz w:val="24"/>
+                <w:szCs w:val="24"/>
+              </w:rPr>
+              <m:t>s</m:t>
+            </m:r>
+          </m:sub>
+        </m:sSub>
+      </m:oMath>
+      <w:r>
+        <w:rPr>
+          <w:rFonts w:eastAsiaTheme="minorEastAsia"/>
+        </w:rPr>
+        <w:t xml:space="preserve">: Velocidad de </w:t>
+      </w:r>
+      <w:r>
+        <w:rPr>
+          <w:rFonts w:eastAsiaTheme="minorEastAsia"/>
+        </w:rPr>
+        <w:t>la fuente con respecto al medio</w:t>
+      </w:r>
+      <w:r>
+        <w:rPr>
+          <w:rFonts w:eastAsiaTheme="minorEastAsia"/>
+        </w:rPr>
+        <w:t xml:space="preserve"> (</w:t>
+      </w:r>
+      <m:oMath>
+        <m:r>
+          <w:rPr>
+            <w:rFonts w:ascii="Cambria Math" w:eastAsiaTheme="minorEastAsia" w:hAnsi="Cambria Math"/>
+            <w:sz w:val="24"/>
+            <w:szCs w:val="24"/>
+          </w:rPr>
+          <m:t>m/s</m:t>
+        </m:r>
+      </m:oMath>
+      <w:r>
+        <w:rPr>
+          <w:rFonts w:eastAsiaTheme="minorEastAsia"/>
+        </w:rPr>
+        <w:t>)</w:t>
+      </w:r>
+    </w:p>
+    <w:p>
+      <w:pPr>
+        <w:rPr>
+          <w:rFonts w:eastAsiaTheme="minorEastAsia"/>
+        </w:rPr>
+      </w:pPr>
+      <w:r>
+        <w:rPr>
+          <w:rFonts w:eastAsiaTheme="minorEastAsia"/>
+        </w:rPr>
+        <w:lastRenderedPageBreak/>
+        <w:t xml:space="preserve">Luego decidimos hacer un programa que haga el cálculo de la velocidad </w:t>
+      </w:r>
+      <w:r>
+        <w:rPr>
+          <w:rFonts w:eastAsiaTheme="minorEastAsia"/>
+        </w:rPr>
+        <w:t>despejándola de</w:t>
+      </w:r>
+      <w:r>
+        <w:rPr>
+          <w:rFonts w:eastAsiaTheme="minorEastAsia"/>
+        </w:rPr>
+        <w:t xml:space="preserve"> la fórmula del efecto </w:t>
+      </w:r>
+      <w:proofErr w:type="spellStart"/>
+      <w:r>
+        <w:rPr>
+          <w:rFonts w:eastAsiaTheme="minorEastAsia"/>
+        </w:rPr>
+        <w:t>Doppler</w:t>
+      </w:r>
+      <w:proofErr w:type="spellEnd"/>
+      <w:r>
+        <w:rPr>
+          <w:rFonts w:eastAsiaTheme="minorEastAsia"/>
+        </w:rPr>
+        <w:t>, pero como no sabíamos la frecuencia real de la sirena, hicimos que la frecuencia real sea un promedio de todas las frecuencias pico tomadas en todos los intervalos de tiempo que analizamos.</w:t>
+      </w:r>
+      <w:r>
+        <w:rPr>
+          <w:rFonts w:eastAsiaTheme="minorEastAsia"/>
+        </w:rPr>
+        <w:t xml:space="preserve"> También hicimos que el cálculo sea distinto para cuando la frecuencia a analizar sea mayor o menor </w:t>
+      </w:r>
+      <w:r>
+        <w:rPr>
+          <w:rFonts w:eastAsiaTheme="minorEastAsia"/>
+        </w:rPr>
+        <w:t>al promedio</w:t>
+      </w:r>
+      <w:r>
+        <w:rPr>
+          <w:rFonts w:eastAsiaTheme="minorEastAsia"/>
+        </w:rPr>
+        <w:t>, porque esto indicaría que el emisor se está acercando (en caso de ser mayor) o alejando (en caso de ser menor)</w:t>
+      </w:r>
+      <w:r>
+        <w:rPr>
+          <w:rFonts w:eastAsiaTheme="minorEastAsia"/>
+        </w:rPr>
+        <w:t xml:space="preserve"> y esto significa un cambio de un signo en la fórmula. Finalmente hace un promedio de las velocidades mientras se acerca y otro promedio mientras se aleja, para que ya calcule un promedio final entre el promedio al acercarse y el promedio al alejarse. Un ejemplo de output es:</w:t>
+      </w:r>
+    </w:p>
+    <w:p>
+      <w:pPr>
+        <w:jc w:val="center"/>
+        <w:rPr>
+          <w:rFonts w:eastAsiaTheme="minorEastAsia"/>
+        </w:rPr>
+      </w:pPr>
+      <w:r>
+        <w:rPr>
+          <w:rFonts w:eastAsiaTheme="minorEastAsia"/>
+        </w:rPr>
+        <w:pict w14:anchorId="50FFDA21">
+          <v:shape id="_x0000_i1068" type="#_x0000_t75" style="width:230.5pt;height:180.95pt">
+            <v:imagedata r:id="rId25" o:title="Fpico por intervalo"/>
+          </v:shape>
+        </w:pict>
+      </w:r>
+    </w:p>
+    <w:p>
+      <w:pPr>
+        <w:pStyle w:val="Descripcin"/>
+        <w:jc w:val="center"/>
+      </w:pPr>
+      <w:r>
+        <w:t>Output 1</w:t>
+      </w:r>
+      <w:r>
+        <w:t>:</w:t>
+      </w:r>
+      <w:r>
+        <w:t xml:space="preserve"> </w:t>
+      </w:r>
+      <w:r>
+        <w:t>Frecuencia pico para cada intervalo.</w:t>
+      </w:r>
+    </w:p>
+    <w:p>
+      <w:pPr>
+        <w:rPr>
+          <w:rFonts w:eastAsiaTheme="minorEastAsia"/>
+        </w:rPr>
+      </w:pPr>
+      <w:r>
+        <w:rPr>
+          <w:rFonts w:eastAsiaTheme="minorEastAsia"/>
+        </w:rPr>
+        <w:t>Primero busca los picos para cada intervalo.</w:t>
+      </w:r>
+    </w:p>
+    <w:p>
+      <w:pPr>
+        <w:jc w:val="center"/>
+        <w:rPr>
+          <w:rFonts w:eastAsiaTheme="minorEastAsia"/>
+        </w:rPr>
+      </w:pPr>
+      <w:r>
+        <w:rPr>
+          <w:rFonts w:eastAsiaTheme="minorEastAsia"/>
           <w:noProof/>
-        </w:rPr>
-        <w:lastRenderedPageBreak/>
+          <w:lang w:eastAsia="es-AR"/>
+        </w:rPr>
         <w:drawing>
-          <wp:inline distT="0" distB="0" distL="0" distR="0" wp14:anchorId="13A3800B" wp14:editId="0E312371">
-            <wp:extent cx="5391150" cy="4301490"/>
-            <wp:effectExtent l="0" t="0" r="0" b="3810"/>
-            <wp:docPr id="1672723467" name="Imagen 2"/>
+          <wp:inline distT="0" distB="0" distL="0" distR="0" wp14:anchorId="620A079E" wp14:editId="2FFF439B">
+            <wp:extent cx="2725420" cy="492760"/>
+            <wp:effectExtent l="0" t="0" r="0" b="2540"/>
+            <wp:docPr id="5" name="Imagen 5" descr="C:\Users\Pablo\AppData\Local\Microsoft\Windows\INetCache\Content.Word\Fmin,Fmax,Fmedio.png"/>
             <wp:cNvGraphicFramePr>
               <a:graphicFrameLocks xmlns:a="http://schemas.openxmlformats.org/drawingml/2006/main" noChangeAspect="1"/>
             </wp:cNvGraphicFramePr>
@@ -1461,13 +2887,13 @@
               <a:graphicData uri="http://schemas.openxmlformats.org/drawingml/2006/picture">
                 <pic:pic xmlns:pic="http://schemas.openxmlformats.org/drawingml/2006/picture">
                   <pic:nvPicPr>
-                    <pic:cNvPr id="0" name="Picture 6"/>
+                    <pic:cNvPr id="0" name="Picture 48" descr="C:\Users\Pablo\AppData\Local\Microsoft\Windows\INetCache\Content.Word\Fmin,Fmax,Fmedio.png"/>
                     <pic:cNvPicPr>
                       <a:picLocks noChangeAspect="1" noChangeArrowheads="1"/>
                     </pic:cNvPicPr>
                   </pic:nvPicPr>
                   <pic:blipFill>
-                    <a:blip r:embed="rId19" cstate="print">
+                    <a:blip r:embed="rId26">
                       <a:extLst>
                         <a:ext uri="{28A0092B-C50C-407E-A947-70E740481C1C}">
                           <a14:useLocalDpi xmlns:a14="http://schemas.microsoft.com/office/drawing/2010/main" val="0"/>
@@ -1482,7 +2908,7 @@
                   <pic:spPr bwMode="auto">
                     <a:xfrm>
                       <a:off x="0" y="0"/>
-                      <a:ext cx="5391150" cy="4301490"/>
+                      <a:ext cx="2725420" cy="492760"/>
                     </a:xfrm>
                     <a:prstGeom prst="rect">
                       <a:avLst/>
@@ -1500,287 +2926,282 @@
       </w:r>
     </w:p>
     <w:p>
-      <w:r>
-        <w:rPr>
-          <w:noProof/>
-        </w:rPr>
-        <w:drawing>
-          <wp:inline distT="0" distB="0" distL="0" distR="0" wp14:anchorId="640D0B66" wp14:editId="783B18BE">
-            <wp:extent cx="5391150" cy="4301490"/>
-            <wp:effectExtent l="0" t="0" r="0" b="3810"/>
-            <wp:docPr id="1930155823" name="Imagen 3"/>
-            <wp:cNvGraphicFramePr>
-              <a:graphicFrameLocks xmlns:a="http://schemas.openxmlformats.org/drawingml/2006/main" noChangeAspect="1"/>
-            </wp:cNvGraphicFramePr>
-            <a:graphic xmlns:a="http://schemas.openxmlformats.org/drawingml/2006/main">
-              <a:graphicData uri="http://schemas.openxmlformats.org/drawingml/2006/picture">
-                <pic:pic xmlns:pic="http://schemas.openxmlformats.org/drawingml/2006/picture">
-                  <pic:nvPicPr>
-                    <pic:cNvPr id="0" name="Picture 7"/>
-                    <pic:cNvPicPr>
-                      <a:picLocks noChangeAspect="1" noChangeArrowheads="1"/>
-                    </pic:cNvPicPr>
-                  </pic:nvPicPr>
-                  <pic:blipFill>
-                    <a:blip r:embed="rId20" cstate="print">
-                      <a:extLst>
-                        <a:ext uri="{28A0092B-C50C-407E-A947-70E740481C1C}">
-                          <a14:useLocalDpi xmlns:a14="http://schemas.microsoft.com/office/drawing/2010/main" val="0"/>
-                        </a:ext>
-                      </a:extLst>
-                    </a:blip>
-                    <a:srcRect/>
-                    <a:stretch>
-                      <a:fillRect/>
-                    </a:stretch>
-                  </pic:blipFill>
-                  <pic:spPr bwMode="auto">
-                    <a:xfrm>
-                      <a:off x="0" y="0"/>
-                      <a:ext cx="5391150" cy="4301490"/>
-                    </a:xfrm>
-                    <a:prstGeom prst="rect">
-                      <a:avLst/>
-                    </a:prstGeom>
-                    <a:noFill/>
-                    <a:ln>
-                      <a:noFill/>
-                    </a:ln>
-                  </pic:spPr>
-                </pic:pic>
-              </a:graphicData>
-            </a:graphic>
-          </wp:inline>
-        </w:drawing>
-      </w:r>
-    </w:p>
-    <w:p>
-      <w:r>
-        <w:rPr>
-          <w:noProof/>
+      <w:pPr>
+        <w:pStyle w:val="Descripcin"/>
+        <w:jc w:val="center"/>
+      </w:pPr>
+      <w:r>
+        <w:t>O</w:t>
+      </w:r>
+      <w:r>
+        <w:t>utput 2</w:t>
+      </w:r>
+      <w:r>
+        <w:t>:</w:t>
+      </w:r>
+      <w:r>
+        <w:t xml:space="preserve"> </w:t>
+      </w:r>
+      <w:r>
+        <w:t>Frecuencia mínima, máxima y promedio.</w:t>
+      </w:r>
+    </w:p>
+    <w:p>
+      <w:pPr>
+        <w:rPr>
+          <w:rFonts w:eastAsiaTheme="minorEastAsia"/>
+        </w:rPr>
+      </w:pPr>
+      <w:r>
+        <w:rPr>
+          <w:rFonts w:eastAsiaTheme="minorEastAsia"/>
+        </w:rPr>
+        <w:t>Luego busca la mínima, la máxima y finalmente promedia todas las frecuencias.</w:t>
+      </w:r>
+    </w:p>
+    <w:p>
+      <w:pPr>
+        <w:rPr>
+          <w:rFonts w:eastAsiaTheme="minorEastAsia"/>
+        </w:rPr>
+      </w:pPr>
+      <w:r>
+        <w:rPr>
+          <w:rFonts w:eastAsiaTheme="minorEastAsia"/>
+        </w:rPr>
+        <w:pict w14:anchorId="08F07425">
+          <v:shape id="_x0000_i1073" type="#_x0000_t75" style="width:425pt;height:150.1pt">
+            <v:imagedata r:id="rId27" o:title="vel acercamiento" cropbottom="2105f"/>
+          </v:shape>
+        </w:pict>
+      </w:r>
+    </w:p>
+    <w:p>
+      <w:pPr>
+        <w:pStyle w:val="Descripcin"/>
+        <w:jc w:val="center"/>
+      </w:pPr>
+      <w:r>
+        <w:t xml:space="preserve">Output </w:t>
+      </w:r>
+      <w:r>
+        <w:t>3</w:t>
+      </w:r>
+      <w:r>
+        <w:t>:</w:t>
+      </w:r>
+      <w:r>
+        <w:t xml:space="preserve"> </w:t>
+      </w:r>
+      <w:r>
+        <w:t>Velocidades de acercamiento por intervalos</w:t>
+      </w:r>
+      <w:r>
+        <w:t>.</w:t>
+      </w:r>
+    </w:p>
+    <w:p>
+      <w:pPr>
+        <w:rPr>
+          <w:rFonts w:eastAsiaTheme="minorEastAsia"/>
+        </w:rPr>
+      </w:pPr>
+      <w:r>
+        <w:rPr>
+          <w:rFonts w:eastAsiaTheme="minorEastAsia"/>
         </w:rPr>
         <w:lastRenderedPageBreak/>
-        <w:drawing>
-          <wp:inline distT="0" distB="0" distL="0" distR="0" wp14:anchorId="0BA177B5" wp14:editId="4E2EE604">
-            <wp:extent cx="5391150" cy="4301490"/>
-            <wp:effectExtent l="0" t="0" r="0" b="3810"/>
-            <wp:docPr id="1093572848" name="Imagen 4"/>
-            <wp:cNvGraphicFramePr>
-              <a:graphicFrameLocks xmlns:a="http://schemas.openxmlformats.org/drawingml/2006/main" noChangeAspect="1"/>
-            </wp:cNvGraphicFramePr>
-            <a:graphic xmlns:a="http://schemas.openxmlformats.org/drawingml/2006/main">
-              <a:graphicData uri="http://schemas.openxmlformats.org/drawingml/2006/picture">
-                <pic:pic xmlns:pic="http://schemas.openxmlformats.org/drawingml/2006/picture">
-                  <pic:nvPicPr>
-                    <pic:cNvPr id="0" name="Picture 8"/>
-                    <pic:cNvPicPr>
-                      <a:picLocks noChangeAspect="1" noChangeArrowheads="1"/>
-                    </pic:cNvPicPr>
-                  </pic:nvPicPr>
-                  <pic:blipFill>
-                    <a:blip r:embed="rId21" cstate="print">
-                      <a:extLst>
-                        <a:ext uri="{28A0092B-C50C-407E-A947-70E740481C1C}">
-                          <a14:useLocalDpi xmlns:a14="http://schemas.microsoft.com/office/drawing/2010/main" val="0"/>
-                        </a:ext>
-                      </a:extLst>
-                    </a:blip>
-                    <a:srcRect/>
-                    <a:stretch>
-                      <a:fillRect/>
-                    </a:stretch>
-                  </pic:blipFill>
-                  <pic:spPr bwMode="auto">
-                    <a:xfrm>
-                      <a:off x="0" y="0"/>
-                      <a:ext cx="5391150" cy="4301490"/>
-                    </a:xfrm>
-                    <a:prstGeom prst="rect">
-                      <a:avLst/>
-                    </a:prstGeom>
-                    <a:noFill/>
-                    <a:ln>
-                      <a:noFill/>
-                    </a:ln>
-                  </pic:spPr>
-                </pic:pic>
-              </a:graphicData>
-            </a:graphic>
-          </wp:inline>
-        </w:drawing>
-      </w:r>
-    </w:p>
-    <w:p>
-      <w:r>
-        <w:rPr>
-          <w:noProof/>
-        </w:rPr>
-        <w:drawing>
-          <wp:inline distT="0" distB="0" distL="0" distR="0" wp14:anchorId="0EAD790E" wp14:editId="15C8AA03">
-            <wp:extent cx="5391150" cy="4301490"/>
-            <wp:effectExtent l="0" t="0" r="0" b="3810"/>
-            <wp:docPr id="1751806144" name="Imagen 5"/>
-            <wp:cNvGraphicFramePr>
-              <a:graphicFrameLocks xmlns:a="http://schemas.openxmlformats.org/drawingml/2006/main" noChangeAspect="1"/>
-            </wp:cNvGraphicFramePr>
-            <a:graphic xmlns:a="http://schemas.openxmlformats.org/drawingml/2006/main">
-              <a:graphicData uri="http://schemas.openxmlformats.org/drawingml/2006/picture">
-                <pic:pic xmlns:pic="http://schemas.openxmlformats.org/drawingml/2006/picture">
-                  <pic:nvPicPr>
-                    <pic:cNvPr id="0" name="Picture 9"/>
-                    <pic:cNvPicPr>
-                      <a:picLocks noChangeAspect="1" noChangeArrowheads="1"/>
-                    </pic:cNvPicPr>
-                  </pic:nvPicPr>
-                  <pic:blipFill>
-                    <a:blip r:embed="rId22" cstate="print">
-                      <a:extLst>
-                        <a:ext uri="{28A0092B-C50C-407E-A947-70E740481C1C}">
-                          <a14:useLocalDpi xmlns:a14="http://schemas.microsoft.com/office/drawing/2010/main" val="0"/>
-                        </a:ext>
-                      </a:extLst>
-                    </a:blip>
-                    <a:srcRect/>
-                    <a:stretch>
-                      <a:fillRect/>
-                    </a:stretch>
-                  </pic:blipFill>
-                  <pic:spPr bwMode="auto">
-                    <a:xfrm>
-                      <a:off x="0" y="0"/>
-                      <a:ext cx="5391150" cy="4301490"/>
-                    </a:xfrm>
-                    <a:prstGeom prst="rect">
-                      <a:avLst/>
-                    </a:prstGeom>
-                    <a:noFill/>
-                    <a:ln>
-                      <a:noFill/>
-                    </a:ln>
-                  </pic:spPr>
-                </pic:pic>
-              </a:graphicData>
-            </a:graphic>
-          </wp:inline>
-        </w:drawing>
-      </w:r>
-    </w:p>
-    <w:p>
-      <w:r>
-        <w:rPr>
-          <w:noProof/>
-        </w:rPr>
-        <w:lastRenderedPageBreak/>
-        <w:drawing>
-          <wp:inline distT="0" distB="0" distL="0" distR="0" wp14:anchorId="26D99A5F" wp14:editId="4C87EE2A">
-            <wp:extent cx="5391150" cy="4301490"/>
-            <wp:effectExtent l="0" t="0" r="0" b="3810"/>
-            <wp:docPr id="1993117950" name="Imagen 6"/>
-            <wp:cNvGraphicFramePr>
-              <a:graphicFrameLocks xmlns:a="http://schemas.openxmlformats.org/drawingml/2006/main" noChangeAspect="1"/>
-            </wp:cNvGraphicFramePr>
-            <a:graphic xmlns:a="http://schemas.openxmlformats.org/drawingml/2006/main">
-              <a:graphicData uri="http://schemas.openxmlformats.org/drawingml/2006/picture">
-                <pic:pic xmlns:pic="http://schemas.openxmlformats.org/drawingml/2006/picture">
-                  <pic:nvPicPr>
-                    <pic:cNvPr id="0" name="Picture 10"/>
-                    <pic:cNvPicPr>
-                      <a:picLocks noChangeAspect="1" noChangeArrowheads="1"/>
-                    </pic:cNvPicPr>
-                  </pic:nvPicPr>
-                  <pic:blipFill>
-                    <a:blip r:embed="rId23" cstate="print">
-                      <a:extLst>
-                        <a:ext uri="{28A0092B-C50C-407E-A947-70E740481C1C}">
-                          <a14:useLocalDpi xmlns:a14="http://schemas.microsoft.com/office/drawing/2010/main" val="0"/>
-                        </a:ext>
-                      </a:extLst>
-                    </a:blip>
-                    <a:srcRect/>
-                    <a:stretch>
-                      <a:fillRect/>
-                    </a:stretch>
-                  </pic:blipFill>
-                  <pic:spPr bwMode="auto">
-                    <a:xfrm>
-                      <a:off x="0" y="0"/>
-                      <a:ext cx="5391150" cy="4301490"/>
-                    </a:xfrm>
-                    <a:prstGeom prst="rect">
-                      <a:avLst/>
-                    </a:prstGeom>
-                    <a:noFill/>
-                    <a:ln>
-                      <a:noFill/>
-                    </a:ln>
-                  </pic:spPr>
-                </pic:pic>
-              </a:graphicData>
-            </a:graphic>
-          </wp:inline>
-        </w:drawing>
-      </w:r>
-      <w:r>
-        <w:rPr>
-          <w:noProof/>
-        </w:rPr>
-        <w:drawing>
-          <wp:inline distT="0" distB="0" distL="0" distR="0" wp14:anchorId="08D7B7A7" wp14:editId="2FBEF9F5">
-            <wp:extent cx="5391150" cy="4301490"/>
-            <wp:effectExtent l="0" t="0" r="0" b="3810"/>
-            <wp:docPr id="1547982284" name="Imagen 7"/>
-            <wp:cNvGraphicFramePr>
-              <a:graphicFrameLocks xmlns:a="http://schemas.openxmlformats.org/drawingml/2006/main" noChangeAspect="1"/>
-            </wp:cNvGraphicFramePr>
-            <a:graphic xmlns:a="http://schemas.openxmlformats.org/drawingml/2006/main">
-              <a:graphicData uri="http://schemas.openxmlformats.org/drawingml/2006/picture">
-                <pic:pic xmlns:pic="http://schemas.openxmlformats.org/drawingml/2006/picture">
-                  <pic:nvPicPr>
-                    <pic:cNvPr id="0" name="Picture 11"/>
-                    <pic:cNvPicPr>
-                      <a:picLocks noChangeAspect="1" noChangeArrowheads="1"/>
-                    </pic:cNvPicPr>
-                  </pic:nvPicPr>
-                  <pic:blipFill>
-                    <a:blip r:embed="rId24" cstate="print">
-                      <a:extLst>
-                        <a:ext uri="{28A0092B-C50C-407E-A947-70E740481C1C}">
-                          <a14:useLocalDpi xmlns:a14="http://schemas.microsoft.com/office/drawing/2010/main" val="0"/>
-                        </a:ext>
-                      </a:extLst>
-                    </a:blip>
-                    <a:srcRect/>
-                    <a:stretch>
-                      <a:fillRect/>
-                    </a:stretch>
-                  </pic:blipFill>
-                  <pic:spPr bwMode="auto">
-                    <a:xfrm>
-                      <a:off x="0" y="0"/>
-                      <a:ext cx="5391150" cy="4301490"/>
-                    </a:xfrm>
-                    <a:prstGeom prst="rect">
-                      <a:avLst/>
-                    </a:prstGeom>
-                    <a:noFill/>
-                    <a:ln>
-                      <a:noFill/>
-                    </a:ln>
-                  </pic:spPr>
-                </pic:pic>
-              </a:graphicData>
-            </a:graphic>
-          </wp:inline>
-        </w:drawing>
-      </w:r>
-    </w:p>
-    <w:p/>
-    <w:p/>
-    <w:p/>
-    <w:p/>
+        <w:pict w14:anchorId="6107C5EC">
+          <v:shape id="_x0000_i1078" type="#_x0000_t75" style="width:425pt;height:161.3pt">
+            <v:imagedata r:id="rId28" o:title="vel alejamiento"/>
+          </v:shape>
+        </w:pict>
+      </w:r>
+    </w:p>
+    <w:p>
+      <w:pPr>
+        <w:pStyle w:val="Descripcin"/>
+        <w:jc w:val="center"/>
+      </w:pPr>
+      <w:r>
+        <w:t xml:space="preserve">Output </w:t>
+      </w:r>
+      <w:r>
+        <w:t>4</w:t>
+      </w:r>
+      <w:r>
+        <w:t>:</w:t>
+      </w:r>
+      <w:r>
+        <w:t xml:space="preserve"> Velocidades de </w:t>
+      </w:r>
+      <w:r>
+        <w:t>alejamiento</w:t>
+      </w:r>
+      <w:r>
+        <w:t xml:space="preserve"> por intervalos.</w:t>
+      </w:r>
+    </w:p>
+    <w:p>
+      <w:pPr>
+        <w:rPr>
+          <w:rFonts w:eastAsiaTheme="minorEastAsia"/>
+        </w:rPr>
+      </w:pPr>
+      <w:r>
+        <w:rPr>
+          <w:rFonts w:eastAsiaTheme="minorEastAsia"/>
+        </w:rPr>
+        <w:t>Luego calcula las velocidades de acercamient</w:t>
+      </w:r>
+      <w:r>
+        <w:rPr>
+          <w:rFonts w:eastAsiaTheme="minorEastAsia"/>
+        </w:rPr>
+        <w:t>o y alejamiento y las promedia.</w:t>
+      </w:r>
+    </w:p>
+    <w:p>
+      <w:pPr>
+        <w:rPr>
+          <w:rFonts w:eastAsiaTheme="minorEastAsia"/>
+        </w:rPr>
+      </w:pPr>
+      <w:r>
+        <w:rPr>
+          <w:rFonts w:eastAsiaTheme="minorEastAsia"/>
+        </w:rPr>
+        <w:pict w14:anchorId="3660CF6F">
+          <v:shape id="_x0000_i1080" type="#_x0000_t75" style="width:425pt;height:126.7pt">
+            <v:imagedata r:id="rId29" o:title="vel promedio"/>
+          </v:shape>
+        </w:pict>
+      </w:r>
+    </w:p>
+    <w:p>
+      <w:pPr>
+        <w:pStyle w:val="Descripcin"/>
+        <w:jc w:val="center"/>
+      </w:pPr>
+      <w:r>
+        <w:t xml:space="preserve">Output </w:t>
+      </w:r>
+      <w:r>
+        <w:t>5</w:t>
+      </w:r>
+      <w:r>
+        <w:t>:</w:t>
+      </w:r>
+      <w:r>
+        <w:t xml:space="preserve"> Velocidades de alejamiento por intervalos.</w:t>
+      </w:r>
+    </w:p>
+    <w:p>
+      <w:pPr>
+        <w:rPr>
+          <w:rFonts w:eastAsiaTheme="minorEastAsia"/>
+          <w:szCs w:val="24"/>
+        </w:rPr>
+      </w:pPr>
+      <w:r>
+        <w:rPr>
+          <w:rFonts w:eastAsiaTheme="minorEastAsia"/>
+        </w:rPr>
+        <w:t xml:space="preserve">Finalmente calcula el promedio de los promedios para estimar una velocidad final de la ambulancia, siendo este resultado unos 67,42 </w:t>
+      </w:r>
+      <m:oMath>
+        <m:r>
+          <w:rPr>
+            <w:rFonts w:ascii="Cambria Math" w:eastAsiaTheme="minorEastAsia" w:hAnsi="Cambria Math"/>
+            <w:sz w:val="24"/>
+            <w:szCs w:val="24"/>
+          </w:rPr>
+          <m:t>km</m:t>
+        </m:r>
+        <m:r>
+          <w:rPr>
+            <w:rFonts w:ascii="Cambria Math" w:eastAsiaTheme="minorEastAsia" w:hAnsi="Cambria Math"/>
+            <w:sz w:val="24"/>
+            <w:szCs w:val="24"/>
+          </w:rPr>
+          <m:t>/</m:t>
+        </m:r>
+        <m:r>
+          <w:rPr>
+            <w:rFonts w:ascii="Cambria Math" w:eastAsiaTheme="minorEastAsia" w:hAnsi="Cambria Math"/>
+            <w:sz w:val="24"/>
+            <w:szCs w:val="24"/>
+          </w:rPr>
+          <m:t>h</m:t>
+        </m:r>
+      </m:oMath>
+      <w:r>
+        <w:rPr>
+          <w:rFonts w:eastAsiaTheme="minorEastAsia"/>
+          <w:sz w:val="24"/>
+          <w:szCs w:val="24"/>
+        </w:rPr>
+        <w:t xml:space="preserve"> </w:t>
+      </w:r>
+      <w:r>
+        <w:rPr>
+          <w:rFonts w:eastAsiaTheme="minorEastAsia"/>
+          <w:szCs w:val="24"/>
+        </w:rPr>
+        <w:t>(o unos 18,73</w:t>
+      </w:r>
+      <m:oMath>
+        <m:r>
+          <w:rPr>
+            <w:rFonts w:ascii="Cambria Math" w:eastAsiaTheme="minorEastAsia" w:hAnsi="Cambria Math"/>
+            <w:sz w:val="24"/>
+            <w:szCs w:val="24"/>
+          </w:rPr>
+          <m:t xml:space="preserve"> </m:t>
+        </m:r>
+        <m:r>
+          <w:rPr>
+            <w:rFonts w:ascii="Cambria Math" w:eastAsiaTheme="minorEastAsia" w:hAnsi="Cambria Math"/>
+            <w:sz w:val="24"/>
+            <w:szCs w:val="24"/>
+          </w:rPr>
+          <m:t>m/s</m:t>
+        </m:r>
+      </m:oMath>
+      <w:r>
+        <w:rPr>
+          <w:rFonts w:eastAsiaTheme="minorEastAsia"/>
+          <w:szCs w:val="24"/>
+        </w:rPr>
+        <w:t>)</w:t>
+      </w:r>
+      <w:r>
+        <w:rPr>
+          <w:rFonts w:eastAsiaTheme="minorEastAsia"/>
+          <w:szCs w:val="24"/>
+        </w:rPr>
+        <w:t>.</w:t>
+      </w:r>
+      <w:bookmarkStart w:id="5" w:name="_GoBack"/>
+      <w:bookmarkEnd w:id="5"/>
+    </w:p>
+    <w:p>
+      <w:pPr>
+        <w:pStyle w:val="Ttulo1"/>
+        <w:rPr>
+          <w:rFonts w:eastAsiaTheme="minorEastAsia"/>
+        </w:rPr>
+      </w:pPr>
+      <w:r>
+        <w:rPr>
+          <w:rFonts w:eastAsiaTheme="minorEastAsia"/>
+        </w:rPr>
+        <w:t>Inciso 3</w:t>
+      </w:r>
+    </w:p>
     <w:p/>
     <w:sectPr>
-      <w:footerReference w:type="default" r:id="rId25"/>
+      <w:footerReference w:type="default" r:id="rId30"/>
       <w:pgSz w:w="11906" w:h="16838"/>
       <w:pgMar w:top="1417" w:right="1701" w:bottom="1417" w:left="1701" w:header="708" w:footer="708" w:gutter="0"/>
       <w:cols w:space="708"/>
@@ -1792,7 +3213,7 @@
 </file>
 
 <file path=word/endnotes.xml><?xml version="1.0" encoding="utf-8"?>
-<w:endnotes xmlns:wpc="http://schemas.microsoft.com/office/word/2010/wordprocessingCanvas" xmlns:cx="http://schemas.microsoft.com/office/drawing/2014/chartex" xmlns:cx1="http://schemas.microsoft.com/office/drawing/2015/9/8/chartex" xmlns:cx2="http://schemas.microsoft.com/office/drawing/2015/10/21/chartex" xmlns:cx3="http://schemas.microsoft.com/office/drawing/2016/5/9/chartex" xmlns:cx4="http://schemas.microsoft.com/office/drawing/2016/5/10/chartex" xmlns:cx5="http://schemas.microsoft.com/office/drawing/2016/5/11/chartex" xmlns:cx6="http://schemas.microsoft.com/office/drawing/2016/5/12/chartex" xmlns:cx7="http://schemas.microsoft.com/office/drawing/2016/5/13/chartex" xmlns:cx8="http://schemas.microsoft.com/office/drawing/2016/5/14/chartex" xmlns:mc="http://schemas.openxmlformats.org/markup-compatibility/2006" xmlns:aink="http://schemas.microsoft.com/office/drawing/2016/ink" xmlns:am3d="http://schemas.microsoft.com/office/drawing/2017/model3d" xmlns:o="urn:schemas-microsoft-com:office:office" xmlns:oel="http://schemas.microsoft.com/office/2019/extlst" xmlns:r="http://schemas.openxmlformats.org/officeDocument/2006/relationships" xmlns:m="http://schemas.openxmlformats.org/officeDocument/2006/math" xmlns:v="urn:schemas-microsoft-com:vml" xmlns:wp14="http://schemas.microsoft.com/office/word/2010/wordprocessingDrawing" xmlns:wp="http://schemas.openxmlformats.org/drawingml/2006/wordprocessingDrawing" xmlns:w10="urn:schemas-microsoft-com:office:word" xmlns:w="http://schemas.openxmlformats.org/wordprocessingml/2006/main" xmlns:w14="http://schemas.microsoft.com/office/word/2010/wordml" xmlns:w15="http://schemas.microsoft.com/office/word/2012/wordml" xmlns:w16cex="http://schemas.microsoft.com/office/word/2018/wordml/cex" xmlns:w16cid="http://schemas.microsoft.com/office/word/2016/wordml/cid" xmlns:w16="http://schemas.microsoft.com/office/word/2018/wordml" xmlns:w16du="http://schemas.microsoft.com/office/word/2023/wordml/word16du" xmlns:w16sdtdh="http://schemas.microsoft.com/office/word/2020/wordml/sdtdatahash" xmlns:w16sdtfl="http://schemas.microsoft.com/office/word/2024/wordml/sdtformatlock" xmlns:w16se="http://schemas.microsoft.com/office/word/2015/wordml/symex" xmlns:wpg="http://schemas.microsoft.com/office/word/2010/wordprocessingGroup" xmlns:wpi="http://schemas.microsoft.com/office/word/2010/wordprocessingInk" xmlns:wne="http://schemas.microsoft.com/office/word/2006/wordml" xmlns:wps="http://schemas.microsoft.com/office/word/2010/wordprocessingShape" mc:Ignorable="w14 w15 w16se w16cid w16 w16cex w16sdtdh w16sdtfl w16du wp14">
+<w:endnotes xmlns:wpc="http://schemas.microsoft.com/office/word/2010/wordprocessingCanvas" xmlns:cx="http://schemas.microsoft.com/office/drawing/2014/chartex" xmlns:mc="http://schemas.openxmlformats.org/markup-compatibility/2006" xmlns:o="urn:schemas-microsoft-com:office:office" xmlns:r="http://schemas.openxmlformats.org/officeDocument/2006/relationships" xmlns:m="http://schemas.openxmlformats.org/officeDocument/2006/math" xmlns:v="urn:schemas-microsoft-com:vml" xmlns:wp14="http://schemas.microsoft.com/office/word/2010/wordprocessingDrawing" xmlns:wp="http://schemas.openxmlformats.org/drawingml/2006/wordprocessingDrawing" xmlns:w10="urn:schemas-microsoft-com:office:word" xmlns:w="http://schemas.openxmlformats.org/wordprocessingml/2006/main" xmlns:w14="http://schemas.microsoft.com/office/word/2010/wordml" xmlns:w15="http://schemas.microsoft.com/office/word/2012/wordml" xmlns:w16se="http://schemas.microsoft.com/office/word/2015/wordml/symex" xmlns:wpg="http://schemas.microsoft.com/office/word/2010/wordprocessingGroup" xmlns:wpi="http://schemas.microsoft.com/office/word/2010/wordprocessingInk" xmlns:wne="http://schemas.microsoft.com/office/word/2006/wordml" xmlns:wps="http://schemas.microsoft.com/office/word/2010/wordprocessingShape" mc:Ignorable="w14 w15 w16se wp14">
   <w:endnote w:type="separator" w:id="-1">
     <w:p>
       <w:pPr>
@@ -1817,7 +3238,7 @@
 </file>
 
 <file path=word/footer1.xml><?xml version="1.0" encoding="utf-8"?>
-<w:ftr xmlns:wpc="http://schemas.microsoft.com/office/word/2010/wordprocessingCanvas" xmlns:cx="http://schemas.microsoft.com/office/drawing/2014/chartex" xmlns:cx1="http://schemas.microsoft.com/office/drawing/2015/9/8/chartex" xmlns:cx2="http://schemas.microsoft.com/office/drawing/2015/10/21/chartex" xmlns:cx3="http://schemas.microsoft.com/office/drawing/2016/5/9/chartex" xmlns:cx4="http://schemas.microsoft.com/office/drawing/2016/5/10/chartex" xmlns:cx5="http://schemas.microsoft.com/office/drawing/2016/5/11/chartex" xmlns:cx6="http://schemas.microsoft.com/office/drawing/2016/5/12/chartex" xmlns:cx7="http://schemas.microsoft.com/office/drawing/2016/5/13/chartex" xmlns:cx8="http://schemas.microsoft.com/office/drawing/2016/5/14/chartex" xmlns:mc="http://schemas.openxmlformats.org/markup-compatibility/2006" xmlns:aink="http://schemas.microsoft.com/office/drawing/2016/ink" xmlns:am3d="http://schemas.microsoft.com/office/drawing/2017/model3d" xmlns:o="urn:schemas-microsoft-com:office:office" xmlns:oel="http://schemas.microsoft.com/office/2019/extlst" xmlns:r="http://schemas.openxmlformats.org/officeDocument/2006/relationships" xmlns:m="http://schemas.openxmlformats.org/officeDocument/2006/math" xmlns:v="urn:schemas-microsoft-com:vml" xmlns:wp14="http://schemas.microsoft.com/office/word/2010/wordprocessingDrawing" xmlns:wp="http://schemas.openxmlformats.org/drawingml/2006/wordprocessingDrawing" xmlns:w10="urn:schemas-microsoft-com:office:word" xmlns:w="http://schemas.openxmlformats.org/wordprocessingml/2006/main" xmlns:w14="http://schemas.microsoft.com/office/word/2010/wordml" xmlns:w15="http://schemas.microsoft.com/office/word/2012/wordml" xmlns:w16cex="http://schemas.microsoft.com/office/word/2018/wordml/cex" xmlns:w16cid="http://schemas.microsoft.com/office/word/2016/wordml/cid" xmlns:w16="http://schemas.microsoft.com/office/word/2018/wordml" xmlns:w16du="http://schemas.microsoft.com/office/word/2023/wordml/word16du" xmlns:w16sdtdh="http://schemas.microsoft.com/office/word/2020/wordml/sdtdatahash" xmlns:w16sdtfl="http://schemas.microsoft.com/office/word/2024/wordml/sdtformatlock" xmlns:w16se="http://schemas.microsoft.com/office/word/2015/wordml/symex" xmlns:wpg="http://schemas.microsoft.com/office/word/2010/wordprocessingGroup" xmlns:wpi="http://schemas.microsoft.com/office/word/2010/wordprocessingInk" xmlns:wne="http://schemas.microsoft.com/office/word/2006/wordml" xmlns:wps="http://schemas.microsoft.com/office/word/2010/wordprocessingShape" mc:Ignorable="w14 w15 w16se w16cid w16 w16cex w16sdtdh w16sdtfl w16du wp14">
+<w:ftr xmlns:wpc="http://schemas.microsoft.com/office/word/2010/wordprocessingCanvas" xmlns:cx="http://schemas.microsoft.com/office/drawing/2014/chartex" xmlns:mc="http://schemas.openxmlformats.org/markup-compatibility/2006" xmlns:o="urn:schemas-microsoft-com:office:office" xmlns:r="http://schemas.openxmlformats.org/officeDocument/2006/relationships" xmlns:m="http://schemas.openxmlformats.org/officeDocument/2006/math" xmlns:v="urn:schemas-microsoft-com:vml" xmlns:wp14="http://schemas.microsoft.com/office/word/2010/wordprocessingDrawing" xmlns:wp="http://schemas.openxmlformats.org/drawingml/2006/wordprocessingDrawing" xmlns:w10="urn:schemas-microsoft-com:office:word" xmlns:w="http://schemas.openxmlformats.org/wordprocessingml/2006/main" xmlns:w14="http://schemas.microsoft.com/office/word/2010/wordml" xmlns:w15="http://schemas.microsoft.com/office/word/2012/wordml" xmlns:w16se="http://schemas.microsoft.com/office/word/2015/wordml/symex" xmlns:wpg="http://schemas.microsoft.com/office/word/2010/wordprocessingGroup" xmlns:wpi="http://schemas.microsoft.com/office/word/2010/wordprocessingInk" xmlns:wne="http://schemas.microsoft.com/office/word/2006/wordml" xmlns:wps="http://schemas.microsoft.com/office/word/2010/wordprocessingShape" mc:Ignorable="w14 w15 w16se wp14">
   <w:p>
     <w:pPr>
       <w:tabs>
@@ -1883,7 +3304,7 @@
         <w:szCs w:val="24"/>
         <w:lang w:val="es-MX"/>
       </w:rPr>
-      <w:t>8</w:t>
+      <w:t>13</w:t>
     </w:r>
     <w:r>
       <w:rPr>
@@ -1934,7 +3355,7 @@
         <w:szCs w:val="24"/>
         <w:lang w:val="es-MX"/>
       </w:rPr>
-      <w:t>8</w:t>
+      <w:t>13</w:t>
     </w:r>
     <w:r>
       <w:rPr>
@@ -1954,7 +3375,7 @@
 </file>
 
 <file path=word/footnotes.xml><?xml version="1.0" encoding="utf-8"?>
-<w:footnotes xmlns:wpc="http://schemas.microsoft.com/office/word/2010/wordprocessingCanvas" xmlns:cx="http://schemas.microsoft.com/office/drawing/2014/chartex" xmlns:cx1="http://schemas.microsoft.com/office/drawing/2015/9/8/chartex" xmlns:cx2="http://schemas.microsoft.com/office/drawing/2015/10/21/chartex" xmlns:cx3="http://schemas.microsoft.com/office/drawing/2016/5/9/chartex" xmlns:cx4="http://schemas.microsoft.com/office/drawing/2016/5/10/chartex" xmlns:cx5="http://schemas.microsoft.com/office/drawing/2016/5/11/chartex" xmlns:cx6="http://schemas.microsoft.com/office/drawing/2016/5/12/chartex" xmlns:cx7="http://schemas.microsoft.com/office/drawing/2016/5/13/chartex" xmlns:cx8="http://schemas.microsoft.com/office/drawing/2016/5/14/chartex" xmlns:mc="http://schemas.openxmlformats.org/markup-compatibility/2006" xmlns:aink="http://schemas.microsoft.com/office/drawing/2016/ink" xmlns:am3d="http://schemas.microsoft.com/office/drawing/2017/model3d" xmlns:o="urn:schemas-microsoft-com:office:office" xmlns:oel="http://schemas.microsoft.com/office/2019/extlst" xmlns:r="http://schemas.openxmlformats.org/officeDocument/2006/relationships" xmlns:m="http://schemas.openxmlformats.org/officeDocument/2006/math" xmlns:v="urn:schemas-microsoft-com:vml" xmlns:wp14="http://schemas.microsoft.com/office/word/2010/wordprocessingDrawing" xmlns:wp="http://schemas.openxmlformats.org/drawingml/2006/wordprocessingDrawing" xmlns:w10="urn:schemas-microsoft-com:office:word" xmlns:w="http://schemas.openxmlformats.org/wordprocessingml/2006/main" xmlns:w14="http://schemas.microsoft.com/office/word/2010/wordml" xmlns:w15="http://schemas.microsoft.com/office/word/2012/wordml" xmlns:w16cex="http://schemas.microsoft.com/office/word/2018/wordml/cex" xmlns:w16cid="http://schemas.microsoft.com/office/word/2016/wordml/cid" xmlns:w16="http://schemas.microsoft.com/office/word/2018/wordml" xmlns:w16du="http://schemas.microsoft.com/office/word/2023/wordml/word16du" xmlns:w16sdtdh="http://schemas.microsoft.com/office/word/2020/wordml/sdtdatahash" xmlns:w16sdtfl="http://schemas.microsoft.com/office/word/2024/wordml/sdtformatlock" xmlns:w16se="http://schemas.microsoft.com/office/word/2015/wordml/symex" xmlns:wpg="http://schemas.microsoft.com/office/word/2010/wordprocessingGroup" xmlns:wpi="http://schemas.microsoft.com/office/word/2010/wordprocessingInk" xmlns:wne="http://schemas.microsoft.com/office/word/2006/wordml" xmlns:wps="http://schemas.microsoft.com/office/word/2010/wordprocessingShape" mc:Ignorable="w14 w15 w16se w16cid w16 w16cex w16sdtdh w16sdtfl w16du wp14">
+<w:footnotes xmlns:wpc="http://schemas.microsoft.com/office/word/2010/wordprocessingCanvas" xmlns:cx="http://schemas.microsoft.com/office/drawing/2014/chartex" xmlns:mc="http://schemas.openxmlformats.org/markup-compatibility/2006" xmlns:o="urn:schemas-microsoft-com:office:office" xmlns:r="http://schemas.openxmlformats.org/officeDocument/2006/relationships" xmlns:m="http://schemas.openxmlformats.org/officeDocument/2006/math" xmlns:v="urn:schemas-microsoft-com:vml" xmlns:wp14="http://schemas.microsoft.com/office/word/2010/wordprocessingDrawing" xmlns:wp="http://schemas.openxmlformats.org/drawingml/2006/wordprocessingDrawing" xmlns:w10="urn:schemas-microsoft-com:office:word" xmlns:w="http://schemas.openxmlformats.org/wordprocessingml/2006/main" xmlns:w14="http://schemas.microsoft.com/office/word/2010/wordml" xmlns:w15="http://schemas.microsoft.com/office/word/2012/wordml" xmlns:w16se="http://schemas.microsoft.com/office/word/2015/wordml/symex" xmlns:wpg="http://schemas.microsoft.com/office/word/2010/wordprocessingGroup" xmlns:wpi="http://schemas.microsoft.com/office/word/2010/wordprocessingInk" xmlns:wne="http://schemas.microsoft.com/office/word/2006/wordml" xmlns:wps="http://schemas.microsoft.com/office/word/2010/wordprocessingShape" mc:Ignorable="w14 w15 w16se wp14">
   <w:footnote w:type="separator" w:id="-1">
     <w:p>
       <w:pPr>
@@ -1979,7 +3400,7 @@
 </file>
 
 <file path=word/styles.xml><?xml version="1.0" encoding="utf-8"?>
-<w:styles xmlns:mc="http://schemas.openxmlformats.org/markup-compatibility/2006" xmlns:r="http://schemas.openxmlformats.org/officeDocument/2006/relationships" xmlns:w="http://schemas.openxmlformats.org/wordprocessingml/2006/main" xmlns:w14="http://schemas.microsoft.com/office/word/2010/wordml" xmlns:w15="http://schemas.microsoft.com/office/word/2012/wordml" xmlns:w16cex="http://schemas.microsoft.com/office/word/2018/wordml/cex" xmlns:w16cid="http://schemas.microsoft.com/office/word/2016/wordml/cid" xmlns:w16="http://schemas.microsoft.com/office/word/2018/wordml" xmlns:w16du="http://schemas.microsoft.com/office/word/2023/wordml/word16du" xmlns:w16sdtdh="http://schemas.microsoft.com/office/word/2020/wordml/sdtdatahash" xmlns:w16sdtfl="http://schemas.microsoft.com/office/word/2024/wordml/sdtformatlock" xmlns:w16se="http://schemas.microsoft.com/office/word/2015/wordml/symex" mc:Ignorable="w14 w15 w16se w16cid w16 w16cex w16sdtdh w16sdtfl w16du">
+<w:styles xmlns:mc="http://schemas.openxmlformats.org/markup-compatibility/2006" xmlns:r="http://schemas.openxmlformats.org/officeDocument/2006/relationships" xmlns:w="http://schemas.openxmlformats.org/wordprocessingml/2006/main" xmlns:w14="http://schemas.microsoft.com/office/word/2010/wordml" xmlns:w15="http://schemas.microsoft.com/office/word/2012/wordml" xmlns:w16se="http://schemas.microsoft.com/office/word/2015/wordml/symex" mc:Ignorable="w14 w15 w16se">
   <w:docDefaults>
     <w:rPrDefault>
       <w:rPr>
@@ -1995,7 +3416,7 @@
       </w:pPr>
     </w:pPrDefault>
   </w:docDefaults>
-  <w:latentStyles w:defLockedState="0" w:defUIPriority="99" w:defSemiHidden="0" w:defUnhideWhenUsed="0" w:defQFormat="0" w:count="376">
+  <w:latentStyles w:defLockedState="0" w:defUIPriority="99" w:defSemiHidden="0" w:defUnhideWhenUsed="0" w:defQFormat="0" w:count="371">
     <w:lsdException w:name="Normal" w:uiPriority="0" w:qFormat="1"/>
     <w:lsdException w:name="heading 1" w:uiPriority="9" w:qFormat="1"/>
     <w:lsdException w:name="heading 2" w:semiHidden="1" w:uiPriority="9" w:unhideWhenUsed="1" w:qFormat="1"/>
@@ -2367,11 +3788,6 @@
     <w:lsdException w:name="List Table 5 Dark Accent 6" w:uiPriority="50"/>
     <w:lsdException w:name="List Table 6 Colorful Accent 6" w:uiPriority="51"/>
     <w:lsdException w:name="List Table 7 Colorful Accent 6" w:uiPriority="52"/>
-    <w:lsdException w:name="Mention" w:semiHidden="1" w:unhideWhenUsed="1"/>
-    <w:lsdException w:name="Smart Hyperlink" w:semiHidden="1" w:unhideWhenUsed="1"/>
-    <w:lsdException w:name="Hashtag" w:semiHidden="1" w:unhideWhenUsed="1"/>
-    <w:lsdException w:name="Unresolved Mention" w:semiHidden="1" w:unhideWhenUsed="1"/>
-    <w:lsdException w:name="Smart Link" w:semiHidden="1" w:unhideWhenUsed="1"/>
   </w:latentStyles>
   <w:style w:type="paragraph" w:default="1" w:styleId="Normal">
     <w:name w:val="Normal"/>
@@ -2405,6 +3821,28 @@
       <w:color w:val="000000" w:themeColor="text1"/>
       <w:sz w:val="36"/>
       <w:szCs w:val="32"/>
+    </w:rPr>
+  </w:style>
+  <w:style w:type="paragraph" w:styleId="Ttulo2">
+    <w:name w:val="heading 2"/>
+    <w:basedOn w:val="Normal"/>
+    <w:next w:val="Normal"/>
+    <w:link w:val="Ttulo2Car"/>
+    <w:uiPriority w:val="9"/>
+    <w:unhideWhenUsed/>
+    <w:qFormat/>
+    <w:rsid w:val="00797366"/>
+    <w:pPr>
+      <w:keepNext/>
+      <w:keepLines/>
+      <w:spacing w:before="40" w:after="0"/>
+      <w:outlineLvl w:val="1"/>
+    </w:pPr>
+    <w:rPr>
+      <w:rFonts w:eastAsiaTheme="majorEastAsia" w:cstheme="majorBidi"/>
+      <w:color w:val="000000" w:themeColor="text1"/>
+      <w:sz w:val="32"/>
+      <w:szCs w:val="26"/>
     </w:rPr>
   </w:style>
   <w:style w:type="character" w:default="1" w:styleId="Fuentedeprrafopredeter">
@@ -2580,7 +4018,605 @@
       <w:lang w:eastAsia="es-AR"/>
     </w:rPr>
   </w:style>
+  <w:style w:type="character" w:customStyle="1" w:styleId="Ttulo2Car">
+    <w:name w:val="Título 2 Car"/>
+    <w:basedOn w:val="Fuentedeprrafopredeter"/>
+    <w:link w:val="Ttulo2"/>
+    <w:uiPriority w:val="9"/>
+    <w:rsid w:val="00797366"/>
+    <w:rPr>
+      <w:rFonts w:ascii="Garamond" w:eastAsiaTheme="majorEastAsia" w:hAnsi="Garamond" w:cstheme="majorBidi"/>
+      <w:color w:val="000000" w:themeColor="text1"/>
+      <w:sz w:val="32"/>
+      <w:szCs w:val="26"/>
+    </w:rPr>
+  </w:style>
+  <w:style w:type="paragraph" w:styleId="TDC2">
+    <w:name w:val="toc 2"/>
+    <w:basedOn w:val="Normal"/>
+    <w:next w:val="Normal"/>
+    <w:autoRedefine/>
+    <w:uiPriority w:val="39"/>
+    <w:unhideWhenUsed/>
+    <w:rsid w:val="005D7500"/>
+    <w:pPr>
+      <w:spacing w:after="100"/>
+      <w:ind w:left="280"/>
+    </w:pPr>
+  </w:style>
+  <w:style w:type="paragraph" w:styleId="Textodeglobo">
+    <w:name w:val="Balloon Text"/>
+    <w:basedOn w:val="Normal"/>
+    <w:link w:val="TextodegloboCar"/>
+    <w:uiPriority w:val="99"/>
+    <w:semiHidden/>
+    <w:unhideWhenUsed/>
+    <w:rsid w:val="00D76A29"/>
+    <w:pPr>
+      <w:spacing w:after="0" w:line="240" w:lineRule="auto"/>
+    </w:pPr>
+    <w:rPr>
+      <w:rFonts w:ascii="Segoe UI" w:hAnsi="Segoe UI" w:cs="Segoe UI"/>
+      <w:sz w:val="18"/>
+      <w:szCs w:val="18"/>
+    </w:rPr>
+  </w:style>
+  <w:style w:type="character" w:customStyle="1" w:styleId="TextodegloboCar">
+    <w:name w:val="Texto de globo Car"/>
+    <w:basedOn w:val="Fuentedeprrafopredeter"/>
+    <w:link w:val="Textodeglobo"/>
+    <w:uiPriority w:val="99"/>
+    <w:semiHidden/>
+    <w:rsid w:val="00D76A29"/>
+    <w:rPr>
+      <w:rFonts w:ascii="Segoe UI" w:hAnsi="Segoe UI" w:cs="Segoe UI"/>
+      <w:sz w:val="18"/>
+      <w:szCs w:val="18"/>
+    </w:rPr>
+  </w:style>
+  <w:style w:type="character" w:styleId="Textodelmarcadordeposicin">
+    <w:name w:val="Placeholder Text"/>
+    <w:basedOn w:val="Fuentedeprrafopredeter"/>
+    <w:uiPriority w:val="99"/>
+    <w:semiHidden/>
+    <w:rsid w:val="00767736"/>
+    <w:rPr>
+      <w:color w:val="808080"/>
+    </w:rPr>
+  </w:style>
 </w:styles>
+</file>
+
+<file path=word/glossary/document.xml><?xml version="1.0" encoding="utf-8"?>
+<w:glossaryDocument xmlns:wpc="http://schemas.microsoft.com/office/word/2010/wordprocessingCanvas" xmlns:cx="http://schemas.microsoft.com/office/drawing/2014/chartex" xmlns:mc="http://schemas.openxmlformats.org/markup-compatibility/2006" xmlns:o="urn:schemas-microsoft-com:office:office" xmlns:r="http://schemas.openxmlformats.org/officeDocument/2006/relationships" xmlns:m="http://schemas.openxmlformats.org/officeDocument/2006/math" xmlns:v="urn:schemas-microsoft-com:vml" xmlns:wp14="http://schemas.microsoft.com/office/word/2010/wordprocessingDrawing" xmlns:wp="http://schemas.openxmlformats.org/drawingml/2006/wordprocessingDrawing" xmlns:w10="urn:schemas-microsoft-com:office:word" xmlns:w="http://schemas.openxmlformats.org/wordprocessingml/2006/main" xmlns:w14="http://schemas.microsoft.com/office/word/2010/wordml" xmlns:w15="http://schemas.microsoft.com/office/word/2012/wordml" xmlns:w16se="http://schemas.microsoft.com/office/word/2015/wordml/symex" xmlns:wpg="http://schemas.microsoft.com/office/word/2010/wordprocessingGroup" xmlns:wpi="http://schemas.microsoft.com/office/word/2010/wordprocessingInk" xmlns:wne="http://schemas.microsoft.com/office/word/2006/wordml" xmlns:wps="http://schemas.microsoft.com/office/word/2010/wordprocessingShape" mc:Ignorable="w14 w15 w16se wp14"/>
+</file>
+
+<file path=word/glossary/fontTable.xml><?xml version="1.0" encoding="utf-8"?>
+<w:fonts xmlns:mc="http://schemas.openxmlformats.org/markup-compatibility/2006" xmlns:r="http://schemas.openxmlformats.org/officeDocument/2006/relationships" xmlns:w="http://schemas.openxmlformats.org/wordprocessingml/2006/main" xmlns:w14="http://schemas.microsoft.com/office/word/2010/wordml" xmlns:w15="http://schemas.microsoft.com/office/word/2012/wordml" xmlns:w16se="http://schemas.microsoft.com/office/word/2015/wordml/symex" mc:Ignorable="w14 w15 w16se">
+  <w:font w:name="Calibri">
+    <w:panose1 w:val="020F0502020204030204"/>
+    <w:charset w:val="00"/>
+    <w:family w:val="swiss"/>
+    <w:pitch w:val="variable"/>
+    <w:sig w:usb0="E00002FF" w:usb1="4000ACFF" w:usb2="00000001" w:usb3="00000000" w:csb0="0000019F" w:csb1="00000000"/>
+  </w:font>
+  <w:font w:name="Times New Roman">
+    <w:panose1 w:val="02020603050405020304"/>
+    <w:charset w:val="00"/>
+    <w:family w:val="roman"/>
+    <w:pitch w:val="variable"/>
+    <w:sig w:usb0="E0002AFF" w:usb1="C0007843" w:usb2="00000009" w:usb3="00000000" w:csb0="000001FF" w:csb1="00000000"/>
+  </w:font>
+  <w:font w:name="Garamond">
+    <w:panose1 w:val="02020404030301010803"/>
+    <w:charset w:val="00"/>
+    <w:family w:val="roman"/>
+    <w:pitch w:val="variable"/>
+    <w:sig w:usb0="00000287" w:usb1="00000000" w:usb2="00000000" w:usb3="00000000" w:csb0="0000009F" w:csb1="00000000"/>
+  </w:font>
+  <w:font w:name="Calibri Light">
+    <w:panose1 w:val="020F0302020204030204"/>
+    <w:charset w:val="00"/>
+    <w:family w:val="swiss"/>
+    <w:pitch w:val="variable"/>
+    <w:sig w:usb0="A00002EF" w:usb1="4000207B" w:usb2="00000000" w:usb3="00000000" w:csb0="0000009F" w:csb1="00000000"/>
+  </w:font>
+  <w:font w:name="Segoe UI">
+    <w:panose1 w:val="020B0502040204020203"/>
+    <w:charset w:val="00"/>
+    <w:family w:val="swiss"/>
+    <w:pitch w:val="variable"/>
+    <w:sig w:usb0="E4002EFF" w:usb1="C000E47F" w:usb2="00000009" w:usb3="00000000" w:csb0="000001FF" w:csb1="00000000"/>
+  </w:font>
+  <w:font w:name="Cambria Math">
+    <w:panose1 w:val="02040503050406030204"/>
+    <w:charset w:val="00"/>
+    <w:family w:val="roman"/>
+    <w:pitch w:val="variable"/>
+    <w:sig w:usb0="E00006FF" w:usb1="420024FF" w:usb2="02000000" w:usb3="00000000" w:csb0="0000019F" w:csb1="00000000"/>
+  </w:font>
+</w:fonts>
+</file>
+
+<file path=word/glossary/settings.xml><?xml version="1.0" encoding="utf-8"?>
+<w:settings xmlns:mc="http://schemas.openxmlformats.org/markup-compatibility/2006" xmlns:o="urn:schemas-microsoft-com:office:office" xmlns:r="http://schemas.openxmlformats.org/officeDocument/2006/relationships" xmlns:m="http://schemas.openxmlformats.org/officeDocument/2006/math" xmlns:v="urn:schemas-microsoft-com:vml" xmlns:w10="urn:schemas-microsoft-com:office:word" xmlns:w="http://schemas.openxmlformats.org/wordprocessingml/2006/main" xmlns:w14="http://schemas.microsoft.com/office/word/2010/wordml" xmlns:w15="http://schemas.microsoft.com/office/word/2012/wordml" xmlns:w16se="http://schemas.microsoft.com/office/word/2015/wordml/symex" xmlns:sl="http://schemas.openxmlformats.org/schemaLibrary/2006/main" mc:Ignorable="w14 w15 w16se">
+  <w:view w:val="normal"/>
+  <w:defaultTabStop w:val="708"/>
+  <w:hyphenationZone w:val="425"/>
+  <w:characterSpacingControl w:val="doNotCompress"/>
+  <w:compat>
+    <w:useFELayout/>
+    <w:compatSetting w:name="compatibilityMode" w:uri="http://schemas.microsoft.com/office/word" w:val="15"/>
+    <w:compatSetting w:name="overrideTableStyleFontSizeAndJustification" w:uri="http://schemas.microsoft.com/office/word" w:val="1"/>
+    <w:compatSetting w:name="enableOpenTypeFeatures" w:uri="http://schemas.microsoft.com/office/word" w:val="1"/>
+    <w:compatSetting w:name="doNotFlipMirrorIndents" w:uri="http://schemas.microsoft.com/office/word" w:val="1"/>
+    <w:compatSetting w:name="differentiateMultirowTableHeaders" w:uri="http://schemas.microsoft.com/office/word" w:val="1"/>
+  </w:compat>
+  <w:rsids>
+    <w:rsidRoot w:val="00EB55B8"/>
+    <w:rsid w:val="00E97292"/>
+    <w:rsid w:val="00EB55B8"/>
+  </w:rsids>
+  <m:mathPr>
+    <m:mathFont m:val="Cambria Math"/>
+    <m:brkBin m:val="before"/>
+    <m:brkBinSub m:val="--"/>
+    <m:smallFrac m:val="0"/>
+    <m:dispDef/>
+    <m:lMargin m:val="0"/>
+    <m:rMargin m:val="0"/>
+    <m:defJc m:val="centerGroup"/>
+    <m:wrapIndent m:val="1440"/>
+    <m:intLim m:val="subSup"/>
+    <m:naryLim m:val="undOvr"/>
+  </m:mathPr>
+  <w:themeFontLang w:val="es-AR"/>
+  <w:clrSchemeMapping w:bg1="light1" w:t1="dark1" w:bg2="light2" w:t2="dark2" w:accent1="accent1" w:accent2="accent2" w:accent3="accent3" w:accent4="accent4" w:accent5="accent5" w:accent6="accent6" w:hyperlink="hyperlink" w:followedHyperlink="followedHyperlink"/>
+  <w:decimalSymbol w:val=","/>
+  <w:listSeparator w:val=";"/>
+  <w15:chartTrackingRefBased/>
+</w:settings>
+</file>
+
+<file path=word/glossary/styles.xml><?xml version="1.0" encoding="utf-8"?>
+<w:styles xmlns:mc="http://schemas.openxmlformats.org/markup-compatibility/2006" xmlns:r="http://schemas.openxmlformats.org/officeDocument/2006/relationships" xmlns:w="http://schemas.openxmlformats.org/wordprocessingml/2006/main" xmlns:w14="http://schemas.microsoft.com/office/word/2010/wordml" xmlns:w15="http://schemas.microsoft.com/office/word/2012/wordml" xmlns:w16se="http://schemas.microsoft.com/office/word/2015/wordml/symex" mc:Ignorable="w14 w15 w16se">
+  <w:docDefaults>
+    <w:rPrDefault>
+      <w:rPr>
+        <w:rFonts w:asciiTheme="minorHAnsi" w:eastAsiaTheme="minorEastAsia" w:hAnsiTheme="minorHAnsi" w:cstheme="minorBidi"/>
+        <w:sz w:val="22"/>
+        <w:szCs w:val="22"/>
+        <w:lang w:val="es-AR" w:eastAsia="es-AR" w:bidi="ar-SA"/>
+      </w:rPr>
+    </w:rPrDefault>
+    <w:pPrDefault>
+      <w:pPr>
+        <w:spacing w:after="160" w:line="259" w:lineRule="auto"/>
+      </w:pPr>
+    </w:pPrDefault>
+  </w:docDefaults>
+  <w:latentStyles w:defLockedState="0" w:defUIPriority="99" w:defSemiHidden="0" w:defUnhideWhenUsed="0" w:defQFormat="0" w:count="371">
+    <w:lsdException w:name="Normal" w:uiPriority="0" w:qFormat="1"/>
+    <w:lsdException w:name="heading 1" w:uiPriority="9" w:qFormat="1"/>
+    <w:lsdException w:name="heading 2" w:semiHidden="1" w:uiPriority="9" w:unhideWhenUsed="1" w:qFormat="1"/>
+    <w:lsdException w:name="heading 3" w:semiHidden="1" w:uiPriority="9" w:unhideWhenUsed="1" w:qFormat="1"/>
+    <w:lsdException w:name="heading 4" w:semiHidden="1" w:uiPriority="9" w:unhideWhenUsed="1" w:qFormat="1"/>
+    <w:lsdException w:name="heading 5" w:semiHidden="1" w:uiPriority="9" w:unhideWhenUsed="1" w:qFormat="1"/>
+    <w:lsdException w:name="heading 6" w:semiHidden="1" w:uiPriority="9" w:unhideWhenUsed="1" w:qFormat="1"/>
+    <w:lsdException w:name="heading 7" w:semiHidden="1" w:uiPriority="9" w:unhideWhenUsed="1" w:qFormat="1"/>
+    <w:lsdException w:name="heading 8" w:semiHidden="1" w:uiPriority="9" w:unhideWhenUsed="1" w:qFormat="1"/>
+    <w:lsdException w:name="heading 9" w:semiHidden="1" w:uiPriority="9" w:unhideWhenUsed="1" w:qFormat="1"/>
+    <w:lsdException w:name="index 1" w:semiHidden="1" w:unhideWhenUsed="1"/>
+    <w:lsdException w:name="index 2" w:semiHidden="1" w:unhideWhenUsed="1"/>
+    <w:lsdException w:name="index 3" w:semiHidden="1" w:unhideWhenUsed="1"/>
+    <w:lsdException w:name="index 4" w:semiHidden="1" w:unhideWhenUsed="1"/>
+    <w:lsdException w:name="index 5" w:semiHidden="1" w:unhideWhenUsed="1"/>
+    <w:lsdException w:name="index 6" w:semiHidden="1" w:unhideWhenUsed="1"/>
+    <w:lsdException w:name="index 7" w:semiHidden="1" w:unhideWhenUsed="1"/>
+    <w:lsdException w:name="index 8" w:semiHidden="1" w:unhideWhenUsed="1"/>
+    <w:lsdException w:name="index 9" w:semiHidden="1" w:unhideWhenUsed="1"/>
+    <w:lsdException w:name="toc 1" w:semiHidden="1" w:uiPriority="39" w:unhideWhenUsed="1"/>
+    <w:lsdException w:name="toc 2" w:semiHidden="1" w:uiPriority="39" w:unhideWhenUsed="1"/>
+    <w:lsdException w:name="toc 3" w:semiHidden="1" w:uiPriority="39" w:unhideWhenUsed="1"/>
+    <w:lsdException w:name="toc 4" w:semiHidden="1" w:uiPriority="39" w:unhideWhenUsed="1"/>
+    <w:lsdException w:name="toc 5" w:semiHidden="1" w:uiPriority="39" w:unhideWhenUsed="1"/>
+    <w:lsdException w:name="toc 6" w:semiHidden="1" w:uiPriority="39" w:unhideWhenUsed="1"/>
+    <w:lsdException w:name="toc 7" w:semiHidden="1" w:uiPriority="39" w:unhideWhenUsed="1"/>
+    <w:lsdException w:name="toc 8" w:semiHidden="1" w:uiPriority="39" w:unhideWhenUsed="1"/>
+    <w:lsdException w:name="toc 9" w:semiHidden="1" w:uiPriority="39" w:unhideWhenUsed="1"/>
+    <w:lsdException w:name="Normal Indent" w:semiHidden="1" w:unhideWhenUsed="1"/>
+    <w:lsdException w:name="footnote text" w:semiHidden="1" w:unhideWhenUsed="1"/>
+    <w:lsdException w:name="annotation text" w:semiHidden="1" w:unhideWhenUsed="1"/>
+    <w:lsdException w:name="header" w:semiHidden="1" w:unhideWhenUsed="1"/>
+    <w:lsdException w:name="footer" w:semiHidden="1" w:unhideWhenUsed="1"/>
+    <w:lsdException w:name="index heading" w:semiHidden="1" w:unhideWhenUsed="1"/>
+    <w:lsdException w:name="caption" w:semiHidden="1" w:uiPriority="35" w:unhideWhenUsed="1" w:qFormat="1"/>
+    <w:lsdException w:name="table of figures" w:semiHidden="1" w:unhideWhenUsed="1"/>
+    <w:lsdException w:name="envelope address" w:semiHidden="1" w:unhideWhenUsed="1"/>
+    <w:lsdException w:name="envelope return" w:semiHidden="1" w:unhideWhenUsed="1"/>
+    <w:lsdException w:name="footnote reference" w:semiHidden="1" w:unhideWhenUsed="1"/>
+    <w:lsdException w:name="annotation reference" w:semiHidden="1" w:unhideWhenUsed="1"/>
+    <w:lsdException w:name="line number" w:semiHidden="1" w:unhideWhenUsed="1"/>
+    <w:lsdException w:name="page number" w:semiHidden="1" w:unhideWhenUsed="1"/>
+    <w:lsdException w:name="endnote reference" w:semiHidden="1" w:unhideWhenUsed="1"/>
+    <w:lsdException w:name="endnote text" w:semiHidden="1" w:unhideWhenUsed="1"/>
+    <w:lsdException w:name="table of authorities" w:semiHidden="1" w:unhideWhenUsed="1"/>
+    <w:lsdException w:name="macro" w:semiHidden="1" w:unhideWhenUsed="1"/>
+    <w:lsdException w:name="toa heading" w:semiHidden="1" w:unhideWhenUsed="1"/>
+    <w:lsdException w:name="List" w:semiHidden="1" w:unhideWhenUsed="1"/>
+    <w:lsdException w:name="List Bullet" w:semiHidden="1" w:unhideWhenUsed="1"/>
+    <w:lsdException w:name="List Number" w:semiHidden="1" w:unhideWhenUsed="1"/>
+    <w:lsdException w:name="List 2" w:semiHidden="1" w:unhideWhenUsed="1"/>
+    <w:lsdException w:name="List 3" w:semiHidden="1" w:unhideWhenUsed="1"/>
+    <w:lsdException w:name="List 4" w:semiHidden="1" w:unhideWhenUsed="1"/>
+    <w:lsdException w:name="List 5" w:semiHidden="1" w:unhideWhenUsed="1"/>
+    <w:lsdException w:name="List Bullet 2" w:semiHidden="1" w:unhideWhenUsed="1"/>
+    <w:lsdException w:name="List Bullet 3" w:semiHidden="1" w:unhideWhenUsed="1"/>
+    <w:lsdException w:name="List Bullet 4" w:semiHidden="1" w:unhideWhenUsed="1"/>
+    <w:lsdException w:name="List Bullet 5" w:semiHidden="1" w:unhideWhenUsed="1"/>
+    <w:lsdException w:name="List Number 2" w:semiHidden="1" w:unhideWhenUsed="1"/>
+    <w:lsdException w:name="List Number 3" w:semiHidden="1" w:unhideWhenUsed="1"/>
+    <w:lsdException w:name="List Number 4" w:semiHidden="1" w:unhideWhenUsed="1"/>
+    <w:lsdException w:name="List Number 5" w:semiHidden="1" w:unhideWhenUsed="1"/>
+    <w:lsdException w:name="Title" w:uiPriority="10" w:qFormat="1"/>
+    <w:lsdException w:name="Closing" w:semiHidden="1" w:unhideWhenUsed="1"/>
+    <w:lsdException w:name="Signature" w:semiHidden="1" w:unhideWhenUsed="1"/>
+    <w:lsdException w:name="Default Paragraph Font" w:semiHidden="1" w:uiPriority="1" w:unhideWhenUsed="1"/>
+    <w:lsdException w:name="Body Text" w:semiHidden="1" w:unhideWhenUsed="1"/>
+    <w:lsdException w:name="Body Text Indent" w:semiHidden="1" w:unhideWhenUsed="1"/>
+    <w:lsdException w:name="List Continue" w:semiHidden="1" w:unhideWhenUsed="1"/>
+    <w:lsdException w:name="List Continue 2" w:semiHidden="1" w:unhideWhenUsed="1"/>
+    <w:lsdException w:name="List Continue 3" w:semiHidden="1" w:unhideWhenUsed="1"/>
+    <w:lsdException w:name="List Continue 4" w:semiHidden="1" w:unhideWhenUsed="1"/>
+    <w:lsdException w:name="List Continue 5" w:semiHidden="1" w:unhideWhenUsed="1"/>
+    <w:lsdException w:name="Message Header" w:semiHidden="1" w:unhideWhenUsed="1"/>
+    <w:lsdException w:name="Subtitle" w:uiPriority="11" w:qFormat="1"/>
+    <w:lsdException w:name="Salutation" w:semiHidden="1" w:unhideWhenUsed="1"/>
+    <w:lsdException w:name="Date" w:semiHidden="1" w:unhideWhenUsed="1"/>
+    <w:lsdException w:name="Body Text First Indent" w:semiHidden="1" w:unhideWhenUsed="1"/>
+    <w:lsdException w:name="Body Text First Indent 2" w:semiHidden="1" w:unhideWhenUsed="1"/>
+    <w:lsdException w:name="Note Heading" w:semiHidden="1" w:unhideWhenUsed="1"/>
+    <w:lsdException w:name="Body Text 2" w:semiHidden="1" w:unhideWhenUsed="1"/>
+    <w:lsdException w:name="Body Text 3" w:semiHidden="1" w:unhideWhenUsed="1"/>
+    <w:lsdException w:name="Body Text Indent 2" w:semiHidden="1" w:unhideWhenUsed="1"/>
+    <w:lsdException w:name="Body Text Indent 3" w:semiHidden="1" w:unhideWhenUsed="1"/>
+    <w:lsdException w:name="Block Text" w:semiHidden="1" w:unhideWhenUsed="1"/>
+    <w:lsdException w:name="Hyperlink" w:semiHidden="1" w:unhideWhenUsed="1"/>
+    <w:lsdException w:name="FollowedHyperlink" w:semiHidden="1" w:unhideWhenUsed="1"/>
+    <w:lsdException w:name="Strong" w:uiPriority="22" w:qFormat="1"/>
+    <w:lsdException w:name="Emphasis" w:uiPriority="20" w:qFormat="1"/>
+    <w:lsdException w:name="Document Map" w:semiHidden="1" w:unhideWhenUsed="1"/>
+    <w:lsdException w:name="Plain Text" w:semiHidden="1" w:unhideWhenUsed="1"/>
+    <w:lsdException w:name="E-mail Signature" w:semiHidden="1" w:unhideWhenUsed="1"/>
+    <w:lsdException w:name="HTML Top of Form" w:semiHidden="1" w:unhideWhenUsed="1"/>
+    <w:lsdException w:name="HTML Bottom of Form" w:semiHidden="1" w:unhideWhenUsed="1"/>
+    <w:lsdException w:name="Normal (Web)" w:semiHidden="1" w:unhideWhenUsed="1"/>
+    <w:lsdException w:name="HTML Acronym" w:semiHidden="1" w:unhideWhenUsed="1"/>
+    <w:lsdException w:name="HTML Address" w:semiHidden="1" w:unhideWhenUsed="1"/>
+    <w:lsdException w:name="HTML Cite" w:semiHidden="1" w:unhideWhenUsed="1"/>
+    <w:lsdException w:name="HTML Code" w:semiHidden="1" w:unhideWhenUsed="1"/>
+    <w:lsdException w:name="HTML Definition" w:semiHidden="1" w:unhideWhenUsed="1"/>
+    <w:lsdException w:name="HTML Keyboard" w:semiHidden="1" w:unhideWhenUsed="1"/>
+    <w:lsdException w:name="HTML Preformatted" w:semiHidden="1" w:unhideWhenUsed="1"/>
+    <w:lsdException w:name="HTML Sample" w:semiHidden="1" w:unhideWhenUsed="1"/>
+    <w:lsdException w:name="HTML Typewriter" w:semiHidden="1" w:unhideWhenUsed="1"/>
+    <w:lsdException w:name="HTML Variable" w:semiHidden="1" w:unhideWhenUsed="1"/>
+    <w:lsdException w:name="Normal Table" w:semiHidden="1" w:unhideWhenUsed="1"/>
+    <w:lsdException w:name="annotation subject" w:semiHidden="1" w:unhideWhenUsed="1"/>
+    <w:lsdException w:name="No List" w:semiHidden="1" w:unhideWhenUsed="1"/>
+    <w:lsdException w:name="Outline List 1" w:semiHidden="1" w:unhideWhenUsed="1"/>
+    <w:lsdException w:name="Outline List 2" w:semiHidden="1" w:unhideWhenUsed="1"/>
+    <w:lsdException w:name="Outline List 3" w:semiHidden="1" w:unhideWhenUsed="1"/>
+    <w:lsdException w:name="Table Simple 1" w:semiHidden="1" w:unhideWhenUsed="1"/>
+    <w:lsdException w:name="Table Simple 2" w:semiHidden="1" w:unhideWhenUsed="1"/>
+    <w:lsdException w:name="Table Simple 3" w:semiHidden="1" w:unhideWhenUsed="1"/>
+    <w:lsdException w:name="Table Classic 1" w:semiHidden="1" w:unhideWhenUsed="1"/>
+    <w:lsdException w:name="Table Classic 2" w:semiHidden="1" w:unhideWhenUsed="1"/>
+    <w:lsdException w:name="Table Classic 3" w:semiHidden="1" w:unhideWhenUsed="1"/>
+    <w:lsdException w:name="Table Classic 4" w:semiHidden="1" w:unhideWhenUsed="1"/>
+    <w:lsdException w:name="Table Colorful 1" w:semiHidden="1" w:unhideWhenUsed="1"/>
+    <w:lsdException w:name="Table Colorful 2" w:semiHidden="1" w:unhideWhenUsed="1"/>
+    <w:lsdException w:name="Table Colorful 3" w:semiHidden="1" w:unhideWhenUsed="1"/>
+    <w:lsdException w:name="Table Columns 1" w:semiHidden="1" w:unhideWhenUsed="1"/>
+    <w:lsdException w:name="Table Columns 2" w:semiHidden="1" w:unhideWhenUsed="1"/>
+    <w:lsdException w:name="Table Columns 3" w:semiHidden="1" w:unhideWhenUsed="1"/>
+    <w:lsdException w:name="Table Columns 4" w:semiHidden="1" w:unhideWhenUsed="1"/>
+    <w:lsdException w:name="Table Columns 5" w:semiHidden="1" w:unhideWhenUsed="1"/>
+    <w:lsdException w:name="Table Grid 1" w:semiHidden="1" w:unhideWhenUsed="1"/>
+    <w:lsdException w:name="Table Grid 2" w:semiHidden="1" w:unhideWhenUsed="1"/>
+    <w:lsdException w:name="Table Grid 3" w:semiHidden="1" w:unhideWhenUsed="1"/>
+    <w:lsdException w:name="Table Grid 4" w:semiHidden="1" w:unhideWhenUsed="1"/>
+    <w:lsdException w:name="Table Grid 5" w:semiHidden="1" w:unhideWhenUsed="1"/>
+    <w:lsdException w:name="Table Grid 6" w:semiHidden="1" w:unhideWhenUsed="1"/>
+    <w:lsdException w:name="Table Grid 7" w:semiHidden="1" w:unhideWhenUsed="1"/>
+    <w:lsdException w:name="Table Grid 8" w:semiHidden="1" w:unhideWhenUsed="1"/>
+    <w:lsdException w:name="Table List 1" w:semiHidden="1" w:unhideWhenUsed="1"/>
+    <w:lsdException w:name="Table List 2" w:semiHidden="1" w:unhideWhenUsed="1"/>
+    <w:lsdException w:name="Table List 3" w:semiHidden="1" w:unhideWhenUsed="1"/>
+    <w:lsdException w:name="Table List 4" w:semiHidden="1" w:unhideWhenUsed="1"/>
+    <w:lsdException w:name="Table List 5" w:semiHidden="1" w:unhideWhenUsed="1"/>
+    <w:lsdException w:name="Table List 6" w:semiHidden="1" w:unhideWhenUsed="1"/>
+    <w:lsdException w:name="Table List 7" w:semiHidden="1" w:unhideWhenUsed="1"/>
+    <w:lsdException w:name="Table List 8" w:semiHidden="1" w:unhideWhenUsed="1"/>
+    <w:lsdException w:name="Table 3D effects 1" w:semiHidden="1" w:unhideWhenUsed="1"/>
+    <w:lsdException w:name="Table 3D effects 2" w:semiHidden="1" w:unhideWhenUsed="1"/>
+    <w:lsdException w:name="Table 3D effects 3" w:semiHidden="1" w:unhideWhenUsed="1"/>
+    <w:lsdException w:name="Table Contemporary" w:semiHidden="1" w:unhideWhenUsed="1"/>
+    <w:lsdException w:name="Table Elegant" w:semiHidden="1" w:unhideWhenUsed="1"/>
+    <w:lsdException w:name="Table Professional" w:semiHidden="1" w:unhideWhenUsed="1"/>
+    <w:lsdException w:name="Table Subtle 1" w:semiHidden="1" w:unhideWhenUsed="1"/>
+    <w:lsdException w:name="Table Subtle 2" w:semiHidden="1" w:unhideWhenUsed="1"/>
+    <w:lsdException w:name="Table Web 1" w:semiHidden="1" w:unhideWhenUsed="1"/>
+    <w:lsdException w:name="Table Web 2" w:semiHidden="1" w:unhideWhenUsed="1"/>
+    <w:lsdException w:name="Table Web 3" w:semiHidden="1" w:unhideWhenUsed="1"/>
+    <w:lsdException w:name="Balloon Text" w:semiHidden="1" w:unhideWhenUsed="1"/>
+    <w:lsdException w:name="Table Grid" w:uiPriority="39"/>
+    <w:lsdException w:name="Table Theme" w:semiHidden="1" w:unhideWhenUsed="1"/>
+    <w:lsdException w:name="Placeholder Text" w:semiHidden="1"/>
+    <w:lsdException w:name="No Spacing" w:uiPriority="1" w:qFormat="1"/>
+    <w:lsdException w:name="Light Shading" w:uiPriority="60"/>
+    <w:lsdException w:name="Light List" w:uiPriority="61"/>
+    <w:lsdException w:name="Light Grid" w:uiPriority="62"/>
+    <w:lsdException w:name="Medium Shading 1" w:uiPriority="63"/>
+    <w:lsdException w:name="Medium Shading 2" w:uiPriority="64"/>
+    <w:lsdException w:name="Medium List 1" w:uiPriority="65"/>
+    <w:lsdException w:name="Medium List 2" w:uiPriority="66"/>
+    <w:lsdException w:name="Medium Grid 1" w:uiPriority="67"/>
+    <w:lsdException w:name="Medium Grid 2" w:uiPriority="68"/>
+    <w:lsdException w:name="Medium Grid 3" w:uiPriority="69"/>
+    <w:lsdException w:name="Dark List" w:uiPriority="70"/>
+    <w:lsdException w:name="Colorful Shading" w:uiPriority="71"/>
+    <w:lsdException w:name="Colorful List" w:uiPriority="72"/>
+    <w:lsdException w:name="Colorful Grid" w:uiPriority="73"/>
+    <w:lsdException w:name="Light Shading Accent 1" w:uiPriority="60"/>
+    <w:lsdException w:name="Light List Accent 1" w:uiPriority="61"/>
+    <w:lsdException w:name="Light Grid Accent 1" w:uiPriority="62"/>
+    <w:lsdException w:name="Medium Shading 1 Accent 1" w:uiPriority="63"/>
+    <w:lsdException w:name="Medium Shading 2 Accent 1" w:uiPriority="64"/>
+    <w:lsdException w:name="Medium List 1 Accent 1" w:uiPriority="65"/>
+    <w:lsdException w:name="Revision" w:semiHidden="1"/>
+    <w:lsdException w:name="List Paragraph" w:uiPriority="34" w:qFormat="1"/>
+    <w:lsdException w:name="Quote" w:uiPriority="29" w:qFormat="1"/>
+    <w:lsdException w:name="Intense Quote" w:uiPriority="30" w:qFormat="1"/>
+    <w:lsdException w:name="Medium List 2 Accent 1" w:uiPriority="66"/>
+    <w:lsdException w:name="Medium Grid 1 Accent 1" w:uiPriority="67"/>
+    <w:lsdException w:name="Medium Grid 2 Accent 1" w:uiPriority="68"/>
+    <w:lsdException w:name="Medium Grid 3 Accent 1" w:uiPriority="69"/>
+    <w:lsdException w:name="Dark List Accent 1" w:uiPriority="70"/>
+    <w:lsdException w:name="Colorful Shading Accent 1" w:uiPriority="71"/>
+    <w:lsdException w:name="Colorful List Accent 1" w:uiPriority="72"/>
+    <w:lsdException w:name="Colorful Grid Accent 1" w:uiPriority="73"/>
+    <w:lsdException w:name="Light Shading Accent 2" w:uiPriority="60"/>
+    <w:lsdException w:name="Light List Accent 2" w:uiPriority="61"/>
+    <w:lsdException w:name="Light Grid Accent 2" w:uiPriority="62"/>
+    <w:lsdException w:name="Medium Shading 1 Accent 2" w:uiPriority="63"/>
+    <w:lsdException w:name="Medium Shading 2 Accent 2" w:uiPriority="64"/>
+    <w:lsdException w:name="Medium List 1 Accent 2" w:uiPriority="65"/>
+    <w:lsdException w:name="Medium List 2 Accent 2" w:uiPriority="66"/>
+    <w:lsdException w:name="Medium Grid 1 Accent 2" w:uiPriority="67"/>
+    <w:lsdException w:name="Medium Grid 2 Accent 2" w:uiPriority="68"/>
+    <w:lsdException w:name="Medium Grid 3 Accent 2" w:uiPriority="69"/>
+    <w:lsdException w:name="Dark List Accent 2" w:uiPriority="70"/>
+    <w:lsdException w:name="Colorful Shading Accent 2" w:uiPriority="71"/>
+    <w:lsdException w:name="Colorful List Accent 2" w:uiPriority="72"/>
+    <w:lsdException w:name="Colorful Grid Accent 2" w:uiPriority="73"/>
+    <w:lsdException w:name="Light Shading Accent 3" w:uiPriority="60"/>
+    <w:lsdException w:name="Light List Accent 3" w:uiPriority="61"/>
+    <w:lsdException w:name="Light Grid Accent 3" w:uiPriority="62"/>
+    <w:lsdException w:name="Medium Shading 1 Accent 3" w:uiPriority="63"/>
+    <w:lsdException w:name="Medium Shading 2 Accent 3" w:uiPriority="64"/>
+    <w:lsdException w:name="Medium List 1 Accent 3" w:uiPriority="65"/>
+    <w:lsdException w:name="Medium List 2 Accent 3" w:uiPriority="66"/>
+    <w:lsdException w:name="Medium Grid 1 Accent 3" w:uiPriority="67"/>
+    <w:lsdException w:name="Medium Grid 2 Accent 3" w:uiPriority="68"/>
+    <w:lsdException w:name="Medium Grid 3 Accent 3" w:uiPriority="69"/>
+    <w:lsdException w:name="Dark List Accent 3" w:uiPriority="70"/>
+    <w:lsdException w:name="Colorful Shading Accent 3" w:uiPriority="71"/>
+    <w:lsdException w:name="Colorful List Accent 3" w:uiPriority="72"/>
+    <w:lsdException w:name="Colorful Grid Accent 3" w:uiPriority="73"/>
+    <w:lsdException w:name="Light Shading Accent 4" w:uiPriority="60"/>
+    <w:lsdException w:name="Light List Accent 4" w:uiPriority="61"/>
+    <w:lsdException w:name="Light Grid Accent 4" w:uiPriority="62"/>
+    <w:lsdException w:name="Medium Shading 1 Accent 4" w:uiPriority="63"/>
+    <w:lsdException w:name="Medium Shading 2 Accent 4" w:uiPriority="64"/>
+    <w:lsdException w:name="Medium List 1 Accent 4" w:uiPriority="65"/>
+    <w:lsdException w:name="Medium List 2 Accent 4" w:uiPriority="66"/>
+    <w:lsdException w:name="Medium Grid 1 Accent 4" w:uiPriority="67"/>
+    <w:lsdException w:name="Medium Grid 2 Accent 4" w:uiPriority="68"/>
+    <w:lsdException w:name="Medium Grid 3 Accent 4" w:uiPriority="69"/>
+    <w:lsdException w:name="Dark List Accent 4" w:uiPriority="70"/>
+    <w:lsdException w:name="Colorful Shading Accent 4" w:uiPriority="71"/>
+    <w:lsdException w:name="Colorful List Accent 4" w:uiPriority="72"/>
+    <w:lsdException w:name="Colorful Grid Accent 4" w:uiPriority="73"/>
+    <w:lsdException w:name="Light Shading Accent 5" w:uiPriority="60"/>
+    <w:lsdException w:name="Light List Accent 5" w:uiPriority="61"/>
+    <w:lsdException w:name="Light Grid Accent 5" w:uiPriority="62"/>
+    <w:lsdException w:name="Medium Shading 1 Accent 5" w:uiPriority="63"/>
+    <w:lsdException w:name="Medium Shading 2 Accent 5" w:uiPriority="64"/>
+    <w:lsdException w:name="Medium List 1 Accent 5" w:uiPriority="65"/>
+    <w:lsdException w:name="Medium List 2 Accent 5" w:uiPriority="66"/>
+    <w:lsdException w:name="Medium Grid 1 Accent 5" w:uiPriority="67"/>
+    <w:lsdException w:name="Medium Grid 2 Accent 5" w:uiPriority="68"/>
+    <w:lsdException w:name="Medium Grid 3 Accent 5" w:uiPriority="69"/>
+    <w:lsdException w:name="Dark List Accent 5" w:uiPriority="70"/>
+    <w:lsdException w:name="Colorful Shading Accent 5" w:uiPriority="71"/>
+    <w:lsdException w:name="Colorful List Accent 5" w:uiPriority="72"/>
+    <w:lsdException w:name="Colorful Grid Accent 5" w:uiPriority="73"/>
+    <w:lsdException w:name="Light Shading Accent 6" w:uiPriority="60"/>
+    <w:lsdException w:name="Light List Accent 6" w:uiPriority="61"/>
+    <w:lsdException w:name="Light Grid Accent 6" w:uiPriority="62"/>
+    <w:lsdException w:name="Medium Shading 1 Accent 6" w:uiPriority="63"/>
+    <w:lsdException w:name="Medium Shading 2 Accent 6" w:uiPriority="64"/>
+    <w:lsdException w:name="Medium List 1 Accent 6" w:uiPriority="65"/>
+    <w:lsdException w:name="Medium List 2 Accent 6" w:uiPriority="66"/>
+    <w:lsdException w:name="Medium Grid 1 Accent 6" w:uiPriority="67"/>
+    <w:lsdException w:name="Medium Grid 2 Accent 6" w:uiPriority="68"/>
+    <w:lsdException w:name="Medium Grid 3 Accent 6" w:uiPriority="69"/>
+    <w:lsdException w:name="Dark List Accent 6" w:uiPriority="70"/>
+    <w:lsdException w:name="Colorful Shading Accent 6" w:uiPriority="71"/>
+    <w:lsdException w:name="Colorful List Accent 6" w:uiPriority="72"/>
+    <w:lsdException w:name="Colorful Grid Accent 6" w:uiPriority="73"/>
+    <w:lsdException w:name="Subtle Emphasis" w:uiPriority="19" w:qFormat="1"/>
+    <w:lsdException w:name="Intense Emphasis" w:uiPriority="21" w:qFormat="1"/>
+    <w:lsdException w:name="Subtle Reference" w:uiPriority="31" w:qFormat="1"/>
+    <w:lsdException w:name="Intense Reference" w:uiPriority="32" w:qFormat="1"/>
+    <w:lsdException w:name="Book Title" w:uiPriority="33" w:qFormat="1"/>
+    <w:lsdException w:name="Bibliography" w:semiHidden="1" w:uiPriority="37" w:unhideWhenUsed="1"/>
+    <w:lsdException w:name="TOC Heading" w:semiHidden="1" w:uiPriority="39" w:unhideWhenUsed="1" w:qFormat="1"/>
+    <w:lsdException w:name="Plain Table 1" w:uiPriority="41"/>
+    <w:lsdException w:name="Plain Table 2" w:uiPriority="42"/>
+    <w:lsdException w:name="Plain Table 3" w:uiPriority="43"/>
+    <w:lsdException w:name="Plain Table 4" w:uiPriority="44"/>
+    <w:lsdException w:name="Plain Table 5" w:uiPriority="45"/>
+    <w:lsdException w:name="Grid Table Light" w:uiPriority="40"/>
+    <w:lsdException w:name="Grid Table 1 Light" w:uiPriority="46"/>
+    <w:lsdException w:name="Grid Table 2" w:uiPriority="47"/>
+    <w:lsdException w:name="Grid Table 3" w:uiPriority="48"/>
+    <w:lsdException w:name="Grid Table 4" w:uiPriority="49"/>
+    <w:lsdException w:name="Grid Table 5 Dark" w:uiPriority="50"/>
+    <w:lsdException w:name="Grid Table 6 Colorful" w:uiPriority="51"/>
+    <w:lsdException w:name="Grid Table 7 Colorful" w:uiPriority="52"/>
+    <w:lsdException w:name="Grid Table 1 Light Accent 1" w:uiPriority="46"/>
+    <w:lsdException w:name="Grid Table 2 Accent 1" w:uiPriority="47"/>
+    <w:lsdException w:name="Grid Table 3 Accent 1" w:uiPriority="48"/>
+    <w:lsdException w:name="Grid Table 4 Accent 1" w:uiPriority="49"/>
+    <w:lsdException w:name="Grid Table 5 Dark Accent 1" w:uiPriority="50"/>
+    <w:lsdException w:name="Grid Table 6 Colorful Accent 1" w:uiPriority="51"/>
+    <w:lsdException w:name="Grid Table 7 Colorful Accent 1" w:uiPriority="52"/>
+    <w:lsdException w:name="Grid Table 1 Light Accent 2" w:uiPriority="46"/>
+    <w:lsdException w:name="Grid Table 2 Accent 2" w:uiPriority="47"/>
+    <w:lsdException w:name="Grid Table 3 Accent 2" w:uiPriority="48"/>
+    <w:lsdException w:name="Grid Table 4 Accent 2" w:uiPriority="49"/>
+    <w:lsdException w:name="Grid Table 5 Dark Accent 2" w:uiPriority="50"/>
+    <w:lsdException w:name="Grid Table 6 Colorful Accent 2" w:uiPriority="51"/>
+    <w:lsdException w:name="Grid Table 7 Colorful Accent 2" w:uiPriority="52"/>
+    <w:lsdException w:name="Grid Table 1 Light Accent 3" w:uiPriority="46"/>
+    <w:lsdException w:name="Grid Table 2 Accent 3" w:uiPriority="47"/>
+    <w:lsdException w:name="Grid Table 3 Accent 3" w:uiPriority="48"/>
+    <w:lsdException w:name="Grid Table 4 Accent 3" w:uiPriority="49"/>
+    <w:lsdException w:name="Grid Table 5 Dark Accent 3" w:uiPriority="50"/>
+    <w:lsdException w:name="Grid Table 6 Colorful Accent 3" w:uiPriority="51"/>
+    <w:lsdException w:name="Grid Table 7 Colorful Accent 3" w:uiPriority="52"/>
+    <w:lsdException w:name="Grid Table 1 Light Accent 4" w:uiPriority="46"/>
+    <w:lsdException w:name="Grid Table 2 Accent 4" w:uiPriority="47"/>
+    <w:lsdException w:name="Grid Table 3 Accent 4" w:uiPriority="48"/>
+    <w:lsdException w:name="Grid Table 4 Accent 4" w:uiPriority="49"/>
+    <w:lsdException w:name="Grid Table 5 Dark Accent 4" w:uiPriority="50"/>
+    <w:lsdException w:name="Grid Table 6 Colorful Accent 4" w:uiPriority="51"/>
+    <w:lsdException w:name="Grid Table 7 Colorful Accent 4" w:uiPriority="52"/>
+    <w:lsdException w:name="Grid Table 1 Light Accent 5" w:uiPriority="46"/>
+    <w:lsdException w:name="Grid Table 2 Accent 5" w:uiPriority="47"/>
+    <w:lsdException w:name="Grid Table 3 Accent 5" w:uiPriority="48"/>
+    <w:lsdException w:name="Grid Table 4 Accent 5" w:uiPriority="49"/>
+    <w:lsdException w:name="Grid Table 5 Dark Accent 5" w:uiPriority="50"/>
+    <w:lsdException w:name="Grid Table 6 Colorful Accent 5" w:uiPriority="51"/>
+    <w:lsdException w:name="Grid Table 7 Colorful Accent 5" w:uiPriority="52"/>
+    <w:lsdException w:name="Grid Table 1 Light Accent 6" w:uiPriority="46"/>
+    <w:lsdException w:name="Grid Table 2 Accent 6" w:uiPriority="47"/>
+    <w:lsdException w:name="Grid Table 3 Accent 6" w:uiPriority="48"/>
+    <w:lsdException w:name="Grid Table 4 Accent 6" w:uiPriority="49"/>
+    <w:lsdException w:name="Grid Table 5 Dark Accent 6" w:uiPriority="50"/>
+    <w:lsdException w:name="Grid Table 6 Colorful Accent 6" w:uiPriority="51"/>
+    <w:lsdException w:name="Grid Table 7 Colorful Accent 6" w:uiPriority="52"/>
+    <w:lsdException w:name="List Table 1 Light" w:uiPriority="46"/>
+    <w:lsdException w:name="List Table 2" w:uiPriority="47"/>
+    <w:lsdException w:name="List Table 3" w:uiPriority="48"/>
+    <w:lsdException w:name="List Table 4" w:uiPriority="49"/>
+    <w:lsdException w:name="List Table 5 Dark" w:uiPriority="50"/>
+    <w:lsdException w:name="List Table 6 Colorful" w:uiPriority="51"/>
+    <w:lsdException w:name="List Table 7 Colorful" w:uiPriority="52"/>
+    <w:lsdException w:name="List Table 1 Light Accent 1" w:uiPriority="46"/>
+    <w:lsdException w:name="List Table 2 Accent 1" w:uiPriority="47"/>
+    <w:lsdException w:name="List Table 3 Accent 1" w:uiPriority="48"/>
+    <w:lsdException w:name="List Table 4 Accent 1" w:uiPriority="49"/>
+    <w:lsdException w:name="List Table 5 Dark Accent 1" w:uiPriority="50"/>
+    <w:lsdException w:name="List Table 6 Colorful Accent 1" w:uiPriority="51"/>
+    <w:lsdException w:name="List Table 7 Colorful Accent 1" w:uiPriority="52"/>
+    <w:lsdException w:name="List Table 1 Light Accent 2" w:uiPriority="46"/>
+    <w:lsdException w:name="List Table 2 Accent 2" w:uiPriority="47"/>
+    <w:lsdException w:name="List Table 3 Accent 2" w:uiPriority="48"/>
+    <w:lsdException w:name="List Table 4 Accent 2" w:uiPriority="49"/>
+    <w:lsdException w:name="List Table 5 Dark Accent 2" w:uiPriority="50"/>
+    <w:lsdException w:name="List Table 6 Colorful Accent 2" w:uiPriority="51"/>
+    <w:lsdException w:name="List Table 7 Colorful Accent 2" w:uiPriority="52"/>
+    <w:lsdException w:name="List Table 1 Light Accent 3" w:uiPriority="46"/>
+    <w:lsdException w:name="List Table 2 Accent 3" w:uiPriority="47"/>
+    <w:lsdException w:name="List Table 3 Accent 3" w:uiPriority="48"/>
+    <w:lsdException w:name="List Table 4 Accent 3" w:uiPriority="49"/>
+    <w:lsdException w:name="List Table 5 Dark Accent 3" w:uiPriority="50"/>
+    <w:lsdException w:name="List Table 6 Colorful Accent 3" w:uiPriority="51"/>
+    <w:lsdException w:name="List Table 7 Colorful Accent 3" w:uiPriority="52"/>
+    <w:lsdException w:name="List Table 1 Light Accent 4" w:uiPriority="46"/>
+    <w:lsdException w:name="List Table 2 Accent 4" w:uiPriority="47"/>
+    <w:lsdException w:name="List Table 3 Accent 4" w:uiPriority="48"/>
+    <w:lsdException w:name="List Table 4 Accent 4" w:uiPriority="49"/>
+    <w:lsdException w:name="List Table 5 Dark Accent 4" w:uiPriority="50"/>
+    <w:lsdException w:name="List Table 6 Colorful Accent 4" w:uiPriority="51"/>
+    <w:lsdException w:name="List Table 7 Colorful Accent 4" w:uiPriority="52"/>
+    <w:lsdException w:name="List Table 1 Light Accent 5" w:uiPriority="46"/>
+    <w:lsdException w:name="List Table 2 Accent 5" w:uiPriority="47"/>
+    <w:lsdException w:name="List Table 3 Accent 5" w:uiPriority="48"/>
+    <w:lsdException w:name="List Table 4 Accent 5" w:uiPriority="49"/>
+    <w:lsdException w:name="List Table 5 Dark Accent 5" w:uiPriority="50"/>
+    <w:lsdException w:name="List Table 6 Colorful Accent 5" w:uiPriority="51"/>
+    <w:lsdException w:name="List Table 7 Colorful Accent 5" w:uiPriority="52"/>
+    <w:lsdException w:name="List Table 1 Light Accent 6" w:uiPriority="46"/>
+    <w:lsdException w:name="List Table 2 Accent 6" w:uiPriority="47"/>
+    <w:lsdException w:name="List Table 3 Accent 6" w:uiPriority="48"/>
+    <w:lsdException w:name="List Table 4 Accent 6" w:uiPriority="49"/>
+    <w:lsdException w:name="List Table 5 Dark Accent 6" w:uiPriority="50"/>
+    <w:lsdException w:name="List Table 6 Colorful Accent 6" w:uiPriority="51"/>
+    <w:lsdException w:name="List Table 7 Colorful Accent 6" w:uiPriority="52"/>
+  </w:latentStyles>
+  <w:style w:type="paragraph" w:default="1" w:styleId="Normal">
+    <w:name w:val="Normal"/>
+    <w:qFormat/>
+  </w:style>
+  <w:style w:type="character" w:default="1" w:styleId="Fuentedeprrafopredeter">
+    <w:name w:val="Default Paragraph Font"/>
+    <w:uiPriority w:val="1"/>
+    <w:semiHidden/>
+    <w:unhideWhenUsed/>
+  </w:style>
+  <w:style w:type="table" w:default="1" w:styleId="Tablanormal">
+    <w:name w:val="Normal Table"/>
+    <w:uiPriority w:val="99"/>
+    <w:semiHidden/>
+    <w:unhideWhenUsed/>
+    <w:tblPr>
+      <w:tblInd w:w="0" w:type="dxa"/>
+      <w:tblCellMar>
+        <w:top w:w="0" w:type="dxa"/>
+        <w:left w:w="108" w:type="dxa"/>
+        <w:bottom w:w="0" w:type="dxa"/>
+        <w:right w:w="108" w:type="dxa"/>
+      </w:tblCellMar>
+    </w:tblPr>
+  </w:style>
+  <w:style w:type="numbering" w:default="1" w:styleId="Sinlista">
+    <w:name w:val="No List"/>
+    <w:uiPriority w:val="99"/>
+    <w:semiHidden/>
+    <w:unhideWhenUsed/>
+  </w:style>
+  <w:style w:type="character" w:styleId="Textodelmarcadordeposicin">
+    <w:name w:val="Placeholder Text"/>
+    <w:basedOn w:val="Fuentedeprrafopredeter"/>
+    <w:uiPriority w:val="99"/>
+    <w:semiHidden/>
+    <w:rsid w:val="00EB55B8"/>
+    <w:rPr>
+      <w:color w:val="808080"/>
+    </w:rPr>
+  </w:style>
+</w:styles>
+</file>
+
+<file path=word/glossary/webSettings.xml><?xml version="1.0" encoding="utf-8"?>
+<w:webSettings xmlns:mc="http://schemas.openxmlformats.org/markup-compatibility/2006" xmlns:r="http://schemas.openxmlformats.org/officeDocument/2006/relationships" xmlns:w="http://schemas.openxmlformats.org/wordprocessingml/2006/main" xmlns:w14="http://schemas.microsoft.com/office/word/2010/wordml" xmlns:w15="http://schemas.microsoft.com/office/word/2012/wordml" xmlns:w16se="http://schemas.microsoft.com/office/word/2015/wordml/symex" mc:Ignorable="w14 w15 w16se">
+  <w:optimizeForBrowser/>
+  <w:allowPNG/>
+</w:webSettings>
 </file>
 
 <file path=word/theme/theme1.xml><?xml version="1.0" encoding="utf-8"?>
@@ -2883,7 +4919,7 @@
 </file>
 
 <file path=customXml/itemProps1.xml><?xml version="1.0" encoding="utf-8"?>
-<ds:datastoreItem xmlns:ds="http://schemas.openxmlformats.org/officeDocument/2006/customXml" ds:itemID="{222DF934-FDBF-4FF1-B9D2-55FA54C0083B}">
+<ds:datastoreItem xmlns:ds="http://schemas.openxmlformats.org/officeDocument/2006/customXml" ds:itemID="{621E8E16-45D9-436B-86C6-BE3938164C19}">
   <ds:schemaRefs>
     <ds:schemaRef ds:uri="http://schemas.openxmlformats.org/officeDocument/2006/bibliography"/>
   </ds:schemaRefs>

</xml_diff>

<commit_message>
Correcciones menores item 2
</commit_message>
<xml_diff>
--- a/Entregable.docx
+++ b/Entregable.docx
@@ -247,7 +247,7 @@
           <w:r>
             <w:fldChar w:fldCharType="separate"/>
           </w:r>
-          <w:hyperlink w:anchor="_Toc226960429" w:history="1">
+          <w:hyperlink w:anchor="_Toc227051875" w:history="1">
             <w:r>
               <w:rPr>
                 <w:rStyle w:val="Hipervnculo"/>
@@ -274,7 +274,7 @@
                 <w:noProof/>
                 <w:webHidden/>
               </w:rPr>
-              <w:instrText xml:space="preserve"> PAGEREF _Toc226960429 \h </w:instrText>
+              <w:instrText xml:space="preserve"> PAGEREF _Toc227051875 \h </w:instrText>
             </w:r>
             <w:r>
               <w:rPr>
@@ -318,7 +318,7 @@
               <w:lang w:eastAsia="es-AR"/>
             </w:rPr>
           </w:pPr>
-          <w:hyperlink w:anchor="_Toc226960430" w:history="1">
+          <w:hyperlink w:anchor="_Toc227051876" w:history="1">
             <w:r>
               <w:rPr>
                 <w:rStyle w:val="Hipervnculo"/>
@@ -345,7 +345,7 @@
                 <w:noProof/>
                 <w:webHidden/>
               </w:rPr>
-              <w:instrText xml:space="preserve"> PAGEREF _Toc226960430 \h </w:instrText>
+              <w:instrText xml:space="preserve"> PAGEREF _Toc227051876 \h </w:instrText>
             </w:r>
             <w:r>
               <w:rPr>
@@ -383,44 +383,19 @@
               <w:tab w:val="right" w:leader="dot" w:pos="8494"/>
             </w:tabs>
             <w:rPr>
+              <w:rFonts w:asciiTheme="minorHAnsi" w:eastAsiaTheme="minorEastAsia" w:hAnsiTheme="minorHAnsi"/>
               <w:noProof/>
+              <w:sz w:val="22"/>
+              <w:lang w:eastAsia="es-AR"/>
             </w:rPr>
           </w:pPr>
-          <w:hyperlink w:anchor="_Toc226960431" w:history="1">
+          <w:hyperlink w:anchor="_Toc227051877" w:history="1">
             <w:r>
               <w:rPr>
                 <w:rStyle w:val="Hipervnculo"/>
                 <w:noProof/>
               </w:rPr>
-              <w:t>Anális</w:t>
-            </w:r>
-            <w:r>
-              <w:rPr>
-                <w:rStyle w:val="Hipervnculo"/>
-                <w:noProof/>
-              </w:rPr>
-              <w:t>i</w:t>
-            </w:r>
-            <w:r>
-              <w:rPr>
-                <w:rStyle w:val="Hipervnculo"/>
-                <w:noProof/>
-              </w:rPr>
-              <w:t>s</w:t>
-            </w:r>
-            <w:r>
-              <w:rPr>
-                <w:rStyle w:val="Hipervnculo"/>
-                <w:noProof/>
-              </w:rPr>
-              <w:t xml:space="preserve"> </w:t>
-            </w:r>
-            <w:r>
-              <w:rPr>
-                <w:rStyle w:val="Hipervnculo"/>
-                <w:noProof/>
-              </w:rPr>
-              <w:t>señal 1:</w:t>
+              <w:t>Análisis señal 1:</w:t>
             </w:r>
             <w:r>
               <w:rPr>
@@ -441,7 +416,7 @@
                 <w:noProof/>
                 <w:webHidden/>
               </w:rPr>
-              <w:instrText xml:space="preserve"> PAGEREF _Toc226960431 \h </w:instrText>
+              <w:instrText xml:space="preserve"> PAGEREF _Toc227051877 \h </w:instrText>
             </w:r>
             <w:r>
               <w:rPr>
@@ -479,10 +454,13 @@
               <w:tab w:val="right" w:leader="dot" w:pos="8494"/>
             </w:tabs>
             <w:rPr>
+              <w:rFonts w:asciiTheme="minorHAnsi" w:eastAsiaTheme="minorEastAsia" w:hAnsiTheme="minorHAnsi"/>
               <w:noProof/>
+              <w:sz w:val="22"/>
+              <w:lang w:eastAsia="es-AR"/>
             </w:rPr>
           </w:pPr>
-          <w:hyperlink w:anchor="_Toc226960432" w:history="1">
+          <w:hyperlink w:anchor="_Toc227051878" w:history="1">
             <w:r>
               <w:rPr>
                 <w:rStyle w:val="Hipervnculo"/>
@@ -509,7 +487,7 @@
                 <w:noProof/>
                 <w:webHidden/>
               </w:rPr>
-              <w:instrText xml:space="preserve"> PAGEREF _Toc226960432 \h </w:instrText>
+              <w:instrText xml:space="preserve"> PAGEREF _Toc227051878 \h </w:instrText>
             </w:r>
             <w:r>
               <w:rPr>
@@ -529,7 +507,7 @@
                 <w:noProof/>
                 <w:webHidden/>
               </w:rPr>
-              <w:t>7</w:t>
+              <w:t>6</w:t>
             </w:r>
             <w:r>
               <w:rPr>
@@ -553,7 +531,7 @@
               <w:lang w:eastAsia="es-AR"/>
             </w:rPr>
           </w:pPr>
-          <w:hyperlink w:anchor="_Toc226960433" w:history="1">
+          <w:hyperlink w:anchor="_Toc227051879" w:history="1">
             <w:r>
               <w:rPr>
                 <w:rStyle w:val="Hipervnculo"/>
@@ -580,7 +558,7 @@
                 <w:noProof/>
                 <w:webHidden/>
               </w:rPr>
-              <w:instrText xml:space="preserve"> PAGEREF _Toc226960433 \h </w:instrText>
+              <w:instrText xml:space="preserve"> PAGEREF _Toc227051879 \h </w:instrText>
             </w:r>
             <w:r>
               <w:rPr>
@@ -600,7 +578,78 @@
                 <w:noProof/>
                 <w:webHidden/>
               </w:rPr>
-              <w:t>8</w:t>
+              <w:t>7</w:t>
+            </w:r>
+            <w:r>
+              <w:rPr>
+                <w:noProof/>
+                <w:webHidden/>
+              </w:rPr>
+              <w:fldChar w:fldCharType="end"/>
+            </w:r>
+          </w:hyperlink>
+        </w:p>
+        <w:p>
+          <w:pPr>
+            <w:pStyle w:val="TDC1"/>
+            <w:tabs>
+              <w:tab w:val="right" w:leader="dot" w:pos="8494"/>
+            </w:tabs>
+            <w:rPr>
+              <w:rFonts w:asciiTheme="minorHAnsi" w:eastAsiaTheme="minorEastAsia" w:hAnsiTheme="minorHAnsi"/>
+              <w:noProof/>
+              <w:sz w:val="22"/>
+              <w:lang w:eastAsia="es-AR"/>
+            </w:rPr>
+          </w:pPr>
+          <w:hyperlink w:anchor="_Toc227051880" w:history="1">
+            <w:r>
+              <w:rPr>
+                <w:rStyle w:val="Hipervnculo"/>
+                <w:noProof/>
+              </w:rPr>
+              <w:t>Inciso 3</w:t>
+            </w:r>
+            <w:r>
+              <w:rPr>
+                <w:noProof/>
+                <w:webHidden/>
+              </w:rPr>
+              <w:tab/>
+            </w:r>
+            <w:r>
+              <w:rPr>
+                <w:noProof/>
+                <w:webHidden/>
+              </w:rPr>
+              <w:fldChar w:fldCharType="begin"/>
+            </w:r>
+            <w:r>
+              <w:rPr>
+                <w:noProof/>
+                <w:webHidden/>
+              </w:rPr>
+              <w:instrText xml:space="preserve"> PAGEREF _Toc227051880 \h </w:instrText>
+            </w:r>
+            <w:r>
+              <w:rPr>
+                <w:noProof/>
+                <w:webHidden/>
+              </w:rPr>
+            </w:r>
+            <w:r>
+              <w:rPr>
+                <w:noProof/>
+                <w:webHidden/>
+              </w:rPr>
+              <w:fldChar w:fldCharType="separate"/>
+            </w:r>
+            <w:r>
+              <w:rPr>
+                <w:noProof/>
+                <w:webHidden/>
+              </w:rPr>
+              <w:t>13</w:t>
             </w:r>
             <w:r>
               <w:rPr>
@@ -633,7 +682,7 @@
       <w:pPr>
         <w:pStyle w:val="Ttulo1"/>
       </w:pPr>
-      <w:bookmarkStart w:id="0" w:name="_Toc226960429"/>
+      <w:bookmarkStart w:id="0" w:name="_Toc227051875"/>
       <w:r>
         <w:lastRenderedPageBreak/>
         <w:t>Introducción</w:t>
@@ -655,7 +704,7 @@
       <w:pPr>
         <w:pStyle w:val="Ttulo1"/>
       </w:pPr>
-      <w:bookmarkStart w:id="1" w:name="_Toc226960430"/>
+      <w:bookmarkStart w:id="1" w:name="_Toc227051876"/>
       <w:r>
         <w:t>Inciso 1</w:t>
       </w:r>
@@ -765,7 +814,7 @@
             <v:path o:extrusionok="f" gradientshapeok="t" o:connecttype="rect"/>
             <o:lock v:ext="edit" aspectratio="t"/>
           </v:shapetype>
-          <v:shape id="_x0000_i1025" type="#_x0000_t75" style="width:436.7pt;height:225.35pt">
+          <v:shape id="_x0000_i1025" type="#_x0000_t75" style="width:437pt;height:225.5pt">
             <v:imagedata r:id="rId8" o:title="Señal_1_ruidosa" croptop="4745f" cropbottom="3269f" cropleft="4145f" cropright="4888f"/>
           </v:shape>
         </w:pict>
@@ -779,27 +828,14 @@
       <w:r>
         <w:t xml:space="preserve">Tabla </w:t>
       </w:r>
-      <w:r>
-        <w:fldChar w:fldCharType="begin"/>
-      </w:r>
-      <w:r>
-        <w:instrText xml:space="preserve"> SEQ Tabla \* ARABIC </w:instrText>
-      </w:r>
-      <w:r>
-        <w:fldChar w:fldCharType="separate"/>
-      </w:r>
-      <w:r>
-        <w:rPr>
-          <w:noProof/>
-        </w:rPr>
-        <w:t>1</w:t>
-      </w:r>
-      <w:r>
-        <w:rPr>
-          <w:noProof/>
-        </w:rPr>
-        <w:fldChar w:fldCharType="end"/>
-      </w:r>
+      <w:fldSimple w:instr=" SEQ Tabla \* ARABIC ">
+        <w:r>
+          <w:rPr>
+            <w:noProof/>
+          </w:rPr>
+          <w:t>1</w:t>
+        </w:r>
+      </w:fldSimple>
       <w:r>
         <w:t xml:space="preserve"> sirena 1 sin ningún filtro</w:t>
       </w:r>
@@ -811,7 +847,7 @@
       <w:r>
         <w:lastRenderedPageBreak/>
         <w:pict w14:anchorId="29715E25">
-          <v:shape id="_x0000_i1026" type="#_x0000_t75" style="width:432.45pt;height:228.15pt">
+          <v:shape id="_x0000_i1026" type="#_x0000_t75" style="width:432.5pt;height:228pt">
             <v:imagedata r:id="rId9" o:title="Señal_2_ruidosa" croptop="4730f" cropbottom="2783f" cropleft="4556f" cropright="5226f"/>
           </v:shape>
         </w:pict>
@@ -825,27 +861,14 @@
       <w:r>
         <w:t xml:space="preserve">Tabla </w:t>
       </w:r>
-      <w:r>
-        <w:fldChar w:fldCharType="begin"/>
-      </w:r>
-      <w:r>
-        <w:instrText xml:space="preserve"> SEQ Tabla \* ARABIC </w:instrText>
-      </w:r>
-      <w:r>
-        <w:fldChar w:fldCharType="separate"/>
-      </w:r>
-      <w:r>
-        <w:rPr>
-          <w:noProof/>
-        </w:rPr>
-        <w:t>2</w:t>
-      </w:r>
-      <w:r>
-        <w:rPr>
-          <w:noProof/>
-        </w:rPr>
-        <w:fldChar w:fldCharType="end"/>
-      </w:r>
+      <w:fldSimple w:instr=" SEQ Tabla \* ARABIC ">
+        <w:r>
+          <w:rPr>
+            <w:noProof/>
+          </w:rPr>
+          <w:t>2</w:t>
+        </w:r>
+      </w:fldSimple>
       <w:r>
         <w:t xml:space="preserve"> sirena 2 sin ningún filtro</w:t>
       </w:r>
@@ -963,7 +986,7 @@
       <w:r>
         <w:lastRenderedPageBreak/>
         <w:pict w14:anchorId="5DEE665F">
-          <v:shape id="_x0000_i1027" type="#_x0000_t75" style="width:425pt;height:229.55pt">
+          <v:shape id="_x0000_i1027" type="#_x0000_t75" style="width:425pt;height:229.5pt">
             <v:imagedata r:id="rId10" o:title="Sirena1_Original" croptop="22023f"/>
           </v:shape>
         </w:pict>
@@ -977,27 +1000,14 @@
       <w:r>
         <w:t xml:space="preserve">Tabla </w:t>
       </w:r>
-      <w:r>
-        <w:fldChar w:fldCharType="begin"/>
-      </w:r>
-      <w:r>
-        <w:instrText xml:space="preserve"> SEQ Tabla \* ARABIC </w:instrText>
-      </w:r>
-      <w:r>
-        <w:fldChar w:fldCharType="separate"/>
-      </w:r>
-      <w:r>
-        <w:rPr>
-          <w:noProof/>
-        </w:rPr>
-        <w:t>3</w:t>
-      </w:r>
-      <w:r>
-        <w:rPr>
-          <w:noProof/>
-        </w:rPr>
-        <w:fldChar w:fldCharType="end"/>
-      </w:r>
+      <w:fldSimple w:instr=" SEQ Tabla \* ARABIC ">
+        <w:r>
+          <w:rPr>
+            <w:noProof/>
+          </w:rPr>
+          <w:t>3</w:t>
+        </w:r>
+      </w:fldSimple>
       <w:r>
         <w:t>: gráficos</w:t>
       </w:r>
@@ -1033,27 +1043,14 @@
       <w:r>
         <w:t xml:space="preserve">Tabla </w:t>
       </w:r>
-      <w:r>
-        <w:fldChar w:fldCharType="begin"/>
-      </w:r>
-      <w:r>
-        <w:instrText xml:space="preserve"> SEQ Tabla \* ARABIC </w:instrText>
-      </w:r>
-      <w:r>
-        <w:fldChar w:fldCharType="separate"/>
-      </w:r>
-      <w:r>
-        <w:rPr>
-          <w:noProof/>
-        </w:rPr>
-        <w:t>4</w:t>
-      </w:r>
-      <w:r>
-        <w:rPr>
-          <w:noProof/>
-        </w:rPr>
-        <w:fldChar w:fldCharType="end"/>
-      </w:r>
+      <w:fldSimple w:instr=" SEQ Tabla \* ARABIC ">
+        <w:r>
+          <w:rPr>
+            <w:noProof/>
+          </w:rPr>
+          <w:t>4</w:t>
+        </w:r>
+      </w:fldSimple>
       <w:r>
         <w:t>: g</w:t>
       </w:r>
@@ -1088,7 +1085,7 @@
       <w:pPr>
         <w:pStyle w:val="Ttulo2"/>
       </w:pPr>
-      <w:bookmarkStart w:id="2" w:name="_Toc226960431"/>
+      <w:bookmarkStart w:id="2" w:name="_Toc227051877"/>
       <w:r>
         <w:lastRenderedPageBreak/>
         <w:t>Análisis señal 1:</w:t>
@@ -1277,7 +1274,7 @@
       <w:pPr>
         <w:pStyle w:val="Ttulo2"/>
       </w:pPr>
-      <w:bookmarkStart w:id="3" w:name="_Toc226960432"/>
+      <w:bookmarkStart w:id="3" w:name="_Toc227051878"/>
       <w:r>
         <w:t>Análisis señal 2:</w:t>
       </w:r>
@@ -1666,7 +1663,7 @@
       <w:pPr>
         <w:pStyle w:val="Ttulo1"/>
       </w:pPr>
-      <w:bookmarkStart w:id="4" w:name="_Toc226960433"/>
+      <w:bookmarkStart w:id="4" w:name="_Toc227051879"/>
       <w:r>
         <w:t>Inciso 2</w:t>
       </w:r>
@@ -1682,103 +1679,67 @@
         <w:rPr>
           <w:b/>
         </w:rPr>
-        <w:t>“</w:t>
+        <w:t>“Realizar una FFT de la sirena 1. Luego compare esa se</w:t>
       </w:r>
       <w:r>
         <w:rPr>
           <w:b/>
         </w:rPr>
-        <w:t>Realizar una FFT de la sirena 1. Luego compare esa se</w:t>
+        <w:t>ñ</w:t>
       </w:r>
       <w:r>
         <w:rPr>
           <w:b/>
         </w:rPr>
-        <w:t>ñ</w:t>
+        <w:t xml:space="preserve">al con una FFT en ventanas temporales más pequeñas </w:t>
       </w:r>
       <w:r>
         <w:rPr>
           <w:b/>
         </w:rPr>
-        <w:t>al con una</w:t>
+        <w:t xml:space="preserve">(de 0.5 segundos). </w:t>
       </w:r>
       <w:r>
         <w:rPr>
           <w:b/>
         </w:rPr>
-        <w:t xml:space="preserve"> FFT en ventanas temporales más </w:t>
+        <w:t>¿Qué</w:t>
       </w:r>
       <w:r>
         <w:rPr>
           <w:b/>
         </w:rPr>
-        <w:t>pequ</w:t>
+        <w:t xml:space="preserve"> efecto fí</w:t>
       </w:r>
       <w:r>
         <w:rPr>
           <w:b/>
         </w:rPr>
-        <w:t>eñ</w:t>
+        <w:t>sico est</w:t>
       </w:r>
       <w:r>
         <w:rPr>
           <w:b/>
         </w:rPr>
-        <w:t xml:space="preserve">as </w:t>
+        <w:t xml:space="preserve">á </w:t>
       </w:r>
       <w:r>
         <w:rPr>
           <w:b/>
         </w:rPr>
-        <w:t xml:space="preserve">(de 0.5 segundos). </w:t>
+        <w:t>ocurriendo? Calcula</w:t>
       </w:r>
       <w:r>
         <w:rPr>
           <w:b/>
         </w:rPr>
-        <w:t>¿Qué</w:t>
+        <w:t xml:space="preserve">r la velocidad de la ambulancia </w:t>
       </w:r>
       <w:r>
         <w:rPr>
           <w:b/>
         </w:rPr>
-        <w:t xml:space="preserve"> efecto fí</w:t>
-      </w:r>
-      <w:r>
-        <w:rPr>
-          <w:b/>
-        </w:rPr>
-        <w:t>sico est</w:t>
-      </w:r>
-      <w:r>
-        <w:rPr>
-          <w:b/>
-        </w:rPr>
-        <w:t xml:space="preserve">á </w:t>
-      </w:r>
-      <w:r>
-        <w:rPr>
-          <w:b/>
-        </w:rPr>
-        <w:t>ocurriendo? Calcula</w:t>
-      </w:r>
-      <w:r>
-        <w:rPr>
-          <w:b/>
-        </w:rPr>
-        <w:t xml:space="preserve">r la velocidad de la ambulancia </w:t>
-      </w:r>
-      <w:r>
-        <w:rPr>
-          <w:b/>
-        </w:rPr>
-        <w:t>correspondiente a la sirena 1.</w:t>
-      </w:r>
-      <w:r>
-        <w:rPr>
-          <w:b/>
-        </w:rPr>
-        <w:t>”</w:t>
+        <w:t>correspondiente a la sirena 1.”</w:t>
       </w:r>
     </w:p>
     <w:p>
@@ -1794,9 +1755,9 @@
         </w:rPr>
         <w:lastRenderedPageBreak/>
         <w:drawing>
-          <wp:inline distT="0" distB="0" distL="0" distR="0" wp14:anchorId="6B8C550D" wp14:editId="581F31EB">
-            <wp:extent cx="5396987" cy="2918129"/>
-            <wp:effectExtent l="0" t="0" r="0" b="0"/>
+          <wp:inline distT="0" distB="0" distL="0" distR="0" wp14:anchorId="6B8C550D" wp14:editId="0DB90B4F">
+            <wp:extent cx="5396425" cy="1464338"/>
+            <wp:effectExtent l="0" t="0" r="0" b="2540"/>
             <wp:docPr id="872699206" name="Imagen 1"/>
             <wp:cNvGraphicFramePr>
               <a:graphicFrameLocks xmlns:a="http://schemas.openxmlformats.org/drawingml/2006/main" noChangeAspect="1"/>
@@ -1818,15 +1779,13 @@
                         </a:ext>
                       </a:extLst>
                     </a:blip>
-                    <a:srcRect t="33218" b="148"/>
-                    <a:stretch>
-                      <a:fillRect/>
-                    </a:stretch>
+                    <a:srcRect t="66411" b="148"/>
+                    <a:stretch/>
                   </pic:blipFill>
                   <pic:spPr bwMode="auto">
                     <a:xfrm>
                       <a:off x="0" y="0"/>
-                      <a:ext cx="5396987" cy="2918129"/>
+                      <a:ext cx="5396987" cy="1464491"/>
                     </a:xfrm>
                     <a:prstGeom prst="rect">
                       <a:avLst/>
@@ -1863,22 +1822,7 @@
         <w:t>: g</w:t>
       </w:r>
       <w:r>
-        <w:t>ráfico</w:t>
-      </w:r>
-      <w:r>
-        <w:t>s</w:t>
-      </w:r>
-      <w:r>
-        <w:t xml:space="preserve"> </w:t>
-      </w:r>
-      <w:r>
-        <w:t>FFT para la</w:t>
-      </w:r>
-      <w:r>
-        <w:t xml:space="preserve"> sirena </w:t>
-      </w:r>
-      <w:r>
-        <w:t>1.</w:t>
+        <w:t>ráficos FFT para la sirena 1.</w:t>
       </w:r>
     </w:p>
     <w:p>
@@ -1902,8 +1846,8 @@
           <w:lang w:eastAsia="es-AR"/>
         </w:rPr>
         <w:pict w14:anchorId="23E30EE8">
-          <v:shape id="_x0000_i1039" type="#_x0000_t75" style="width:428.25pt;height:357.65pt">
-            <v:imagedata r:id="rId19" o:title="COMBO_1_[0.0-1.5]"/>
+          <v:shape id="_x0000_i1029" type="#_x0000_t75" style="width:428pt;height:357.5pt">
+            <v:imagedata r:id="rId19" o:title="COMBO_1_[0.0-1"/>
           </v:shape>
         </w:pict>
       </w:r>
@@ -1929,16 +1873,7 @@
         <w:t xml:space="preserve"> g</w:t>
       </w:r>
       <w:r>
-        <w:t xml:space="preserve">ráficos </w:t>
-      </w:r>
-      <w:r>
-        <w:t>de intervalos</w:t>
-      </w:r>
-      <w:r>
-        <w:t xml:space="preserve"> sirena </w:t>
-      </w:r>
-      <w:r>
-        <w:t>1</w:t>
+        <w:t>ráficos de intervalos sirena 1</w:t>
       </w:r>
     </w:p>
     <w:p>
@@ -1949,8 +1884,8 @@
         </w:rPr>
         <w:lastRenderedPageBreak/>
         <w:pict w14:anchorId="641FEB04">
-          <v:shape id="_x0000_i1042" type="#_x0000_t75" style="width:428.25pt;height:331pt">
-            <v:imagedata r:id="rId20" o:title="COMBO_2_[1.5-3.0]"/>
+          <v:shape id="_x0000_i1030" type="#_x0000_t75" style="width:428pt;height:331pt">
+            <v:imagedata r:id="rId20" o:title="COMBO_2_[1.5-3"/>
           </v:shape>
         </w:pict>
       </w:r>
@@ -1962,8 +1897,8 @@
           <w:lang w:eastAsia="es-AR"/>
         </w:rPr>
         <w:pict w14:anchorId="4B8EAB87">
-          <v:shape id="_x0000_i1044" type="#_x0000_t75" style="width:428.25pt;height:335.7pt">
-            <v:imagedata r:id="rId21" o:title="COMBO_3_[3.0-4.5]"/>
+          <v:shape id="_x0000_i1031" type="#_x0000_t75" style="width:428pt;height:335.5pt">
+            <v:imagedata r:id="rId21" o:title="COMBO_3_[3.0-4"/>
           </v:shape>
         </w:pict>
       </w:r>
@@ -2012,8 +1947,8 @@
         </w:rPr>
         <w:lastRenderedPageBreak/>
         <w:pict w14:anchorId="032CAD07">
-          <v:shape id="_x0000_i1049" type="#_x0000_t75" style="width:428.25pt;height:331pt">
-            <v:imagedata r:id="rId22" o:title="COMBO_4_[4.5-6.0]"/>
+          <v:shape id="_x0000_i1032" type="#_x0000_t75" style="width:428pt;height:331pt">
+            <v:imagedata r:id="rId22" o:title="COMBO_4_[4.5-6"/>
           </v:shape>
         </w:pict>
       </w:r>
@@ -2025,8 +1960,8 @@
           <w:lang w:eastAsia="es-AR"/>
         </w:rPr>
         <w:pict w14:anchorId="4B5A85F2">
-          <v:shape id="_x0000_i1051" type="#_x0000_t75" style="width:428.25pt;height:333.35pt">
-            <v:imagedata r:id="rId23" o:title="COMBO_5_[6.0-7.5]"/>
+          <v:shape id="_x0000_i1033" type="#_x0000_t75" style="width:428pt;height:333.5pt">
+            <v:imagedata r:id="rId23" o:title="COMBO_5_[6.0-7"/>
           </v:shape>
         </w:pict>
       </w:r>
@@ -2046,19 +1981,7 @@
         <w:t>:</w:t>
       </w:r>
       <w:r>
-        <w:t xml:space="preserve"> Los</w:t>
-      </w:r>
-      <w:r>
-        <w:t xml:space="preserve"> siguientes</w:t>
-      </w:r>
-      <w:r>
-        <w:t xml:space="preserve"> 6 intervalos </w:t>
-      </w:r>
-      <w:r>
-        <w:t>de</w:t>
-      </w:r>
-      <w:r>
-        <w:t xml:space="preserve"> la sirena 1</w:t>
+        <w:t xml:space="preserve"> Los siguientes 6 intervalos de la sirena 1</w:t>
       </w:r>
     </w:p>
     <w:p>
@@ -2069,8 +1992,8 @@
         </w:rPr>
         <w:lastRenderedPageBreak/>
         <w:pict w14:anchorId="2F5547F3">
-          <v:shape id="_x0000_i1056" type="#_x0000_t75" style="width:428.25pt;height:120.15pt">
-            <v:imagedata r:id="rId24" o:title="COMBO_6_[7.5-8.0]" cropbottom="43396f"/>
+          <v:shape id="_x0000_i1034" type="#_x0000_t75" style="width:428pt;height:120pt">
+            <v:imagedata r:id="rId24" o:title="COMBO_6_[7.5-8" cropbottom="43396f"/>
           </v:shape>
         </w:pict>
       </w:r>
@@ -2090,13 +2013,7 @@
         <w:t>:</w:t>
       </w:r>
       <w:r>
-        <w:t xml:space="preserve"> </w:t>
-      </w:r>
-      <w:r>
-        <w:t>último intervalo</w:t>
-      </w:r>
-      <w:r>
-        <w:t xml:space="preserve"> la sirena 1</w:t>
+        <w:t xml:space="preserve"> último intervalo la sirena 1</w:t>
       </w:r>
     </w:p>
     <w:p>
@@ -2175,15 +2092,7 @@
               <w:sz w:val="24"/>
               <w:szCs w:val="24"/>
             </w:rPr>
-            <m:t>f</m:t>
-          </m:r>
-          <m:r>
-            <w:rPr>
-              <w:rFonts w:ascii="Cambria Math" w:hAnsi="Cambria Math"/>
-              <w:sz w:val="24"/>
-              <w:szCs w:val="24"/>
-            </w:rPr>
-            <m:t>=</m:t>
+            <m:t>f=</m:t>
           </m:r>
           <m:d>
             <m:dPr>
@@ -2215,15 +2124,7 @@
                       <w:sz w:val="24"/>
                       <w:szCs w:val="24"/>
                     </w:rPr>
-                    <m:t>v</m:t>
-                  </m:r>
-                  <m:r>
-                    <w:rPr>
-                      <w:rFonts w:ascii="Cambria Math" w:hAnsi="Cambria Math"/>
-                      <w:sz w:val="24"/>
-                      <w:szCs w:val="24"/>
-                    </w:rPr>
-                    <m:t>±</m:t>
+                    <m:t>v±</m:t>
                   </m:r>
                   <m:sSub>
                     <m:sSubPr>
@@ -2265,15 +2166,7 @@
                       <w:sz w:val="24"/>
                       <w:szCs w:val="24"/>
                     </w:rPr>
-                    <m:t>v</m:t>
-                  </m:r>
-                  <m:r>
-                    <w:rPr>
-                      <w:rFonts w:ascii="Cambria Math" w:hAnsi="Cambria Math"/>
-                      <w:sz w:val="24"/>
-                      <w:szCs w:val="24"/>
-                    </w:rPr>
-                    <m:t>±</m:t>
+                    <m:t>v±</m:t>
                   </m:r>
                   <m:sSub>
                     <m:sSubPr>
@@ -2492,14 +2385,7 @@
           <w:rFonts w:eastAsiaTheme="minorEastAsia"/>
           <w:szCs w:val="28"/>
         </w:rPr>
-        <w:t xml:space="preserve">Frecuencia </w:t>
-      </w:r>
-      <w:r>
-        <w:rPr>
-          <w:rFonts w:eastAsiaTheme="minorEastAsia"/>
-          <w:szCs w:val="28"/>
-        </w:rPr>
-        <w:t xml:space="preserve">emitida </w:t>
+        <w:t xml:space="preserve">Frecuencia emitida </w:t>
       </w:r>
       <w:r>
         <w:rPr>
@@ -2659,19 +2545,7 @@
         <w:rPr>
           <w:rFonts w:eastAsiaTheme="minorEastAsia"/>
         </w:rPr>
-        <w:t>)(</w:t>
-      </w:r>
-      <w:r>
-        <w:rPr>
-          <w:rFonts w:eastAsiaTheme="minorEastAsia"/>
-        </w:rPr>
-        <w:t>en nuestro caso 0</w:t>
-      </w:r>
-      <w:r>
-        <w:rPr>
-          <w:rFonts w:eastAsiaTheme="minorEastAsia"/>
-        </w:rPr>
-        <w:t>)</w:t>
+        <w:t>)(en nuestro caso 0)</w:t>
       </w:r>
     </w:p>
     <w:p>
@@ -2786,7 +2660,22 @@
         <w:rPr>
           <w:rFonts w:eastAsiaTheme="minorEastAsia"/>
         </w:rPr>
-        <w:t>, pero como no sabíamos la frecuencia real de la sirena, hicimos que la frecuencia real sea un promedio de todas las frecuencias pico tomadas en todos los intervalos de tiempo que analizamos.</w:t>
+        <w:t xml:space="preserve">, pero como no sabíamos la frecuencia real de la sirena, </w:t>
+      </w:r>
+      <w:r>
+        <w:rPr>
+          <w:rFonts w:eastAsiaTheme="minorEastAsia"/>
+          <w:highlight w:val="yellow"/>
+        </w:rPr>
+        <w:t>hicimos que la frecuencia real sea un promedio de todas las frecuencias pico tomadas en todos los intervalos de tiempo que analizamos</w:t>
+      </w:r>
+      <w:bookmarkStart w:id="5" w:name="_GoBack"/>
+      <w:bookmarkEnd w:id="5"/>
+      <w:r>
+        <w:rPr>
+          <w:rFonts w:eastAsiaTheme="minorEastAsia"/>
+        </w:rPr>
+        <w:t>.</w:t>
       </w:r>
       <w:r>
         <w:rPr>
@@ -2825,7 +2714,7 @@
           <w:rFonts w:eastAsiaTheme="minorEastAsia"/>
         </w:rPr>
         <w:pict w14:anchorId="50FFDA21">
-          <v:shape id="_x0000_i1068" type="#_x0000_t75" style="width:230.5pt;height:180.95pt">
+          <v:shape id="_x0000_i1035" type="#_x0000_t75" style="width:230.5pt;height:181pt">
             <v:imagedata r:id="rId25" o:title="Fpico por intervalo"/>
           </v:shape>
         </w:pict>
@@ -2843,10 +2732,7 @@
         <w:t>:</w:t>
       </w:r>
       <w:r>
-        <w:t xml:space="preserve"> </w:t>
-      </w:r>
-      <w:r>
-        <w:t>Frecuencia pico para cada intervalo.</w:t>
+        <w:t xml:space="preserve"> Frecuencia pico para cada intervalo.</w:t>
       </w:r>
     </w:p>
     <w:p>
@@ -2931,19 +2817,13 @@
         <w:jc w:val="center"/>
       </w:pPr>
       <w:r>
-        <w:t>O</w:t>
-      </w:r>
-      <w:r>
-        <w:t>utput 2</w:t>
+        <w:t>Output 2</w:t>
       </w:r>
       <w:r>
         <w:t>:</w:t>
       </w:r>
       <w:r>
-        <w:t xml:space="preserve"> </w:t>
-      </w:r>
-      <w:r>
-        <w:t>Frecuencia mínima, máxima y promedio.</w:t>
+        <w:t xml:space="preserve"> Frecuencia mínima, máxima y promedio.</w:t>
       </w:r>
     </w:p>
     <w:p>
@@ -2970,7 +2850,7 @@
           <w:rFonts w:eastAsiaTheme="minorEastAsia"/>
         </w:rPr>
         <w:pict w14:anchorId="08F07425">
-          <v:shape id="_x0000_i1073" type="#_x0000_t75" style="width:425pt;height:150.1pt">
+          <v:shape id="_x0000_i1036" type="#_x0000_t75" style="width:425pt;height:150pt">
             <v:imagedata r:id="rId27" o:title="vel acercamiento" cropbottom="2105f"/>
           </v:shape>
         </w:pict>
@@ -2982,22 +2862,13 @@
         <w:jc w:val="center"/>
       </w:pPr>
       <w:r>
-        <w:t xml:space="preserve">Output </w:t>
-      </w:r>
-      <w:r>
-        <w:t>3</w:t>
+        <w:t>Output 3</w:t>
       </w:r>
       <w:r>
         <w:t>:</w:t>
       </w:r>
       <w:r>
-        <w:t xml:space="preserve"> </w:t>
-      </w:r>
-      <w:r>
-        <w:t>Velocidades de acercamiento por intervalos</w:t>
-      </w:r>
-      <w:r>
-        <w:t>.</w:t>
+        <w:t xml:space="preserve"> Velocidades de acercamiento por intervalos.</w:t>
       </w:r>
     </w:p>
     <w:p>
@@ -3012,7 +2883,7 @@
         </w:rPr>
         <w:lastRenderedPageBreak/>
         <w:pict w14:anchorId="6107C5EC">
-          <v:shape id="_x0000_i1078" type="#_x0000_t75" style="width:425pt;height:161.3pt">
+          <v:shape id="_x0000_i1037" type="#_x0000_t75" style="width:425pt;height:161.5pt">
             <v:imagedata r:id="rId28" o:title="vel alejamiento"/>
           </v:shape>
         </w:pict>
@@ -3024,22 +2895,13 @@
         <w:jc w:val="center"/>
       </w:pPr>
       <w:r>
-        <w:t xml:space="preserve">Output </w:t>
-      </w:r>
-      <w:r>
-        <w:t>4</w:t>
+        <w:t>Output 4</w:t>
       </w:r>
       <w:r>
         <w:t>:</w:t>
       </w:r>
       <w:r>
-        <w:t xml:space="preserve"> Velocidades de </w:t>
-      </w:r>
-      <w:r>
-        <w:t>alejamiento</w:t>
-      </w:r>
-      <w:r>
-        <w:t xml:space="preserve"> por intervalos.</w:t>
+        <w:t xml:space="preserve"> Velocidades de alejamiento por intervalos.</w:t>
       </w:r>
     </w:p>
     <w:p>
@@ -3072,7 +2934,7 @@
           <w:rFonts w:eastAsiaTheme="minorEastAsia"/>
         </w:rPr>
         <w:pict w14:anchorId="3660CF6F">
-          <v:shape id="_x0000_i1080" type="#_x0000_t75" style="width:425pt;height:126.7pt">
+          <v:shape id="_x0000_i1038" type="#_x0000_t75" style="width:425pt;height:126.5pt">
             <v:imagedata r:id="rId29" o:title="vel promedio"/>
           </v:shape>
         </w:pict>
@@ -3084,10 +2946,7 @@
         <w:jc w:val="center"/>
       </w:pPr>
       <w:r>
-        <w:t xml:space="preserve">Output </w:t>
-      </w:r>
-      <w:r>
-        <w:t>5</w:t>
+        <w:t>Output 5</w:t>
       </w:r>
       <w:r>
         <w:t>:</w:t>
@@ -3116,23 +2975,7 @@
             <w:sz w:val="24"/>
             <w:szCs w:val="24"/>
           </w:rPr>
-          <m:t>km</m:t>
-        </m:r>
-        <m:r>
-          <w:rPr>
-            <w:rFonts w:ascii="Cambria Math" w:eastAsiaTheme="minorEastAsia" w:hAnsi="Cambria Math"/>
-            <w:sz w:val="24"/>
-            <w:szCs w:val="24"/>
-          </w:rPr>
-          <m:t>/</m:t>
-        </m:r>
-        <m:r>
-          <w:rPr>
-            <w:rFonts w:ascii="Cambria Math" w:eastAsiaTheme="minorEastAsia" w:hAnsi="Cambria Math"/>
-            <w:sz w:val="24"/>
-            <w:szCs w:val="24"/>
-          </w:rPr>
-          <m:t>h</m:t>
+          <m:t>km/h</m:t>
         </m:r>
       </m:oMath>
       <w:r>
@@ -3157,15 +3000,7 @@
             <w:sz w:val="24"/>
             <w:szCs w:val="24"/>
           </w:rPr>
-          <m:t xml:space="preserve"> </m:t>
-        </m:r>
-        <m:r>
-          <w:rPr>
-            <w:rFonts w:ascii="Cambria Math" w:eastAsiaTheme="minorEastAsia" w:hAnsi="Cambria Math"/>
-            <w:sz w:val="24"/>
-            <w:szCs w:val="24"/>
-          </w:rPr>
-          <m:t>m/s</m:t>
+          <m:t xml:space="preserve"> m/s</m:t>
         </m:r>
       </m:oMath>
       <w:r>
@@ -3182,8 +3017,6 @@
         </w:rPr>
         <w:t>.</w:t>
       </w:r>
-      <w:bookmarkStart w:id="5" w:name="_GoBack"/>
-      <w:bookmarkEnd w:id="5"/>
     </w:p>
     <w:p>
       <w:pPr>
@@ -3192,16 +3025,174 @@
           <w:rFonts w:eastAsiaTheme="minorEastAsia"/>
         </w:rPr>
       </w:pPr>
+      <w:bookmarkStart w:id="6" w:name="_Toc227051880"/>
       <w:r>
         <w:rPr>
           <w:rFonts w:eastAsiaTheme="minorEastAsia"/>
         </w:rPr>
         <w:t>Inciso 3</w:t>
+      </w:r>
+      <w:bookmarkEnd w:id="6"/>
+    </w:p>
+    <w:p>
+      <w:pPr>
+        <w:rPr>
+          <w:b/>
+        </w:rPr>
+      </w:pPr>
+      <w:r>
+        <w:rPr>
+          <w:b/>
+        </w:rPr>
+        <w:t>“</w:t>
+      </w:r>
+      <w:r>
+        <w:rPr>
+          <w:b/>
+        </w:rPr>
+        <w:t>Realizar una FFT de la sirena 2, tantos en ventanas largas como cortas</w:t>
+      </w:r>
+      <w:r>
+        <w:rPr>
+          <w:b/>
+        </w:rPr>
+        <w:t xml:space="preserve">. Describir las diferencias que </w:t>
+      </w:r>
+      <w:r>
+        <w:rPr>
+          <w:b/>
+        </w:rPr>
+        <w:t xml:space="preserve">nota respecto con el </w:t>
+      </w:r>
+      <w:r>
+        <w:rPr>
+          <w:b/>
+        </w:rPr>
+        <w:t>análisis</w:t>
+      </w:r>
+      <w:r>
+        <w:rPr>
+          <w:b/>
+        </w:rPr>
+        <w:t xml:space="preserve"> anterior. ¿Qué fenómeno impide una medició</w:t>
+      </w:r>
+      <w:r>
+        <w:rPr>
+          <w:b/>
+        </w:rPr>
+        <w:t>n precisa en esta se</w:t>
+      </w:r>
+      <w:r>
+        <w:rPr>
+          <w:rFonts w:hint="eastAsia"/>
+          <w:b/>
+        </w:rPr>
+        <w:t>ñ</w:t>
+      </w:r>
+      <w:r>
+        <w:rPr>
+          <w:b/>
+        </w:rPr>
+        <w:t>al?</w:t>
+      </w:r>
+      <w:r>
+        <w:rPr>
+          <w:b/>
+        </w:rPr>
+        <w:t>”</w:t>
+      </w:r>
+    </w:p>
+    <w:p>
+      <w:r>
+        <w:t xml:space="preserve">Como en el inciso 2, el FFT de la sirena </w:t>
+      </w:r>
+      <w:r>
+        <w:t>2 ya</w:t>
+      </w:r>
+      <w:r>
+        <w:t xml:space="preserve"> la hicimos para el inciso </w:t>
+      </w:r>
+      <w:r>
+        <w:t>1, dando el siguiente resultado:</w:t>
+      </w:r>
+    </w:p>
+    <w:p>
+      <w:r>
+        <w:rPr>
+          <w:noProof/>
+          <w:lang w:eastAsia="es-AR"/>
+        </w:rPr>
+        <w:drawing>
+          <wp:inline distT="0" distB="0" distL="0" distR="0" wp14:anchorId="68927CFB" wp14:editId="729FFA5F">
+            <wp:extent cx="5397500" cy="1435100"/>
+            <wp:effectExtent l="0" t="0" r="0" b="0"/>
+            <wp:docPr id="3" name="Imagen 3" descr="C:\Users\Pablo\AppData\Local\Microsoft\Windows\INetCache\Content.Word\Sirena2_Original.png"/>
+            <wp:cNvGraphicFramePr>
+              <a:graphicFrameLocks xmlns:a="http://schemas.openxmlformats.org/drawingml/2006/main" noChangeAspect="1"/>
+            </wp:cNvGraphicFramePr>
+            <a:graphic xmlns:a="http://schemas.openxmlformats.org/drawingml/2006/main">
+              <a:graphicData uri="http://schemas.openxmlformats.org/drawingml/2006/picture">
+                <pic:pic xmlns:pic="http://schemas.openxmlformats.org/drawingml/2006/picture">
+                  <pic:nvPicPr>
+                    <pic:cNvPr id="0" name="Picture 53" descr="C:\Users\Pablo\AppData\Local\Microsoft\Windows\INetCache\Content.Word\Sirena2_Original.png"/>
+                    <pic:cNvPicPr>
+                      <a:picLocks noChangeAspect="1" noChangeArrowheads="1"/>
+                    </pic:cNvPicPr>
+                  </pic:nvPicPr>
+                  <pic:blipFill>
+                    <a:blip r:embed="rId30" cstate="print">
+                      <a:extLst>
+                        <a:ext uri="{28A0092B-C50C-407E-A947-70E740481C1C}">
+                          <a14:useLocalDpi xmlns:a14="http://schemas.microsoft.com/office/drawing/2010/main" val="0"/>
+                        </a:ext>
+                      </a:extLst>
+                    </a:blip>
+                    <a:srcRect t="66377" b="870"/>
+                    <a:stretch>
+                      <a:fillRect/>
+                    </a:stretch>
+                  </pic:blipFill>
+                  <pic:spPr bwMode="auto">
+                    <a:xfrm>
+                      <a:off x="0" y="0"/>
+                      <a:ext cx="5397500" cy="1435100"/>
+                    </a:xfrm>
+                    <a:prstGeom prst="rect">
+                      <a:avLst/>
+                    </a:prstGeom>
+                    <a:noFill/>
+                    <a:ln>
+                      <a:noFill/>
+                    </a:ln>
+                  </pic:spPr>
+                </pic:pic>
+              </a:graphicData>
+            </a:graphic>
+          </wp:inline>
+        </w:drawing>
+      </w:r>
+    </w:p>
+    <w:p>
+      <w:pPr>
+        <w:pStyle w:val="Descripcin"/>
+        <w:jc w:val="center"/>
+      </w:pPr>
+      <w:r>
+        <w:t>Tabla 1</w:t>
+      </w:r>
+      <w:r>
+        <w:t>6</w:t>
+      </w:r>
+      <w:r>
+        <w:t>:</w:t>
+      </w:r>
+      <w:r>
+        <w:t xml:space="preserve"> Tabla FFT sirena 2 </w:t>
       </w:r>
     </w:p>
     <w:p/>
     <w:sectPr>
-      <w:footerReference w:type="default" r:id="rId30"/>
+      <w:footerReference w:type="default" r:id="rId31"/>
       <w:pgSz w:w="11906" w:h="16838"/>
       <w:pgMar w:top="1417" w:right="1701" w:bottom="1417" w:left="1701" w:header="708" w:footer="708" w:gutter="0"/>
       <w:cols w:space="708"/>
@@ -3355,7 +3346,7 @@
         <w:szCs w:val="24"/>
         <w:lang w:val="es-MX"/>
       </w:rPr>
-      <w:t>13</w:t>
+      <w:t>14</w:t>
     </w:r>
     <w:r>
       <w:rPr>
@@ -4087,538 +4078,6 @@
 </w:styles>
 </file>
 
-<file path=word/glossary/document.xml><?xml version="1.0" encoding="utf-8"?>
-<w:glossaryDocument xmlns:wpc="http://schemas.microsoft.com/office/word/2010/wordprocessingCanvas" xmlns:cx="http://schemas.microsoft.com/office/drawing/2014/chartex" xmlns:mc="http://schemas.openxmlformats.org/markup-compatibility/2006" xmlns:o="urn:schemas-microsoft-com:office:office" xmlns:r="http://schemas.openxmlformats.org/officeDocument/2006/relationships" xmlns:m="http://schemas.openxmlformats.org/officeDocument/2006/math" xmlns:v="urn:schemas-microsoft-com:vml" xmlns:wp14="http://schemas.microsoft.com/office/word/2010/wordprocessingDrawing" xmlns:wp="http://schemas.openxmlformats.org/drawingml/2006/wordprocessingDrawing" xmlns:w10="urn:schemas-microsoft-com:office:word" xmlns:w="http://schemas.openxmlformats.org/wordprocessingml/2006/main" xmlns:w14="http://schemas.microsoft.com/office/word/2010/wordml" xmlns:w15="http://schemas.microsoft.com/office/word/2012/wordml" xmlns:w16se="http://schemas.microsoft.com/office/word/2015/wordml/symex" xmlns:wpg="http://schemas.microsoft.com/office/word/2010/wordprocessingGroup" xmlns:wpi="http://schemas.microsoft.com/office/word/2010/wordprocessingInk" xmlns:wne="http://schemas.microsoft.com/office/word/2006/wordml" xmlns:wps="http://schemas.microsoft.com/office/word/2010/wordprocessingShape" mc:Ignorable="w14 w15 w16se wp14"/>
-</file>
-
-<file path=word/glossary/fontTable.xml><?xml version="1.0" encoding="utf-8"?>
-<w:fonts xmlns:mc="http://schemas.openxmlformats.org/markup-compatibility/2006" xmlns:r="http://schemas.openxmlformats.org/officeDocument/2006/relationships" xmlns:w="http://schemas.openxmlformats.org/wordprocessingml/2006/main" xmlns:w14="http://schemas.microsoft.com/office/word/2010/wordml" xmlns:w15="http://schemas.microsoft.com/office/word/2012/wordml" xmlns:w16se="http://schemas.microsoft.com/office/word/2015/wordml/symex" mc:Ignorable="w14 w15 w16se">
-  <w:font w:name="Calibri">
-    <w:panose1 w:val="020F0502020204030204"/>
-    <w:charset w:val="00"/>
-    <w:family w:val="swiss"/>
-    <w:pitch w:val="variable"/>
-    <w:sig w:usb0="E00002FF" w:usb1="4000ACFF" w:usb2="00000001" w:usb3="00000000" w:csb0="0000019F" w:csb1="00000000"/>
-  </w:font>
-  <w:font w:name="Times New Roman">
-    <w:panose1 w:val="02020603050405020304"/>
-    <w:charset w:val="00"/>
-    <w:family w:val="roman"/>
-    <w:pitch w:val="variable"/>
-    <w:sig w:usb0="E0002AFF" w:usb1="C0007843" w:usb2="00000009" w:usb3="00000000" w:csb0="000001FF" w:csb1="00000000"/>
-  </w:font>
-  <w:font w:name="Garamond">
-    <w:panose1 w:val="02020404030301010803"/>
-    <w:charset w:val="00"/>
-    <w:family w:val="roman"/>
-    <w:pitch w:val="variable"/>
-    <w:sig w:usb0="00000287" w:usb1="00000000" w:usb2="00000000" w:usb3="00000000" w:csb0="0000009F" w:csb1="00000000"/>
-  </w:font>
-  <w:font w:name="Calibri Light">
-    <w:panose1 w:val="020F0302020204030204"/>
-    <w:charset w:val="00"/>
-    <w:family w:val="swiss"/>
-    <w:pitch w:val="variable"/>
-    <w:sig w:usb0="A00002EF" w:usb1="4000207B" w:usb2="00000000" w:usb3="00000000" w:csb0="0000009F" w:csb1="00000000"/>
-  </w:font>
-  <w:font w:name="Segoe UI">
-    <w:panose1 w:val="020B0502040204020203"/>
-    <w:charset w:val="00"/>
-    <w:family w:val="swiss"/>
-    <w:pitch w:val="variable"/>
-    <w:sig w:usb0="E4002EFF" w:usb1="C000E47F" w:usb2="00000009" w:usb3="00000000" w:csb0="000001FF" w:csb1="00000000"/>
-  </w:font>
-  <w:font w:name="Cambria Math">
-    <w:panose1 w:val="02040503050406030204"/>
-    <w:charset w:val="00"/>
-    <w:family w:val="roman"/>
-    <w:pitch w:val="variable"/>
-    <w:sig w:usb0="E00006FF" w:usb1="420024FF" w:usb2="02000000" w:usb3="00000000" w:csb0="0000019F" w:csb1="00000000"/>
-  </w:font>
-</w:fonts>
-</file>
-
-<file path=word/glossary/settings.xml><?xml version="1.0" encoding="utf-8"?>
-<w:settings xmlns:mc="http://schemas.openxmlformats.org/markup-compatibility/2006" xmlns:o="urn:schemas-microsoft-com:office:office" xmlns:r="http://schemas.openxmlformats.org/officeDocument/2006/relationships" xmlns:m="http://schemas.openxmlformats.org/officeDocument/2006/math" xmlns:v="urn:schemas-microsoft-com:vml" xmlns:w10="urn:schemas-microsoft-com:office:word" xmlns:w="http://schemas.openxmlformats.org/wordprocessingml/2006/main" xmlns:w14="http://schemas.microsoft.com/office/word/2010/wordml" xmlns:w15="http://schemas.microsoft.com/office/word/2012/wordml" xmlns:w16se="http://schemas.microsoft.com/office/word/2015/wordml/symex" xmlns:sl="http://schemas.openxmlformats.org/schemaLibrary/2006/main" mc:Ignorable="w14 w15 w16se">
-  <w:view w:val="normal"/>
-  <w:defaultTabStop w:val="708"/>
-  <w:hyphenationZone w:val="425"/>
-  <w:characterSpacingControl w:val="doNotCompress"/>
-  <w:compat>
-    <w:useFELayout/>
-    <w:compatSetting w:name="compatibilityMode" w:uri="http://schemas.microsoft.com/office/word" w:val="15"/>
-    <w:compatSetting w:name="overrideTableStyleFontSizeAndJustification" w:uri="http://schemas.microsoft.com/office/word" w:val="1"/>
-    <w:compatSetting w:name="enableOpenTypeFeatures" w:uri="http://schemas.microsoft.com/office/word" w:val="1"/>
-    <w:compatSetting w:name="doNotFlipMirrorIndents" w:uri="http://schemas.microsoft.com/office/word" w:val="1"/>
-    <w:compatSetting w:name="differentiateMultirowTableHeaders" w:uri="http://schemas.microsoft.com/office/word" w:val="1"/>
-  </w:compat>
-  <w:rsids>
-    <w:rsidRoot w:val="00EB55B8"/>
-    <w:rsid w:val="00E97292"/>
-    <w:rsid w:val="00EB55B8"/>
-  </w:rsids>
-  <m:mathPr>
-    <m:mathFont m:val="Cambria Math"/>
-    <m:brkBin m:val="before"/>
-    <m:brkBinSub m:val="--"/>
-    <m:smallFrac m:val="0"/>
-    <m:dispDef/>
-    <m:lMargin m:val="0"/>
-    <m:rMargin m:val="0"/>
-    <m:defJc m:val="centerGroup"/>
-    <m:wrapIndent m:val="1440"/>
-    <m:intLim m:val="subSup"/>
-    <m:naryLim m:val="undOvr"/>
-  </m:mathPr>
-  <w:themeFontLang w:val="es-AR"/>
-  <w:clrSchemeMapping w:bg1="light1" w:t1="dark1" w:bg2="light2" w:t2="dark2" w:accent1="accent1" w:accent2="accent2" w:accent3="accent3" w:accent4="accent4" w:accent5="accent5" w:accent6="accent6" w:hyperlink="hyperlink" w:followedHyperlink="followedHyperlink"/>
-  <w:decimalSymbol w:val=","/>
-  <w:listSeparator w:val=";"/>
-  <w15:chartTrackingRefBased/>
-</w:settings>
-</file>
-
-<file path=word/glossary/styles.xml><?xml version="1.0" encoding="utf-8"?>
-<w:styles xmlns:mc="http://schemas.openxmlformats.org/markup-compatibility/2006" xmlns:r="http://schemas.openxmlformats.org/officeDocument/2006/relationships" xmlns:w="http://schemas.openxmlformats.org/wordprocessingml/2006/main" xmlns:w14="http://schemas.microsoft.com/office/word/2010/wordml" xmlns:w15="http://schemas.microsoft.com/office/word/2012/wordml" xmlns:w16se="http://schemas.microsoft.com/office/word/2015/wordml/symex" mc:Ignorable="w14 w15 w16se">
-  <w:docDefaults>
-    <w:rPrDefault>
-      <w:rPr>
-        <w:rFonts w:asciiTheme="minorHAnsi" w:eastAsiaTheme="minorEastAsia" w:hAnsiTheme="minorHAnsi" w:cstheme="minorBidi"/>
-        <w:sz w:val="22"/>
-        <w:szCs w:val="22"/>
-        <w:lang w:val="es-AR" w:eastAsia="es-AR" w:bidi="ar-SA"/>
-      </w:rPr>
-    </w:rPrDefault>
-    <w:pPrDefault>
-      <w:pPr>
-        <w:spacing w:after="160" w:line="259" w:lineRule="auto"/>
-      </w:pPr>
-    </w:pPrDefault>
-  </w:docDefaults>
-  <w:latentStyles w:defLockedState="0" w:defUIPriority="99" w:defSemiHidden="0" w:defUnhideWhenUsed="0" w:defQFormat="0" w:count="371">
-    <w:lsdException w:name="Normal" w:uiPriority="0" w:qFormat="1"/>
-    <w:lsdException w:name="heading 1" w:uiPriority="9" w:qFormat="1"/>
-    <w:lsdException w:name="heading 2" w:semiHidden="1" w:uiPriority="9" w:unhideWhenUsed="1" w:qFormat="1"/>
-    <w:lsdException w:name="heading 3" w:semiHidden="1" w:uiPriority="9" w:unhideWhenUsed="1" w:qFormat="1"/>
-    <w:lsdException w:name="heading 4" w:semiHidden="1" w:uiPriority="9" w:unhideWhenUsed="1" w:qFormat="1"/>
-    <w:lsdException w:name="heading 5" w:semiHidden="1" w:uiPriority="9" w:unhideWhenUsed="1" w:qFormat="1"/>
-    <w:lsdException w:name="heading 6" w:semiHidden="1" w:uiPriority="9" w:unhideWhenUsed="1" w:qFormat="1"/>
-    <w:lsdException w:name="heading 7" w:semiHidden="1" w:uiPriority="9" w:unhideWhenUsed="1" w:qFormat="1"/>
-    <w:lsdException w:name="heading 8" w:semiHidden="1" w:uiPriority="9" w:unhideWhenUsed="1" w:qFormat="1"/>
-    <w:lsdException w:name="heading 9" w:semiHidden="1" w:uiPriority="9" w:unhideWhenUsed="1" w:qFormat="1"/>
-    <w:lsdException w:name="index 1" w:semiHidden="1" w:unhideWhenUsed="1"/>
-    <w:lsdException w:name="index 2" w:semiHidden="1" w:unhideWhenUsed="1"/>
-    <w:lsdException w:name="index 3" w:semiHidden="1" w:unhideWhenUsed="1"/>
-    <w:lsdException w:name="index 4" w:semiHidden="1" w:unhideWhenUsed="1"/>
-    <w:lsdException w:name="index 5" w:semiHidden="1" w:unhideWhenUsed="1"/>
-    <w:lsdException w:name="index 6" w:semiHidden="1" w:unhideWhenUsed="1"/>
-    <w:lsdException w:name="index 7" w:semiHidden="1" w:unhideWhenUsed="1"/>
-    <w:lsdException w:name="index 8" w:semiHidden="1" w:unhideWhenUsed="1"/>
-    <w:lsdException w:name="index 9" w:semiHidden="1" w:unhideWhenUsed="1"/>
-    <w:lsdException w:name="toc 1" w:semiHidden="1" w:uiPriority="39" w:unhideWhenUsed="1"/>
-    <w:lsdException w:name="toc 2" w:semiHidden="1" w:uiPriority="39" w:unhideWhenUsed="1"/>
-    <w:lsdException w:name="toc 3" w:semiHidden="1" w:uiPriority="39" w:unhideWhenUsed="1"/>
-    <w:lsdException w:name="toc 4" w:semiHidden="1" w:uiPriority="39" w:unhideWhenUsed="1"/>
-    <w:lsdException w:name="toc 5" w:semiHidden="1" w:uiPriority="39" w:unhideWhenUsed="1"/>
-    <w:lsdException w:name="toc 6" w:semiHidden="1" w:uiPriority="39" w:unhideWhenUsed="1"/>
-    <w:lsdException w:name="toc 7" w:semiHidden="1" w:uiPriority="39" w:unhideWhenUsed="1"/>
-    <w:lsdException w:name="toc 8" w:semiHidden="1" w:uiPriority="39" w:unhideWhenUsed="1"/>
-    <w:lsdException w:name="toc 9" w:semiHidden="1" w:uiPriority="39" w:unhideWhenUsed="1"/>
-    <w:lsdException w:name="Normal Indent" w:semiHidden="1" w:unhideWhenUsed="1"/>
-    <w:lsdException w:name="footnote text" w:semiHidden="1" w:unhideWhenUsed="1"/>
-    <w:lsdException w:name="annotation text" w:semiHidden="1" w:unhideWhenUsed="1"/>
-    <w:lsdException w:name="header" w:semiHidden="1" w:unhideWhenUsed="1"/>
-    <w:lsdException w:name="footer" w:semiHidden="1" w:unhideWhenUsed="1"/>
-    <w:lsdException w:name="index heading" w:semiHidden="1" w:unhideWhenUsed="1"/>
-    <w:lsdException w:name="caption" w:semiHidden="1" w:uiPriority="35" w:unhideWhenUsed="1" w:qFormat="1"/>
-    <w:lsdException w:name="table of figures" w:semiHidden="1" w:unhideWhenUsed="1"/>
-    <w:lsdException w:name="envelope address" w:semiHidden="1" w:unhideWhenUsed="1"/>
-    <w:lsdException w:name="envelope return" w:semiHidden="1" w:unhideWhenUsed="1"/>
-    <w:lsdException w:name="footnote reference" w:semiHidden="1" w:unhideWhenUsed="1"/>
-    <w:lsdException w:name="annotation reference" w:semiHidden="1" w:unhideWhenUsed="1"/>
-    <w:lsdException w:name="line number" w:semiHidden="1" w:unhideWhenUsed="1"/>
-    <w:lsdException w:name="page number" w:semiHidden="1" w:unhideWhenUsed="1"/>
-    <w:lsdException w:name="endnote reference" w:semiHidden="1" w:unhideWhenUsed="1"/>
-    <w:lsdException w:name="endnote text" w:semiHidden="1" w:unhideWhenUsed="1"/>
-    <w:lsdException w:name="table of authorities" w:semiHidden="1" w:unhideWhenUsed="1"/>
-    <w:lsdException w:name="macro" w:semiHidden="1" w:unhideWhenUsed="1"/>
-    <w:lsdException w:name="toa heading" w:semiHidden="1" w:unhideWhenUsed="1"/>
-    <w:lsdException w:name="List" w:semiHidden="1" w:unhideWhenUsed="1"/>
-    <w:lsdException w:name="List Bullet" w:semiHidden="1" w:unhideWhenUsed="1"/>
-    <w:lsdException w:name="List Number" w:semiHidden="1" w:unhideWhenUsed="1"/>
-    <w:lsdException w:name="List 2" w:semiHidden="1" w:unhideWhenUsed="1"/>
-    <w:lsdException w:name="List 3" w:semiHidden="1" w:unhideWhenUsed="1"/>
-    <w:lsdException w:name="List 4" w:semiHidden="1" w:unhideWhenUsed="1"/>
-    <w:lsdException w:name="List 5" w:semiHidden="1" w:unhideWhenUsed="1"/>
-    <w:lsdException w:name="List Bullet 2" w:semiHidden="1" w:unhideWhenUsed="1"/>
-    <w:lsdException w:name="List Bullet 3" w:semiHidden="1" w:unhideWhenUsed="1"/>
-    <w:lsdException w:name="List Bullet 4" w:semiHidden="1" w:unhideWhenUsed="1"/>
-    <w:lsdException w:name="List Bullet 5" w:semiHidden="1" w:unhideWhenUsed="1"/>
-    <w:lsdException w:name="List Number 2" w:semiHidden="1" w:unhideWhenUsed="1"/>
-    <w:lsdException w:name="List Number 3" w:semiHidden="1" w:unhideWhenUsed="1"/>
-    <w:lsdException w:name="List Number 4" w:semiHidden="1" w:unhideWhenUsed="1"/>
-    <w:lsdException w:name="List Number 5" w:semiHidden="1" w:unhideWhenUsed="1"/>
-    <w:lsdException w:name="Title" w:uiPriority="10" w:qFormat="1"/>
-    <w:lsdException w:name="Closing" w:semiHidden="1" w:unhideWhenUsed="1"/>
-    <w:lsdException w:name="Signature" w:semiHidden="1" w:unhideWhenUsed="1"/>
-    <w:lsdException w:name="Default Paragraph Font" w:semiHidden="1" w:uiPriority="1" w:unhideWhenUsed="1"/>
-    <w:lsdException w:name="Body Text" w:semiHidden="1" w:unhideWhenUsed="1"/>
-    <w:lsdException w:name="Body Text Indent" w:semiHidden="1" w:unhideWhenUsed="1"/>
-    <w:lsdException w:name="List Continue" w:semiHidden="1" w:unhideWhenUsed="1"/>
-    <w:lsdException w:name="List Continue 2" w:semiHidden="1" w:unhideWhenUsed="1"/>
-    <w:lsdException w:name="List Continue 3" w:semiHidden="1" w:unhideWhenUsed="1"/>
-    <w:lsdException w:name="List Continue 4" w:semiHidden="1" w:unhideWhenUsed="1"/>
-    <w:lsdException w:name="List Continue 5" w:semiHidden="1" w:unhideWhenUsed="1"/>
-    <w:lsdException w:name="Message Header" w:semiHidden="1" w:unhideWhenUsed="1"/>
-    <w:lsdException w:name="Subtitle" w:uiPriority="11" w:qFormat="1"/>
-    <w:lsdException w:name="Salutation" w:semiHidden="1" w:unhideWhenUsed="1"/>
-    <w:lsdException w:name="Date" w:semiHidden="1" w:unhideWhenUsed="1"/>
-    <w:lsdException w:name="Body Text First Indent" w:semiHidden="1" w:unhideWhenUsed="1"/>
-    <w:lsdException w:name="Body Text First Indent 2" w:semiHidden="1" w:unhideWhenUsed="1"/>
-    <w:lsdException w:name="Note Heading" w:semiHidden="1" w:unhideWhenUsed="1"/>
-    <w:lsdException w:name="Body Text 2" w:semiHidden="1" w:unhideWhenUsed="1"/>
-    <w:lsdException w:name="Body Text 3" w:semiHidden="1" w:unhideWhenUsed="1"/>
-    <w:lsdException w:name="Body Text Indent 2" w:semiHidden="1" w:unhideWhenUsed="1"/>
-    <w:lsdException w:name="Body Text Indent 3" w:semiHidden="1" w:unhideWhenUsed="1"/>
-    <w:lsdException w:name="Block Text" w:semiHidden="1" w:unhideWhenUsed="1"/>
-    <w:lsdException w:name="Hyperlink" w:semiHidden="1" w:unhideWhenUsed="1"/>
-    <w:lsdException w:name="FollowedHyperlink" w:semiHidden="1" w:unhideWhenUsed="1"/>
-    <w:lsdException w:name="Strong" w:uiPriority="22" w:qFormat="1"/>
-    <w:lsdException w:name="Emphasis" w:uiPriority="20" w:qFormat="1"/>
-    <w:lsdException w:name="Document Map" w:semiHidden="1" w:unhideWhenUsed="1"/>
-    <w:lsdException w:name="Plain Text" w:semiHidden="1" w:unhideWhenUsed="1"/>
-    <w:lsdException w:name="E-mail Signature" w:semiHidden="1" w:unhideWhenUsed="1"/>
-    <w:lsdException w:name="HTML Top of Form" w:semiHidden="1" w:unhideWhenUsed="1"/>
-    <w:lsdException w:name="HTML Bottom of Form" w:semiHidden="1" w:unhideWhenUsed="1"/>
-    <w:lsdException w:name="Normal (Web)" w:semiHidden="1" w:unhideWhenUsed="1"/>
-    <w:lsdException w:name="HTML Acronym" w:semiHidden="1" w:unhideWhenUsed="1"/>
-    <w:lsdException w:name="HTML Address" w:semiHidden="1" w:unhideWhenUsed="1"/>
-    <w:lsdException w:name="HTML Cite" w:semiHidden="1" w:unhideWhenUsed="1"/>
-    <w:lsdException w:name="HTML Code" w:semiHidden="1" w:unhideWhenUsed="1"/>
-    <w:lsdException w:name="HTML Definition" w:semiHidden="1" w:unhideWhenUsed="1"/>
-    <w:lsdException w:name="HTML Keyboard" w:semiHidden="1" w:unhideWhenUsed="1"/>
-    <w:lsdException w:name="HTML Preformatted" w:semiHidden="1" w:unhideWhenUsed="1"/>
-    <w:lsdException w:name="HTML Sample" w:semiHidden="1" w:unhideWhenUsed="1"/>
-    <w:lsdException w:name="HTML Typewriter" w:semiHidden="1" w:unhideWhenUsed="1"/>
-    <w:lsdException w:name="HTML Variable" w:semiHidden="1" w:unhideWhenUsed="1"/>
-    <w:lsdException w:name="Normal Table" w:semiHidden="1" w:unhideWhenUsed="1"/>
-    <w:lsdException w:name="annotation subject" w:semiHidden="1" w:unhideWhenUsed="1"/>
-    <w:lsdException w:name="No List" w:semiHidden="1" w:unhideWhenUsed="1"/>
-    <w:lsdException w:name="Outline List 1" w:semiHidden="1" w:unhideWhenUsed="1"/>
-    <w:lsdException w:name="Outline List 2" w:semiHidden="1" w:unhideWhenUsed="1"/>
-    <w:lsdException w:name="Outline List 3" w:semiHidden="1" w:unhideWhenUsed="1"/>
-    <w:lsdException w:name="Table Simple 1" w:semiHidden="1" w:unhideWhenUsed="1"/>
-    <w:lsdException w:name="Table Simple 2" w:semiHidden="1" w:unhideWhenUsed="1"/>
-    <w:lsdException w:name="Table Simple 3" w:semiHidden="1" w:unhideWhenUsed="1"/>
-    <w:lsdException w:name="Table Classic 1" w:semiHidden="1" w:unhideWhenUsed="1"/>
-    <w:lsdException w:name="Table Classic 2" w:semiHidden="1" w:unhideWhenUsed="1"/>
-    <w:lsdException w:name="Table Classic 3" w:semiHidden="1" w:unhideWhenUsed="1"/>
-    <w:lsdException w:name="Table Classic 4" w:semiHidden="1" w:unhideWhenUsed="1"/>
-    <w:lsdException w:name="Table Colorful 1" w:semiHidden="1" w:unhideWhenUsed="1"/>
-    <w:lsdException w:name="Table Colorful 2" w:semiHidden="1" w:unhideWhenUsed="1"/>
-    <w:lsdException w:name="Table Colorful 3" w:semiHidden="1" w:unhideWhenUsed="1"/>
-    <w:lsdException w:name="Table Columns 1" w:semiHidden="1" w:unhideWhenUsed="1"/>
-    <w:lsdException w:name="Table Columns 2" w:semiHidden="1" w:unhideWhenUsed="1"/>
-    <w:lsdException w:name="Table Columns 3" w:semiHidden="1" w:unhideWhenUsed="1"/>
-    <w:lsdException w:name="Table Columns 4" w:semiHidden="1" w:unhideWhenUsed="1"/>
-    <w:lsdException w:name="Table Columns 5" w:semiHidden="1" w:unhideWhenUsed="1"/>
-    <w:lsdException w:name="Table Grid 1" w:semiHidden="1" w:unhideWhenUsed="1"/>
-    <w:lsdException w:name="Table Grid 2" w:semiHidden="1" w:unhideWhenUsed="1"/>
-    <w:lsdException w:name="Table Grid 3" w:semiHidden="1" w:unhideWhenUsed="1"/>
-    <w:lsdException w:name="Table Grid 4" w:semiHidden="1" w:unhideWhenUsed="1"/>
-    <w:lsdException w:name="Table Grid 5" w:semiHidden="1" w:unhideWhenUsed="1"/>
-    <w:lsdException w:name="Table Grid 6" w:semiHidden="1" w:unhideWhenUsed="1"/>
-    <w:lsdException w:name="Table Grid 7" w:semiHidden="1" w:unhideWhenUsed="1"/>
-    <w:lsdException w:name="Table Grid 8" w:semiHidden="1" w:unhideWhenUsed="1"/>
-    <w:lsdException w:name="Table List 1" w:semiHidden="1" w:unhideWhenUsed="1"/>
-    <w:lsdException w:name="Table List 2" w:semiHidden="1" w:unhideWhenUsed="1"/>
-    <w:lsdException w:name="Table List 3" w:semiHidden="1" w:unhideWhenUsed="1"/>
-    <w:lsdException w:name="Table List 4" w:semiHidden="1" w:unhideWhenUsed="1"/>
-    <w:lsdException w:name="Table List 5" w:semiHidden="1" w:unhideWhenUsed="1"/>
-    <w:lsdException w:name="Table List 6" w:semiHidden="1" w:unhideWhenUsed="1"/>
-    <w:lsdException w:name="Table List 7" w:semiHidden="1" w:unhideWhenUsed="1"/>
-    <w:lsdException w:name="Table List 8" w:semiHidden="1" w:unhideWhenUsed="1"/>
-    <w:lsdException w:name="Table 3D effects 1" w:semiHidden="1" w:unhideWhenUsed="1"/>
-    <w:lsdException w:name="Table 3D effects 2" w:semiHidden="1" w:unhideWhenUsed="1"/>
-    <w:lsdException w:name="Table 3D effects 3" w:semiHidden="1" w:unhideWhenUsed="1"/>
-    <w:lsdException w:name="Table Contemporary" w:semiHidden="1" w:unhideWhenUsed="1"/>
-    <w:lsdException w:name="Table Elegant" w:semiHidden="1" w:unhideWhenUsed="1"/>
-    <w:lsdException w:name="Table Professional" w:semiHidden="1" w:unhideWhenUsed="1"/>
-    <w:lsdException w:name="Table Subtle 1" w:semiHidden="1" w:unhideWhenUsed="1"/>
-    <w:lsdException w:name="Table Subtle 2" w:semiHidden="1" w:unhideWhenUsed="1"/>
-    <w:lsdException w:name="Table Web 1" w:semiHidden="1" w:unhideWhenUsed="1"/>
-    <w:lsdException w:name="Table Web 2" w:semiHidden="1" w:unhideWhenUsed="1"/>
-    <w:lsdException w:name="Table Web 3" w:semiHidden="1" w:unhideWhenUsed="1"/>
-    <w:lsdException w:name="Balloon Text" w:semiHidden="1" w:unhideWhenUsed="1"/>
-    <w:lsdException w:name="Table Grid" w:uiPriority="39"/>
-    <w:lsdException w:name="Table Theme" w:semiHidden="1" w:unhideWhenUsed="1"/>
-    <w:lsdException w:name="Placeholder Text" w:semiHidden="1"/>
-    <w:lsdException w:name="No Spacing" w:uiPriority="1" w:qFormat="1"/>
-    <w:lsdException w:name="Light Shading" w:uiPriority="60"/>
-    <w:lsdException w:name="Light List" w:uiPriority="61"/>
-    <w:lsdException w:name="Light Grid" w:uiPriority="62"/>
-    <w:lsdException w:name="Medium Shading 1" w:uiPriority="63"/>
-    <w:lsdException w:name="Medium Shading 2" w:uiPriority="64"/>
-    <w:lsdException w:name="Medium List 1" w:uiPriority="65"/>
-    <w:lsdException w:name="Medium List 2" w:uiPriority="66"/>
-    <w:lsdException w:name="Medium Grid 1" w:uiPriority="67"/>
-    <w:lsdException w:name="Medium Grid 2" w:uiPriority="68"/>
-    <w:lsdException w:name="Medium Grid 3" w:uiPriority="69"/>
-    <w:lsdException w:name="Dark List" w:uiPriority="70"/>
-    <w:lsdException w:name="Colorful Shading" w:uiPriority="71"/>
-    <w:lsdException w:name="Colorful List" w:uiPriority="72"/>
-    <w:lsdException w:name="Colorful Grid" w:uiPriority="73"/>
-    <w:lsdException w:name="Light Shading Accent 1" w:uiPriority="60"/>
-    <w:lsdException w:name="Light List Accent 1" w:uiPriority="61"/>
-    <w:lsdException w:name="Light Grid Accent 1" w:uiPriority="62"/>
-    <w:lsdException w:name="Medium Shading 1 Accent 1" w:uiPriority="63"/>
-    <w:lsdException w:name="Medium Shading 2 Accent 1" w:uiPriority="64"/>
-    <w:lsdException w:name="Medium List 1 Accent 1" w:uiPriority="65"/>
-    <w:lsdException w:name="Revision" w:semiHidden="1"/>
-    <w:lsdException w:name="List Paragraph" w:uiPriority="34" w:qFormat="1"/>
-    <w:lsdException w:name="Quote" w:uiPriority="29" w:qFormat="1"/>
-    <w:lsdException w:name="Intense Quote" w:uiPriority="30" w:qFormat="1"/>
-    <w:lsdException w:name="Medium List 2 Accent 1" w:uiPriority="66"/>
-    <w:lsdException w:name="Medium Grid 1 Accent 1" w:uiPriority="67"/>
-    <w:lsdException w:name="Medium Grid 2 Accent 1" w:uiPriority="68"/>
-    <w:lsdException w:name="Medium Grid 3 Accent 1" w:uiPriority="69"/>
-    <w:lsdException w:name="Dark List Accent 1" w:uiPriority="70"/>
-    <w:lsdException w:name="Colorful Shading Accent 1" w:uiPriority="71"/>
-    <w:lsdException w:name="Colorful List Accent 1" w:uiPriority="72"/>
-    <w:lsdException w:name="Colorful Grid Accent 1" w:uiPriority="73"/>
-    <w:lsdException w:name="Light Shading Accent 2" w:uiPriority="60"/>
-    <w:lsdException w:name="Light List Accent 2" w:uiPriority="61"/>
-    <w:lsdException w:name="Light Grid Accent 2" w:uiPriority="62"/>
-    <w:lsdException w:name="Medium Shading 1 Accent 2" w:uiPriority="63"/>
-    <w:lsdException w:name="Medium Shading 2 Accent 2" w:uiPriority="64"/>
-    <w:lsdException w:name="Medium List 1 Accent 2" w:uiPriority="65"/>
-    <w:lsdException w:name="Medium List 2 Accent 2" w:uiPriority="66"/>
-    <w:lsdException w:name="Medium Grid 1 Accent 2" w:uiPriority="67"/>
-    <w:lsdException w:name="Medium Grid 2 Accent 2" w:uiPriority="68"/>
-    <w:lsdException w:name="Medium Grid 3 Accent 2" w:uiPriority="69"/>
-    <w:lsdException w:name="Dark List Accent 2" w:uiPriority="70"/>
-    <w:lsdException w:name="Colorful Shading Accent 2" w:uiPriority="71"/>
-    <w:lsdException w:name="Colorful List Accent 2" w:uiPriority="72"/>
-    <w:lsdException w:name="Colorful Grid Accent 2" w:uiPriority="73"/>
-    <w:lsdException w:name="Light Shading Accent 3" w:uiPriority="60"/>
-    <w:lsdException w:name="Light List Accent 3" w:uiPriority="61"/>
-    <w:lsdException w:name="Light Grid Accent 3" w:uiPriority="62"/>
-    <w:lsdException w:name="Medium Shading 1 Accent 3" w:uiPriority="63"/>
-    <w:lsdException w:name="Medium Shading 2 Accent 3" w:uiPriority="64"/>
-    <w:lsdException w:name="Medium List 1 Accent 3" w:uiPriority="65"/>
-    <w:lsdException w:name="Medium List 2 Accent 3" w:uiPriority="66"/>
-    <w:lsdException w:name="Medium Grid 1 Accent 3" w:uiPriority="67"/>
-    <w:lsdException w:name="Medium Grid 2 Accent 3" w:uiPriority="68"/>
-    <w:lsdException w:name="Medium Grid 3 Accent 3" w:uiPriority="69"/>
-    <w:lsdException w:name="Dark List Accent 3" w:uiPriority="70"/>
-    <w:lsdException w:name="Colorful Shading Accent 3" w:uiPriority="71"/>
-    <w:lsdException w:name="Colorful List Accent 3" w:uiPriority="72"/>
-    <w:lsdException w:name="Colorful Grid Accent 3" w:uiPriority="73"/>
-    <w:lsdException w:name="Light Shading Accent 4" w:uiPriority="60"/>
-    <w:lsdException w:name="Light List Accent 4" w:uiPriority="61"/>
-    <w:lsdException w:name="Light Grid Accent 4" w:uiPriority="62"/>
-    <w:lsdException w:name="Medium Shading 1 Accent 4" w:uiPriority="63"/>
-    <w:lsdException w:name="Medium Shading 2 Accent 4" w:uiPriority="64"/>
-    <w:lsdException w:name="Medium List 1 Accent 4" w:uiPriority="65"/>
-    <w:lsdException w:name="Medium List 2 Accent 4" w:uiPriority="66"/>
-    <w:lsdException w:name="Medium Grid 1 Accent 4" w:uiPriority="67"/>
-    <w:lsdException w:name="Medium Grid 2 Accent 4" w:uiPriority="68"/>
-    <w:lsdException w:name="Medium Grid 3 Accent 4" w:uiPriority="69"/>
-    <w:lsdException w:name="Dark List Accent 4" w:uiPriority="70"/>
-    <w:lsdException w:name="Colorful Shading Accent 4" w:uiPriority="71"/>
-    <w:lsdException w:name="Colorful List Accent 4" w:uiPriority="72"/>
-    <w:lsdException w:name="Colorful Grid Accent 4" w:uiPriority="73"/>
-    <w:lsdException w:name="Light Shading Accent 5" w:uiPriority="60"/>
-    <w:lsdException w:name="Light List Accent 5" w:uiPriority="61"/>
-    <w:lsdException w:name="Light Grid Accent 5" w:uiPriority="62"/>
-    <w:lsdException w:name="Medium Shading 1 Accent 5" w:uiPriority="63"/>
-    <w:lsdException w:name="Medium Shading 2 Accent 5" w:uiPriority="64"/>
-    <w:lsdException w:name="Medium List 1 Accent 5" w:uiPriority="65"/>
-    <w:lsdException w:name="Medium List 2 Accent 5" w:uiPriority="66"/>
-    <w:lsdException w:name="Medium Grid 1 Accent 5" w:uiPriority="67"/>
-    <w:lsdException w:name="Medium Grid 2 Accent 5" w:uiPriority="68"/>
-    <w:lsdException w:name="Medium Grid 3 Accent 5" w:uiPriority="69"/>
-    <w:lsdException w:name="Dark List Accent 5" w:uiPriority="70"/>
-    <w:lsdException w:name="Colorful Shading Accent 5" w:uiPriority="71"/>
-    <w:lsdException w:name="Colorful List Accent 5" w:uiPriority="72"/>
-    <w:lsdException w:name="Colorful Grid Accent 5" w:uiPriority="73"/>
-    <w:lsdException w:name="Light Shading Accent 6" w:uiPriority="60"/>
-    <w:lsdException w:name="Light List Accent 6" w:uiPriority="61"/>
-    <w:lsdException w:name="Light Grid Accent 6" w:uiPriority="62"/>
-    <w:lsdException w:name="Medium Shading 1 Accent 6" w:uiPriority="63"/>
-    <w:lsdException w:name="Medium Shading 2 Accent 6" w:uiPriority="64"/>
-    <w:lsdException w:name="Medium List 1 Accent 6" w:uiPriority="65"/>
-    <w:lsdException w:name="Medium List 2 Accent 6" w:uiPriority="66"/>
-    <w:lsdException w:name="Medium Grid 1 Accent 6" w:uiPriority="67"/>
-    <w:lsdException w:name="Medium Grid 2 Accent 6" w:uiPriority="68"/>
-    <w:lsdException w:name="Medium Grid 3 Accent 6" w:uiPriority="69"/>
-    <w:lsdException w:name="Dark List Accent 6" w:uiPriority="70"/>
-    <w:lsdException w:name="Colorful Shading Accent 6" w:uiPriority="71"/>
-    <w:lsdException w:name="Colorful List Accent 6" w:uiPriority="72"/>
-    <w:lsdException w:name="Colorful Grid Accent 6" w:uiPriority="73"/>
-    <w:lsdException w:name="Subtle Emphasis" w:uiPriority="19" w:qFormat="1"/>
-    <w:lsdException w:name="Intense Emphasis" w:uiPriority="21" w:qFormat="1"/>
-    <w:lsdException w:name="Subtle Reference" w:uiPriority="31" w:qFormat="1"/>
-    <w:lsdException w:name="Intense Reference" w:uiPriority="32" w:qFormat="1"/>
-    <w:lsdException w:name="Book Title" w:uiPriority="33" w:qFormat="1"/>
-    <w:lsdException w:name="Bibliography" w:semiHidden="1" w:uiPriority="37" w:unhideWhenUsed="1"/>
-    <w:lsdException w:name="TOC Heading" w:semiHidden="1" w:uiPriority="39" w:unhideWhenUsed="1" w:qFormat="1"/>
-    <w:lsdException w:name="Plain Table 1" w:uiPriority="41"/>
-    <w:lsdException w:name="Plain Table 2" w:uiPriority="42"/>
-    <w:lsdException w:name="Plain Table 3" w:uiPriority="43"/>
-    <w:lsdException w:name="Plain Table 4" w:uiPriority="44"/>
-    <w:lsdException w:name="Plain Table 5" w:uiPriority="45"/>
-    <w:lsdException w:name="Grid Table Light" w:uiPriority="40"/>
-    <w:lsdException w:name="Grid Table 1 Light" w:uiPriority="46"/>
-    <w:lsdException w:name="Grid Table 2" w:uiPriority="47"/>
-    <w:lsdException w:name="Grid Table 3" w:uiPriority="48"/>
-    <w:lsdException w:name="Grid Table 4" w:uiPriority="49"/>
-    <w:lsdException w:name="Grid Table 5 Dark" w:uiPriority="50"/>
-    <w:lsdException w:name="Grid Table 6 Colorful" w:uiPriority="51"/>
-    <w:lsdException w:name="Grid Table 7 Colorful" w:uiPriority="52"/>
-    <w:lsdException w:name="Grid Table 1 Light Accent 1" w:uiPriority="46"/>
-    <w:lsdException w:name="Grid Table 2 Accent 1" w:uiPriority="47"/>
-    <w:lsdException w:name="Grid Table 3 Accent 1" w:uiPriority="48"/>
-    <w:lsdException w:name="Grid Table 4 Accent 1" w:uiPriority="49"/>
-    <w:lsdException w:name="Grid Table 5 Dark Accent 1" w:uiPriority="50"/>
-    <w:lsdException w:name="Grid Table 6 Colorful Accent 1" w:uiPriority="51"/>
-    <w:lsdException w:name="Grid Table 7 Colorful Accent 1" w:uiPriority="52"/>
-    <w:lsdException w:name="Grid Table 1 Light Accent 2" w:uiPriority="46"/>
-    <w:lsdException w:name="Grid Table 2 Accent 2" w:uiPriority="47"/>
-    <w:lsdException w:name="Grid Table 3 Accent 2" w:uiPriority="48"/>
-    <w:lsdException w:name="Grid Table 4 Accent 2" w:uiPriority="49"/>
-    <w:lsdException w:name="Grid Table 5 Dark Accent 2" w:uiPriority="50"/>
-    <w:lsdException w:name="Grid Table 6 Colorful Accent 2" w:uiPriority="51"/>
-    <w:lsdException w:name="Grid Table 7 Colorful Accent 2" w:uiPriority="52"/>
-    <w:lsdException w:name="Grid Table 1 Light Accent 3" w:uiPriority="46"/>
-    <w:lsdException w:name="Grid Table 2 Accent 3" w:uiPriority="47"/>
-    <w:lsdException w:name="Grid Table 3 Accent 3" w:uiPriority="48"/>
-    <w:lsdException w:name="Grid Table 4 Accent 3" w:uiPriority="49"/>
-    <w:lsdException w:name="Grid Table 5 Dark Accent 3" w:uiPriority="50"/>
-    <w:lsdException w:name="Grid Table 6 Colorful Accent 3" w:uiPriority="51"/>
-    <w:lsdException w:name="Grid Table 7 Colorful Accent 3" w:uiPriority="52"/>
-    <w:lsdException w:name="Grid Table 1 Light Accent 4" w:uiPriority="46"/>
-    <w:lsdException w:name="Grid Table 2 Accent 4" w:uiPriority="47"/>
-    <w:lsdException w:name="Grid Table 3 Accent 4" w:uiPriority="48"/>
-    <w:lsdException w:name="Grid Table 4 Accent 4" w:uiPriority="49"/>
-    <w:lsdException w:name="Grid Table 5 Dark Accent 4" w:uiPriority="50"/>
-    <w:lsdException w:name="Grid Table 6 Colorful Accent 4" w:uiPriority="51"/>
-    <w:lsdException w:name="Grid Table 7 Colorful Accent 4" w:uiPriority="52"/>
-    <w:lsdException w:name="Grid Table 1 Light Accent 5" w:uiPriority="46"/>
-    <w:lsdException w:name="Grid Table 2 Accent 5" w:uiPriority="47"/>
-    <w:lsdException w:name="Grid Table 3 Accent 5" w:uiPriority="48"/>
-    <w:lsdException w:name="Grid Table 4 Accent 5" w:uiPriority="49"/>
-    <w:lsdException w:name="Grid Table 5 Dark Accent 5" w:uiPriority="50"/>
-    <w:lsdException w:name="Grid Table 6 Colorful Accent 5" w:uiPriority="51"/>
-    <w:lsdException w:name="Grid Table 7 Colorful Accent 5" w:uiPriority="52"/>
-    <w:lsdException w:name="Grid Table 1 Light Accent 6" w:uiPriority="46"/>
-    <w:lsdException w:name="Grid Table 2 Accent 6" w:uiPriority="47"/>
-    <w:lsdException w:name="Grid Table 3 Accent 6" w:uiPriority="48"/>
-    <w:lsdException w:name="Grid Table 4 Accent 6" w:uiPriority="49"/>
-    <w:lsdException w:name="Grid Table 5 Dark Accent 6" w:uiPriority="50"/>
-    <w:lsdException w:name="Grid Table 6 Colorful Accent 6" w:uiPriority="51"/>
-    <w:lsdException w:name="Grid Table 7 Colorful Accent 6" w:uiPriority="52"/>
-    <w:lsdException w:name="List Table 1 Light" w:uiPriority="46"/>
-    <w:lsdException w:name="List Table 2" w:uiPriority="47"/>
-    <w:lsdException w:name="List Table 3" w:uiPriority="48"/>
-    <w:lsdException w:name="List Table 4" w:uiPriority="49"/>
-    <w:lsdException w:name="List Table 5 Dark" w:uiPriority="50"/>
-    <w:lsdException w:name="List Table 6 Colorful" w:uiPriority="51"/>
-    <w:lsdException w:name="List Table 7 Colorful" w:uiPriority="52"/>
-    <w:lsdException w:name="List Table 1 Light Accent 1" w:uiPriority="46"/>
-    <w:lsdException w:name="List Table 2 Accent 1" w:uiPriority="47"/>
-    <w:lsdException w:name="List Table 3 Accent 1" w:uiPriority="48"/>
-    <w:lsdException w:name="List Table 4 Accent 1" w:uiPriority="49"/>
-    <w:lsdException w:name="List Table 5 Dark Accent 1" w:uiPriority="50"/>
-    <w:lsdException w:name="List Table 6 Colorful Accent 1" w:uiPriority="51"/>
-    <w:lsdException w:name="List Table 7 Colorful Accent 1" w:uiPriority="52"/>
-    <w:lsdException w:name="List Table 1 Light Accent 2" w:uiPriority="46"/>
-    <w:lsdException w:name="List Table 2 Accent 2" w:uiPriority="47"/>
-    <w:lsdException w:name="List Table 3 Accent 2" w:uiPriority="48"/>
-    <w:lsdException w:name="List Table 4 Accent 2" w:uiPriority="49"/>
-    <w:lsdException w:name="List Table 5 Dark Accent 2" w:uiPriority="50"/>
-    <w:lsdException w:name="List Table 6 Colorful Accent 2" w:uiPriority="51"/>
-    <w:lsdException w:name="List Table 7 Colorful Accent 2" w:uiPriority="52"/>
-    <w:lsdException w:name="List Table 1 Light Accent 3" w:uiPriority="46"/>
-    <w:lsdException w:name="List Table 2 Accent 3" w:uiPriority="47"/>
-    <w:lsdException w:name="List Table 3 Accent 3" w:uiPriority="48"/>
-    <w:lsdException w:name="List Table 4 Accent 3" w:uiPriority="49"/>
-    <w:lsdException w:name="List Table 5 Dark Accent 3" w:uiPriority="50"/>
-    <w:lsdException w:name="List Table 6 Colorful Accent 3" w:uiPriority="51"/>
-    <w:lsdException w:name="List Table 7 Colorful Accent 3" w:uiPriority="52"/>
-    <w:lsdException w:name="List Table 1 Light Accent 4" w:uiPriority="46"/>
-    <w:lsdException w:name="List Table 2 Accent 4" w:uiPriority="47"/>
-    <w:lsdException w:name="List Table 3 Accent 4" w:uiPriority="48"/>
-    <w:lsdException w:name="List Table 4 Accent 4" w:uiPriority="49"/>
-    <w:lsdException w:name="List Table 5 Dark Accent 4" w:uiPriority="50"/>
-    <w:lsdException w:name="List Table 6 Colorful Accent 4" w:uiPriority="51"/>
-    <w:lsdException w:name="List Table 7 Colorful Accent 4" w:uiPriority="52"/>
-    <w:lsdException w:name="List Table 1 Light Accent 5" w:uiPriority="46"/>
-    <w:lsdException w:name="List Table 2 Accent 5" w:uiPriority="47"/>
-    <w:lsdException w:name="List Table 3 Accent 5" w:uiPriority="48"/>
-    <w:lsdException w:name="List Table 4 Accent 5" w:uiPriority="49"/>
-    <w:lsdException w:name="List Table 5 Dark Accent 5" w:uiPriority="50"/>
-    <w:lsdException w:name="List Table 6 Colorful Accent 5" w:uiPriority="51"/>
-    <w:lsdException w:name="List Table 7 Colorful Accent 5" w:uiPriority="52"/>
-    <w:lsdException w:name="List Table 1 Light Accent 6" w:uiPriority="46"/>
-    <w:lsdException w:name="List Table 2 Accent 6" w:uiPriority="47"/>
-    <w:lsdException w:name="List Table 3 Accent 6" w:uiPriority="48"/>
-    <w:lsdException w:name="List Table 4 Accent 6" w:uiPriority="49"/>
-    <w:lsdException w:name="List Table 5 Dark Accent 6" w:uiPriority="50"/>
-    <w:lsdException w:name="List Table 6 Colorful Accent 6" w:uiPriority="51"/>
-    <w:lsdException w:name="List Table 7 Colorful Accent 6" w:uiPriority="52"/>
-  </w:latentStyles>
-  <w:style w:type="paragraph" w:default="1" w:styleId="Normal">
-    <w:name w:val="Normal"/>
-    <w:qFormat/>
-  </w:style>
-  <w:style w:type="character" w:default="1" w:styleId="Fuentedeprrafopredeter">
-    <w:name w:val="Default Paragraph Font"/>
-    <w:uiPriority w:val="1"/>
-    <w:semiHidden/>
-    <w:unhideWhenUsed/>
-  </w:style>
-  <w:style w:type="table" w:default="1" w:styleId="Tablanormal">
-    <w:name w:val="Normal Table"/>
-    <w:uiPriority w:val="99"/>
-    <w:semiHidden/>
-    <w:unhideWhenUsed/>
-    <w:tblPr>
-      <w:tblInd w:w="0" w:type="dxa"/>
-      <w:tblCellMar>
-        <w:top w:w="0" w:type="dxa"/>
-        <w:left w:w="108" w:type="dxa"/>
-        <w:bottom w:w="0" w:type="dxa"/>
-        <w:right w:w="108" w:type="dxa"/>
-      </w:tblCellMar>
-    </w:tblPr>
-  </w:style>
-  <w:style w:type="numbering" w:default="1" w:styleId="Sinlista">
-    <w:name w:val="No List"/>
-    <w:uiPriority w:val="99"/>
-    <w:semiHidden/>
-    <w:unhideWhenUsed/>
-  </w:style>
-  <w:style w:type="character" w:styleId="Textodelmarcadordeposicin">
-    <w:name w:val="Placeholder Text"/>
-    <w:basedOn w:val="Fuentedeprrafopredeter"/>
-    <w:uiPriority w:val="99"/>
-    <w:semiHidden/>
-    <w:rsid w:val="00EB55B8"/>
-    <w:rPr>
-      <w:color w:val="808080"/>
-    </w:rPr>
-  </w:style>
-</w:styles>
-</file>
-
-<file path=word/glossary/webSettings.xml><?xml version="1.0" encoding="utf-8"?>
-<w:webSettings xmlns:mc="http://schemas.openxmlformats.org/markup-compatibility/2006" xmlns:r="http://schemas.openxmlformats.org/officeDocument/2006/relationships" xmlns:w="http://schemas.openxmlformats.org/wordprocessingml/2006/main" xmlns:w14="http://schemas.microsoft.com/office/word/2010/wordml" xmlns:w15="http://schemas.microsoft.com/office/word/2012/wordml" xmlns:w16se="http://schemas.microsoft.com/office/word/2015/wordml/symex" mc:Ignorable="w14 w15 w16se">
-  <w:optimizeForBrowser/>
-  <w:allowPNG/>
-</w:webSettings>
-</file>
-
 <file path=word/theme/theme1.xml><?xml version="1.0" encoding="utf-8"?>
 <a:theme xmlns:a="http://schemas.openxmlformats.org/drawingml/2006/main" name="Tema de Office">
   <a:themeElements>
@@ -4919,7 +4378,7 @@
 </file>
 
 <file path=customXml/itemProps1.xml><?xml version="1.0" encoding="utf-8"?>
-<ds:datastoreItem xmlns:ds="http://schemas.openxmlformats.org/officeDocument/2006/customXml" ds:itemID="{621E8E16-45D9-436B-86C6-BE3938164C19}">
+<ds:datastoreItem xmlns:ds="http://schemas.openxmlformats.org/officeDocument/2006/customXml" ds:itemID="{45CBB6E7-6516-4D2D-ADC4-2C25AC0624F4}">
   <ds:schemaRefs>
     <ds:schemaRef ds:uri="http://schemas.openxmlformats.org/officeDocument/2006/bibliography"/>
   </ds:schemaRefs>

</xml_diff>